<commit_message>
Segurança: resumo para a liderança e tabelas do Word ajustadas
- docs/seguranca-resumo.md: segurança sem termos técnicos (barreiras,
  perfis, registro das ações, LGPD, e se acontecer, implantado e
  próximos passos), também em Word como 02
- Word: largura das colunas proporcional ao conteúdo e linhas de tabela
  sem quebra entre páginas; documentos renumerados
- Índice, README e seguranca.md apontam para o resumo
</commit_message>
<xml_diff>
--- a/docs/word/01 - Visão geral (não técnica).docx
+++ b/docs/word/01 - Visão geral (não técnica).docx
@@ -92,7 +92,7 @@
           <w:sz w:val="22"/>
           <w:szCs w:val="22"/>
         </w:rPr>
-        <w:t xml:space="preserve">Atualizado em 16 de outubro de 2026</w:t>
+        <w:t xml:space="preserve">Atualizado em 17 de outubro de 2026</w:t>
       </w:r>
     </w:p>
     <w:p>
@@ -745,7 +745,7 @@
     </w:p>
     <w:tbl>
       <w:tblPr>
-        <w:tblW w:type="pct" w:w="5000"/>
+        <w:tblW w:type="dxa" w:w="9638"/>
         <w:tblBorders>
           <w:top w:val="single" w:color="D9D6EA" w:sz="4"/>
           <w:left w:val="single" w:color="D9D6EA" w:sz="4"/>
@@ -754,11 +754,11 @@
           <w:insideH w:val="single" w:color="D9D6EA" w:sz="4"/>
           <w:insideV w:val="single" w:color="D9D6EA" w:sz="4"/>
         </w:tblBorders>
-        <w:tblLayout w:type="autofit"/>
+        <w:tblLayout w:type="fixed"/>
       </w:tblPr>
       <w:tblGrid>
-        <w:gridCol w:w="4819"/>
-        <w:gridCol w:w="4819"/>
+        <w:gridCol w:w="3765"/>
+        <w:gridCol w:w="5873"/>
       </w:tblGrid>
       <w:tr>
         <w:trPr>
@@ -766,6 +766,7 @@
         </w:trPr>
         <w:tc>
           <w:tcPr>
+            <w:tcW w:type="dxa" w:w="3765"/>
             <w:shd w:fill="1C1FC8" w:color="auto" w:val="clear"/>
             <w:tcMar>
               <w:top w:type="dxa" w:w="60"/>
@@ -790,6 +791,7 @@
         </w:tc>
         <w:tc>
           <w:tcPr>
+            <w:tcW w:type="dxa" w:w="5873"/>
             <w:shd w:fill="1C1FC8" w:color="auto" w:val="clear"/>
             <w:tcMar>
               <w:top w:type="dxa" w:w="60"/>
@@ -814,8 +816,12 @@
         </w:tc>
       </w:tr>
       <w:tr>
-        <w:tc>
-          <w:tcPr>
+        <w:trPr>
+          <w:cantSplit/>
+        </w:trPr>
+        <w:tc>
+          <w:tcPr>
+            <w:tcW w:type="dxa" w:w="3765"/>
             <w:tcMar>
               <w:top w:type="dxa" w:w="60"/>
               <w:left w:type="dxa" w:w="100"/>
@@ -834,6 +840,7 @@
         </w:tc>
         <w:tc>
           <w:tcPr>
+            <w:tcW w:type="dxa" w:w="5873"/>
             <w:tcMar>
               <w:top w:type="dxa" w:w="60"/>
               <w:left w:type="dxa" w:w="100"/>
@@ -856,8 +863,12 @@
         </w:tc>
       </w:tr>
       <w:tr>
-        <w:tc>
-          <w:tcPr>
+        <w:trPr>
+          <w:cantSplit/>
+        </w:trPr>
+        <w:tc>
+          <w:tcPr>
+            <w:tcW w:type="dxa" w:w="3765"/>
             <w:shd w:fill="F6F4FE" w:color="auto" w:val="clear"/>
             <w:tcMar>
               <w:top w:type="dxa" w:w="60"/>
@@ -877,6 +888,7 @@
         </w:tc>
         <w:tc>
           <w:tcPr>
+            <w:tcW w:type="dxa" w:w="5873"/>
             <w:shd w:fill="F6F4FE" w:color="auto" w:val="clear"/>
             <w:tcMar>
               <w:top w:type="dxa" w:w="60"/>
@@ -900,8 +912,12 @@
         </w:tc>
       </w:tr>
       <w:tr>
-        <w:tc>
-          <w:tcPr>
+        <w:trPr>
+          <w:cantSplit/>
+        </w:trPr>
+        <w:tc>
+          <w:tcPr>
+            <w:tcW w:type="dxa" w:w="3765"/>
             <w:tcMar>
               <w:top w:type="dxa" w:w="60"/>
               <w:left w:type="dxa" w:w="100"/>
@@ -920,6 +936,7 @@
         </w:tc>
         <w:tc>
           <w:tcPr>
+            <w:tcW w:type="dxa" w:w="5873"/>
             <w:tcMar>
               <w:top w:type="dxa" w:w="60"/>
               <w:left w:type="dxa" w:w="100"/>
@@ -1038,7 +1055,7 @@
     </w:p>
     <w:tbl>
       <w:tblPr>
-        <w:tblW w:type="pct" w:w="5000"/>
+        <w:tblW w:type="dxa" w:w="9638"/>
         <w:tblBorders>
           <w:top w:val="single" w:color="D9D6EA" w:sz="4"/>
           <w:left w:val="single" w:color="D9D6EA" w:sz="4"/>
@@ -1047,12 +1064,12 @@
           <w:insideH w:val="single" w:color="D9D6EA" w:sz="4"/>
           <w:insideV w:val="single" w:color="D9D6EA" w:sz="4"/>
         </w:tblBorders>
-        <w:tblLayout w:type="autofit"/>
+        <w:tblLayout w:type="fixed"/>
       </w:tblPr>
       <w:tblGrid>
-        <w:gridCol w:w="3213"/>
-        <w:gridCol w:w="3213"/>
-        <w:gridCol w:w="3213"/>
+        <w:gridCol w:w="1714"/>
+        <w:gridCol w:w="5708"/>
+        <w:gridCol w:w="2216"/>
       </w:tblGrid>
       <w:tr>
         <w:trPr>
@@ -1060,6 +1077,7 @@
         </w:trPr>
         <w:tc>
           <w:tcPr>
+            <w:tcW w:type="dxa" w:w="1714"/>
             <w:shd w:fill="1C1FC8" w:color="auto" w:val="clear"/>
             <w:tcMar>
               <w:top w:type="dxa" w:w="60"/>
@@ -1084,6 +1102,7 @@
         </w:tc>
         <w:tc>
           <w:tcPr>
+            <w:tcW w:type="dxa" w:w="5708"/>
             <w:shd w:fill="1C1FC8" w:color="auto" w:val="clear"/>
             <w:tcMar>
               <w:top w:type="dxa" w:w="60"/>
@@ -1108,6 +1127,7 @@
         </w:tc>
         <w:tc>
           <w:tcPr>
+            <w:tcW w:type="dxa" w:w="2216"/>
             <w:shd w:fill="1C1FC8" w:color="auto" w:val="clear"/>
             <w:tcMar>
               <w:top w:type="dxa" w:w="60"/>
@@ -1132,8 +1152,12 @@
         </w:tc>
       </w:tr>
       <w:tr>
-        <w:tc>
-          <w:tcPr>
+        <w:trPr>
+          <w:cantSplit/>
+        </w:trPr>
+        <w:tc>
+          <w:tcPr>
+            <w:tcW w:type="dxa" w:w="1714"/>
             <w:tcMar>
               <w:top w:type="dxa" w:w="60"/>
               <w:left w:type="dxa" w:w="100"/>
@@ -1156,6 +1180,7 @@
         </w:tc>
         <w:tc>
           <w:tcPr>
+            <w:tcW w:type="dxa" w:w="5708"/>
             <w:tcMar>
               <w:top w:type="dxa" w:w="60"/>
               <w:left w:type="dxa" w:w="100"/>
@@ -1184,6 +1209,7 @@
         </w:tc>
         <w:tc>
           <w:tcPr>
+            <w:tcW w:type="dxa" w:w="2216"/>
             <w:tcMar>
               <w:top w:type="dxa" w:w="60"/>
               <w:left w:type="dxa" w:w="100"/>
@@ -1202,8 +1228,12 @@
         </w:tc>
       </w:tr>
       <w:tr>
-        <w:tc>
-          <w:tcPr>
+        <w:trPr>
+          <w:cantSplit/>
+        </w:trPr>
+        <w:tc>
+          <w:tcPr>
+            <w:tcW w:type="dxa" w:w="1714"/>
             <w:shd w:fill="F6F4FE" w:color="auto" w:val="clear"/>
             <w:tcMar>
               <w:top w:type="dxa" w:w="60"/>
@@ -1227,6 +1257,7 @@
         </w:tc>
         <w:tc>
           <w:tcPr>
+            <w:tcW w:type="dxa" w:w="5708"/>
             <w:shd w:fill="F6F4FE" w:color="auto" w:val="clear"/>
             <w:tcMar>
               <w:top w:type="dxa" w:w="60"/>
@@ -1246,6 +1277,7 @@
         </w:tc>
         <w:tc>
           <w:tcPr>
+            <w:tcW w:type="dxa" w:w="2216"/>
             <w:shd w:fill="F6F4FE" w:color="auto" w:val="clear"/>
             <w:tcMar>
               <w:top w:type="dxa" w:w="60"/>
@@ -1265,8 +1297,12 @@
         </w:tc>
       </w:tr>
       <w:tr>
-        <w:tc>
-          <w:tcPr>
+        <w:trPr>
+          <w:cantSplit/>
+        </w:trPr>
+        <w:tc>
+          <w:tcPr>
+            <w:tcW w:type="dxa" w:w="1714"/>
             <w:tcMar>
               <w:top w:type="dxa" w:w="60"/>
               <w:left w:type="dxa" w:w="100"/>
@@ -1289,6 +1325,7 @@
         </w:tc>
         <w:tc>
           <w:tcPr>
+            <w:tcW w:type="dxa" w:w="5708"/>
             <w:tcMar>
               <w:top w:type="dxa" w:w="60"/>
               <w:left w:type="dxa" w:w="100"/>
@@ -1307,6 +1344,7 @@
         </w:tc>
         <w:tc>
           <w:tcPr>
+            <w:tcW w:type="dxa" w:w="2216"/>
             <w:tcMar>
               <w:top w:type="dxa" w:w="60"/>
               <w:left w:type="dxa" w:w="100"/>
@@ -1325,8 +1363,12 @@
         </w:tc>
       </w:tr>
       <w:tr>
-        <w:tc>
-          <w:tcPr>
+        <w:trPr>
+          <w:cantSplit/>
+        </w:trPr>
+        <w:tc>
+          <w:tcPr>
+            <w:tcW w:type="dxa" w:w="1714"/>
             <w:shd w:fill="F6F4FE" w:color="auto" w:val="clear"/>
             <w:tcMar>
               <w:top w:type="dxa" w:w="60"/>
@@ -1350,6 +1392,7 @@
         </w:tc>
         <w:tc>
           <w:tcPr>
+            <w:tcW w:type="dxa" w:w="5708"/>
             <w:shd w:fill="F6F4FE" w:color="auto" w:val="clear"/>
             <w:tcMar>
               <w:top w:type="dxa" w:w="60"/>
@@ -1369,6 +1412,7 @@
         </w:tc>
         <w:tc>
           <w:tcPr>
+            <w:tcW w:type="dxa" w:w="2216"/>
             <w:shd w:fill="F6F4FE" w:color="auto" w:val="clear"/>
             <w:tcMar>
               <w:top w:type="dxa" w:w="60"/>
@@ -1405,7 +1449,7 @@
     </w:p>
     <w:tbl>
       <w:tblPr>
-        <w:tblW w:type="pct" w:w="5000"/>
+        <w:tblW w:type="dxa" w:w="9638"/>
         <w:tblBorders>
           <w:top w:val="single" w:color="D9D6EA" w:sz="4"/>
           <w:left w:val="single" w:color="D9D6EA" w:sz="4"/>
@@ -1414,11 +1458,11 @@
           <w:insideH w:val="single" w:color="D9D6EA" w:sz="4"/>
           <w:insideV w:val="single" w:color="D9D6EA" w:sz="4"/>
         </w:tblBorders>
-        <w:tblLayout w:type="autofit"/>
+        <w:tblLayout w:type="fixed"/>
       </w:tblPr>
       <w:tblGrid>
-        <w:gridCol w:w="4819"/>
-        <w:gridCol w:w="4819"/>
+        <w:gridCol w:w="2471"/>
+        <w:gridCol w:w="7167"/>
       </w:tblGrid>
       <w:tr>
         <w:trPr>
@@ -1426,6 +1470,7 @@
         </w:trPr>
         <w:tc>
           <w:tcPr>
+            <w:tcW w:type="dxa" w:w="2471"/>
             <w:shd w:fill="1C1FC8" w:color="auto" w:val="clear"/>
             <w:tcMar>
               <w:top w:type="dxa" w:w="60"/>
@@ -1450,6 +1495,7 @@
         </w:tc>
         <w:tc>
           <w:tcPr>
+            <w:tcW w:type="dxa" w:w="7167"/>
             <w:shd w:fill="1C1FC8" w:color="auto" w:val="clear"/>
             <w:tcMar>
               <w:top w:type="dxa" w:w="60"/>
@@ -1474,8 +1520,12 @@
         </w:tc>
       </w:tr>
       <w:tr>
-        <w:tc>
-          <w:tcPr>
+        <w:trPr>
+          <w:cantSplit/>
+        </w:trPr>
+        <w:tc>
+          <w:tcPr>
+            <w:tcW w:type="dxa" w:w="2471"/>
             <w:tcMar>
               <w:top w:type="dxa" w:w="60"/>
               <w:left w:type="dxa" w:w="100"/>
@@ -1498,6 +1548,7 @@
         </w:tc>
         <w:tc>
           <w:tcPr>
+            <w:tcW w:type="dxa" w:w="7167"/>
             <w:tcMar>
               <w:top w:type="dxa" w:w="60"/>
               <w:left w:type="dxa" w:w="100"/>
@@ -1533,8 +1584,12 @@
         </w:tc>
       </w:tr>
       <w:tr>
-        <w:tc>
-          <w:tcPr>
+        <w:trPr>
+          <w:cantSplit/>
+        </w:trPr>
+        <w:tc>
+          <w:tcPr>
+            <w:tcW w:type="dxa" w:w="2471"/>
             <w:shd w:fill="F6F4FE" w:color="auto" w:val="clear"/>
             <w:tcMar>
               <w:top w:type="dxa" w:w="60"/>
@@ -1558,6 +1613,7 @@
         </w:tc>
         <w:tc>
           <w:tcPr>
+            <w:tcW w:type="dxa" w:w="7167"/>
             <w:shd w:fill="F6F4FE" w:color="auto" w:val="clear"/>
             <w:tcMar>
               <w:top w:type="dxa" w:w="60"/>
@@ -1577,8 +1633,12 @@
         </w:tc>
       </w:tr>
       <w:tr>
-        <w:tc>
-          <w:tcPr>
+        <w:trPr>
+          <w:cantSplit/>
+        </w:trPr>
+        <w:tc>
+          <w:tcPr>
+            <w:tcW w:type="dxa" w:w="2471"/>
             <w:tcMar>
               <w:top w:type="dxa" w:w="60"/>
               <w:left w:type="dxa" w:w="100"/>
@@ -1601,6 +1661,7 @@
         </w:tc>
         <w:tc>
           <w:tcPr>
+            <w:tcW w:type="dxa" w:w="7167"/>
             <w:tcMar>
               <w:top w:type="dxa" w:w="60"/>
               <w:left w:type="dxa" w:w="100"/>
@@ -1619,8 +1680,12 @@
         </w:tc>
       </w:tr>
       <w:tr>
-        <w:tc>
-          <w:tcPr>
+        <w:trPr>
+          <w:cantSplit/>
+        </w:trPr>
+        <w:tc>
+          <w:tcPr>
+            <w:tcW w:type="dxa" w:w="2471"/>
             <w:shd w:fill="F6F4FE" w:color="auto" w:val="clear"/>
             <w:tcMar>
               <w:top w:type="dxa" w:w="60"/>
@@ -1644,6 +1709,7 @@
         </w:tc>
         <w:tc>
           <w:tcPr>
+            <w:tcW w:type="dxa" w:w="7167"/>
             <w:shd w:fill="F6F4FE" w:color="auto" w:val="clear"/>
             <w:tcMar>
               <w:top w:type="dxa" w:w="60"/>
@@ -1663,8 +1729,12 @@
         </w:tc>
       </w:tr>
       <w:tr>
-        <w:tc>
-          <w:tcPr>
+        <w:trPr>
+          <w:cantSplit/>
+        </w:trPr>
+        <w:tc>
+          <w:tcPr>
+            <w:tcW w:type="dxa" w:w="2471"/>
             <w:tcMar>
               <w:top w:type="dxa" w:w="60"/>
               <w:left w:type="dxa" w:w="100"/>
@@ -1687,6 +1757,7 @@
         </w:tc>
         <w:tc>
           <w:tcPr>
+            <w:tcW w:type="dxa" w:w="7167"/>
             <w:tcMar>
               <w:top w:type="dxa" w:w="60"/>
               <w:left w:type="dxa" w:w="100"/>
@@ -1730,7 +1801,7 @@
     </w:p>
     <w:tbl>
       <w:tblPr>
-        <w:tblW w:type="pct" w:w="5000"/>
+        <w:tblW w:type="dxa" w:w="9638"/>
         <w:tblBorders>
           <w:top w:val="single" w:color="D9D6EA" w:sz="4"/>
           <w:left w:val="single" w:color="D9D6EA" w:sz="4"/>
@@ -1739,12 +1810,12 @@
           <w:insideH w:val="single" w:color="D9D6EA" w:sz="4"/>
           <w:insideV w:val="single" w:color="D9D6EA" w:sz="4"/>
         </w:tblBorders>
-        <w:tblLayout w:type="autofit"/>
+        <w:tblLayout w:type="fixed"/>
       </w:tblPr>
       <w:tblGrid>
-        <w:gridCol w:w="3213"/>
-        <w:gridCol w:w="3213"/>
-        <w:gridCol w:w="3213"/>
+        <w:gridCol w:w="1670"/>
+        <w:gridCol w:w="3666"/>
+        <w:gridCol w:w="4302"/>
       </w:tblGrid>
       <w:tr>
         <w:trPr>
@@ -1752,6 +1823,7 @@
         </w:trPr>
         <w:tc>
           <w:tcPr>
+            <w:tcW w:type="dxa" w:w="1670"/>
             <w:shd w:fill="1C1FC8" w:color="auto" w:val="clear"/>
             <w:tcMar>
               <w:top w:type="dxa" w:w="60"/>
@@ -1776,6 +1848,7 @@
         </w:tc>
         <w:tc>
           <w:tcPr>
+            <w:tcW w:type="dxa" w:w="3666"/>
             <w:shd w:fill="1C1FC8" w:color="auto" w:val="clear"/>
             <w:tcMar>
               <w:top w:type="dxa" w:w="60"/>
@@ -1800,6 +1873,7 @@
         </w:tc>
         <w:tc>
           <w:tcPr>
+            <w:tcW w:type="dxa" w:w="4302"/>
             <w:shd w:fill="1C1FC8" w:color="auto" w:val="clear"/>
             <w:tcMar>
               <w:top w:type="dxa" w:w="60"/>
@@ -1824,8 +1898,12 @@
         </w:tc>
       </w:tr>
       <w:tr>
-        <w:tc>
-          <w:tcPr>
+        <w:trPr>
+          <w:cantSplit/>
+        </w:trPr>
+        <w:tc>
+          <w:tcPr>
+            <w:tcW w:type="dxa" w:w="1670"/>
             <w:tcMar>
               <w:top w:type="dxa" w:w="60"/>
               <w:left w:type="dxa" w:w="100"/>
@@ -1848,6 +1926,7 @@
         </w:tc>
         <w:tc>
           <w:tcPr>
+            <w:tcW w:type="dxa" w:w="3666"/>
             <w:tcMar>
               <w:top w:type="dxa" w:w="60"/>
               <w:left w:type="dxa" w:w="100"/>
@@ -1866,6 +1945,7 @@
         </w:tc>
         <w:tc>
           <w:tcPr>
+            <w:tcW w:type="dxa" w:w="4302"/>
             <w:tcMar>
               <w:top w:type="dxa" w:w="60"/>
               <w:left w:type="dxa" w:w="100"/>
@@ -1894,8 +1974,12 @@
         </w:tc>
       </w:tr>
       <w:tr>
-        <w:tc>
-          <w:tcPr>
+        <w:trPr>
+          <w:cantSplit/>
+        </w:trPr>
+        <w:tc>
+          <w:tcPr>
+            <w:tcW w:type="dxa" w:w="1670"/>
             <w:shd w:fill="F6F4FE" w:color="auto" w:val="clear"/>
             <w:tcMar>
               <w:top w:type="dxa" w:w="60"/>
@@ -1919,6 +2003,7 @@
         </w:tc>
         <w:tc>
           <w:tcPr>
+            <w:tcW w:type="dxa" w:w="3666"/>
             <w:shd w:fill="F6F4FE" w:color="auto" w:val="clear"/>
             <w:tcMar>
               <w:top w:type="dxa" w:w="60"/>
@@ -1938,6 +2023,7 @@
         </w:tc>
         <w:tc>
           <w:tcPr>
+            <w:tcW w:type="dxa" w:w="4302"/>
             <w:shd w:fill="F6F4FE" w:color="auto" w:val="clear"/>
             <w:tcMar>
               <w:top w:type="dxa" w:w="60"/>
@@ -1967,8 +2053,12 @@
         </w:tc>
       </w:tr>
       <w:tr>
-        <w:tc>
-          <w:tcPr>
+        <w:trPr>
+          <w:cantSplit/>
+        </w:trPr>
+        <w:tc>
+          <w:tcPr>
+            <w:tcW w:type="dxa" w:w="1670"/>
             <w:tcMar>
               <w:top w:type="dxa" w:w="60"/>
               <w:left w:type="dxa" w:w="100"/>
@@ -1991,6 +2081,7 @@
         </w:tc>
         <w:tc>
           <w:tcPr>
+            <w:tcW w:type="dxa" w:w="3666"/>
             <w:tcMar>
               <w:top w:type="dxa" w:w="60"/>
               <w:left w:type="dxa" w:w="100"/>
@@ -2009,6 +2100,7 @@
         </w:tc>
         <w:tc>
           <w:tcPr>
+            <w:tcW w:type="dxa" w:w="4302"/>
             <w:tcMar>
               <w:top w:type="dxa" w:w="60"/>
               <w:left w:type="dxa" w:w="100"/>
@@ -2031,8 +2123,12 @@
         </w:tc>
       </w:tr>
       <w:tr>
-        <w:tc>
-          <w:tcPr>
+        <w:trPr>
+          <w:cantSplit/>
+        </w:trPr>
+        <w:tc>
+          <w:tcPr>
+            <w:tcW w:type="dxa" w:w="1670"/>
             <w:shd w:fill="F6F4FE" w:color="auto" w:val="clear"/>
             <w:tcMar>
               <w:top w:type="dxa" w:w="60"/>
@@ -2056,6 +2152,7 @@
         </w:tc>
         <w:tc>
           <w:tcPr>
+            <w:tcW w:type="dxa" w:w="3666"/>
             <w:shd w:fill="F6F4FE" w:color="auto" w:val="clear"/>
             <w:tcMar>
               <w:top w:type="dxa" w:w="60"/>
@@ -2075,6 +2172,7 @@
         </w:tc>
         <w:tc>
           <w:tcPr>
+            <w:tcW w:type="dxa" w:w="4302"/>
             <w:shd w:fill="F6F4FE" w:color="auto" w:val="clear"/>
             <w:tcMar>
               <w:top w:type="dxa" w:w="60"/>
@@ -2094,8 +2192,12 @@
         </w:tc>
       </w:tr>
       <w:tr>
-        <w:tc>
-          <w:tcPr>
+        <w:trPr>
+          <w:cantSplit/>
+        </w:trPr>
+        <w:tc>
+          <w:tcPr>
+            <w:tcW w:type="dxa" w:w="1670"/>
             <w:tcMar>
               <w:top w:type="dxa" w:w="60"/>
               <w:left w:type="dxa" w:w="100"/>
@@ -2118,6 +2220,7 @@
         </w:tc>
         <w:tc>
           <w:tcPr>
+            <w:tcW w:type="dxa" w:w="3666"/>
             <w:tcMar>
               <w:top w:type="dxa" w:w="60"/>
               <w:left w:type="dxa" w:w="100"/>
@@ -2136,6 +2239,7 @@
         </w:tc>
         <w:tc>
           <w:tcPr>
+            <w:tcW w:type="dxa" w:w="4302"/>
             <w:tcMar>
               <w:top w:type="dxa" w:w="60"/>
               <w:left w:type="dxa" w:w="100"/>
@@ -2235,7 +2339,7 @@
     </w:p>
     <w:tbl>
       <w:tblPr>
-        <w:tblW w:type="pct" w:w="5000"/>
+        <w:tblW w:type="dxa" w:w="9638"/>
         <w:tblBorders>
           <w:top w:val="single" w:color="D9D6EA" w:sz="4"/>
           <w:left w:val="single" w:color="D9D6EA" w:sz="4"/>
@@ -2244,13 +2348,13 @@
           <w:insideH w:val="single" w:color="D9D6EA" w:sz="4"/>
           <w:insideV w:val="single" w:color="D9D6EA" w:sz="4"/>
         </w:tblBorders>
-        <w:tblLayout w:type="autofit"/>
+        <w:tblLayout w:type="fixed"/>
       </w:tblPr>
       <w:tblGrid>
-        <w:gridCol w:w="2410"/>
-        <w:gridCol w:w="2410"/>
-        <w:gridCol w:w="2410"/>
-        <w:gridCol w:w="2410"/>
+        <w:gridCol w:w="983"/>
+        <w:gridCol w:w="2382"/>
+        <w:gridCol w:w="3080"/>
+        <w:gridCol w:w="3193"/>
       </w:tblGrid>
       <w:tr>
         <w:trPr>
@@ -2258,6 +2362,7 @@
         </w:trPr>
         <w:tc>
           <w:tcPr>
+            <w:tcW w:type="dxa" w:w="983"/>
             <w:shd w:fill="1C1FC8" w:color="auto" w:val="clear"/>
             <w:tcMar>
               <w:top w:type="dxa" w:w="60"/>
@@ -2282,6 +2387,7 @@
         </w:tc>
         <w:tc>
           <w:tcPr>
+            <w:tcW w:type="dxa" w:w="2382"/>
             <w:shd w:fill="1C1FC8" w:color="auto" w:val="clear"/>
             <w:tcMar>
               <w:top w:type="dxa" w:w="60"/>
@@ -2306,6 +2412,7 @@
         </w:tc>
         <w:tc>
           <w:tcPr>
+            <w:tcW w:type="dxa" w:w="3080"/>
             <w:shd w:fill="1C1FC8" w:color="auto" w:val="clear"/>
             <w:tcMar>
               <w:top w:type="dxa" w:w="60"/>
@@ -2330,6 +2437,7 @@
         </w:tc>
         <w:tc>
           <w:tcPr>
+            <w:tcW w:type="dxa" w:w="3193"/>
             <w:shd w:fill="1C1FC8" w:color="auto" w:val="clear"/>
             <w:tcMar>
               <w:top w:type="dxa" w:w="60"/>
@@ -2354,8 +2462,12 @@
         </w:tc>
       </w:tr>
       <w:tr>
-        <w:tc>
-          <w:tcPr>
+        <w:trPr>
+          <w:cantSplit/>
+        </w:trPr>
+        <w:tc>
+          <w:tcPr>
+            <w:tcW w:type="dxa" w:w="983"/>
             <w:tcMar>
               <w:top w:type="dxa" w:w="60"/>
               <w:left w:type="dxa" w:w="100"/>
@@ -2378,6 +2490,7 @@
         </w:tc>
         <w:tc>
           <w:tcPr>
+            <w:tcW w:type="dxa" w:w="2382"/>
             <w:tcMar>
               <w:top w:type="dxa" w:w="60"/>
               <w:left w:type="dxa" w:w="100"/>
@@ -2396,6 +2509,7 @@
         </w:tc>
         <w:tc>
           <w:tcPr>
+            <w:tcW w:type="dxa" w:w="3080"/>
             <w:tcMar>
               <w:top w:type="dxa" w:w="60"/>
               <w:left w:type="dxa" w:w="100"/>
@@ -2414,6 +2528,7 @@
         </w:tc>
         <w:tc>
           <w:tcPr>
+            <w:tcW w:type="dxa" w:w="3193"/>
             <w:tcMar>
               <w:top w:type="dxa" w:w="60"/>
               <w:left w:type="dxa" w:w="100"/>
@@ -2432,8 +2547,12 @@
         </w:tc>
       </w:tr>
       <w:tr>
-        <w:tc>
-          <w:tcPr>
+        <w:trPr>
+          <w:cantSplit/>
+        </w:trPr>
+        <w:tc>
+          <w:tcPr>
+            <w:tcW w:type="dxa" w:w="983"/>
             <w:shd w:fill="F6F4FE" w:color="auto" w:val="clear"/>
             <w:tcMar>
               <w:top w:type="dxa" w:w="60"/>
@@ -2457,6 +2576,7 @@
         </w:tc>
         <w:tc>
           <w:tcPr>
+            <w:tcW w:type="dxa" w:w="2382"/>
             <w:shd w:fill="F6F4FE" w:color="auto" w:val="clear"/>
             <w:tcMar>
               <w:top w:type="dxa" w:w="60"/>
@@ -2476,6 +2596,7 @@
         </w:tc>
         <w:tc>
           <w:tcPr>
+            <w:tcW w:type="dxa" w:w="3080"/>
             <w:shd w:fill="F6F4FE" w:color="auto" w:val="clear"/>
             <w:tcMar>
               <w:top w:type="dxa" w:w="60"/>
@@ -2495,6 +2616,7 @@
         </w:tc>
         <w:tc>
           <w:tcPr>
+            <w:tcW w:type="dxa" w:w="3193"/>
             <w:shd w:fill="F6F4FE" w:color="auto" w:val="clear"/>
             <w:tcMar>
               <w:top w:type="dxa" w:w="60"/>
@@ -2514,8 +2636,12 @@
         </w:tc>
       </w:tr>
       <w:tr>
-        <w:tc>
-          <w:tcPr>
+        <w:trPr>
+          <w:cantSplit/>
+        </w:trPr>
+        <w:tc>
+          <w:tcPr>
+            <w:tcW w:type="dxa" w:w="983"/>
             <w:tcMar>
               <w:top w:type="dxa" w:w="60"/>
               <w:left w:type="dxa" w:w="100"/>
@@ -2538,6 +2664,7 @@
         </w:tc>
         <w:tc>
           <w:tcPr>
+            <w:tcW w:type="dxa" w:w="2382"/>
             <w:tcMar>
               <w:top w:type="dxa" w:w="60"/>
               <w:left w:type="dxa" w:w="100"/>
@@ -2556,6 +2683,7 @@
         </w:tc>
         <w:tc>
           <w:tcPr>
+            <w:tcW w:type="dxa" w:w="3080"/>
             <w:tcMar>
               <w:top w:type="dxa" w:w="60"/>
               <w:left w:type="dxa" w:w="100"/>
@@ -2574,6 +2702,7 @@
         </w:tc>
         <w:tc>
           <w:tcPr>
+            <w:tcW w:type="dxa" w:w="3193"/>
             <w:tcMar>
               <w:top w:type="dxa" w:w="60"/>
               <w:left w:type="dxa" w:w="100"/>
@@ -2978,7 +3107,7 @@
     </w:p>
     <w:tbl>
       <w:tblPr>
-        <w:tblW w:type="pct" w:w="5000"/>
+        <w:tblW w:type="dxa" w:w="9638"/>
         <w:tblBorders>
           <w:top w:val="single" w:color="D9D6EA" w:sz="4"/>
           <w:left w:val="single" w:color="D9D6EA" w:sz="4"/>
@@ -2987,11 +3116,11 @@
           <w:insideH w:val="single" w:color="D9D6EA" w:sz="4"/>
           <w:insideV w:val="single" w:color="D9D6EA" w:sz="4"/>
         </w:tblBorders>
-        <w:tblLayout w:type="autofit"/>
+        <w:tblLayout w:type="fixed"/>
       </w:tblPr>
       <w:tblGrid>
-        <w:gridCol w:w="4819"/>
-        <w:gridCol w:w="4819"/>
+        <w:gridCol w:w="2548"/>
+        <w:gridCol w:w="7090"/>
       </w:tblGrid>
       <w:tr>
         <w:trPr>
@@ -2999,6 +3128,7 @@
         </w:trPr>
         <w:tc>
           <w:tcPr>
+            <w:tcW w:type="dxa" w:w="2548"/>
             <w:shd w:fill="1C1FC8" w:color="auto" w:val="clear"/>
             <w:tcMar>
               <w:top w:type="dxa" w:w="60"/>
@@ -3023,6 +3153,7 @@
         </w:tc>
         <w:tc>
           <w:tcPr>
+            <w:tcW w:type="dxa" w:w="7090"/>
             <w:shd w:fill="1C1FC8" w:color="auto" w:val="clear"/>
             <w:tcMar>
               <w:top w:type="dxa" w:w="60"/>
@@ -3047,8 +3178,12 @@
         </w:tc>
       </w:tr>
       <w:tr>
-        <w:tc>
-          <w:tcPr>
+        <w:trPr>
+          <w:cantSplit/>
+        </w:trPr>
+        <w:tc>
+          <w:tcPr>
+            <w:tcW w:type="dxa" w:w="2548"/>
             <w:tcMar>
               <w:top w:type="dxa" w:w="60"/>
               <w:left w:type="dxa" w:w="100"/>
@@ -3071,6 +3206,7 @@
         </w:tc>
         <w:tc>
           <w:tcPr>
+            <w:tcW w:type="dxa" w:w="7090"/>
             <w:tcMar>
               <w:top w:type="dxa" w:w="60"/>
               <w:left w:type="dxa" w:w="100"/>
@@ -3089,8 +3225,12 @@
         </w:tc>
       </w:tr>
       <w:tr>
-        <w:tc>
-          <w:tcPr>
+        <w:trPr>
+          <w:cantSplit/>
+        </w:trPr>
+        <w:tc>
+          <w:tcPr>
+            <w:tcW w:type="dxa" w:w="2548"/>
             <w:shd w:fill="F6F4FE" w:color="auto" w:val="clear"/>
             <w:tcMar>
               <w:top w:type="dxa" w:w="60"/>
@@ -3114,6 +3254,7 @@
         </w:tc>
         <w:tc>
           <w:tcPr>
+            <w:tcW w:type="dxa" w:w="7090"/>
             <w:shd w:fill="F6F4FE" w:color="auto" w:val="clear"/>
             <w:tcMar>
               <w:top w:type="dxa" w:w="60"/>
@@ -3143,8 +3284,12 @@
         </w:tc>
       </w:tr>
       <w:tr>
-        <w:tc>
-          <w:tcPr>
+        <w:trPr>
+          <w:cantSplit/>
+        </w:trPr>
+        <w:tc>
+          <w:tcPr>
+            <w:tcW w:type="dxa" w:w="2548"/>
             <w:tcMar>
               <w:top w:type="dxa" w:w="60"/>
               <w:left w:type="dxa" w:w="100"/>
@@ -3167,6 +3312,7 @@
         </w:tc>
         <w:tc>
           <w:tcPr>
+            <w:tcW w:type="dxa" w:w="7090"/>
             <w:tcMar>
               <w:top w:type="dxa" w:w="60"/>
               <w:left w:type="dxa" w:w="100"/>
@@ -3185,8 +3331,12 @@
         </w:tc>
       </w:tr>
       <w:tr>
-        <w:tc>
-          <w:tcPr>
+        <w:trPr>
+          <w:cantSplit/>
+        </w:trPr>
+        <w:tc>
+          <w:tcPr>
+            <w:tcW w:type="dxa" w:w="2548"/>
             <w:shd w:fill="F6F4FE" w:color="auto" w:val="clear"/>
             <w:tcMar>
               <w:top w:type="dxa" w:w="60"/>
@@ -3210,6 +3360,7 @@
         </w:tc>
         <w:tc>
           <w:tcPr>
+            <w:tcW w:type="dxa" w:w="7090"/>
             <w:shd w:fill="F6F4FE" w:color="auto" w:val="clear"/>
             <w:tcMar>
               <w:top w:type="dxa" w:w="60"/>
@@ -3229,8 +3380,12 @@
         </w:tc>
       </w:tr>
       <w:tr>
-        <w:tc>
-          <w:tcPr>
+        <w:trPr>
+          <w:cantSplit/>
+        </w:trPr>
+        <w:tc>
+          <w:tcPr>
+            <w:tcW w:type="dxa" w:w="2548"/>
             <w:tcMar>
               <w:top w:type="dxa" w:w="60"/>
               <w:left w:type="dxa" w:w="100"/>
@@ -3253,6 +3408,7 @@
         </w:tc>
         <w:tc>
           <w:tcPr>
+            <w:tcW w:type="dxa" w:w="7090"/>
             <w:tcMar>
               <w:top w:type="dxa" w:w="60"/>
               <w:left w:type="dxa" w:w="100"/>
@@ -3271,8 +3427,12 @@
         </w:tc>
       </w:tr>
       <w:tr>
-        <w:tc>
-          <w:tcPr>
+        <w:trPr>
+          <w:cantSplit/>
+        </w:trPr>
+        <w:tc>
+          <w:tcPr>
+            <w:tcW w:type="dxa" w:w="2548"/>
             <w:shd w:fill="F6F4FE" w:color="auto" w:val="clear"/>
             <w:tcMar>
               <w:top w:type="dxa" w:w="60"/>
@@ -3296,6 +3456,7 @@
         </w:tc>
         <w:tc>
           <w:tcPr>
+            <w:tcW w:type="dxa" w:w="7090"/>
             <w:shd w:fill="F6F4FE" w:color="auto" w:val="clear"/>
             <w:tcMar>
               <w:top w:type="dxa" w:w="60"/>
@@ -3315,8 +3476,12 @@
         </w:tc>
       </w:tr>
       <w:tr>
-        <w:tc>
-          <w:tcPr>
+        <w:trPr>
+          <w:cantSplit/>
+        </w:trPr>
+        <w:tc>
+          <w:tcPr>
+            <w:tcW w:type="dxa" w:w="2548"/>
             <w:tcMar>
               <w:top w:type="dxa" w:w="60"/>
               <w:left w:type="dxa" w:w="100"/>
@@ -3339,6 +3504,7 @@
         </w:tc>
         <w:tc>
           <w:tcPr>
+            <w:tcW w:type="dxa" w:w="7090"/>
             <w:tcMar>
               <w:top w:type="dxa" w:w="60"/>
               <w:left w:type="dxa" w:w="100"/>
@@ -3357,8 +3523,12 @@
         </w:tc>
       </w:tr>
       <w:tr>
-        <w:tc>
-          <w:tcPr>
+        <w:trPr>
+          <w:cantSplit/>
+        </w:trPr>
+        <w:tc>
+          <w:tcPr>
+            <w:tcW w:type="dxa" w:w="2548"/>
             <w:shd w:fill="F6F4FE" w:color="auto" w:val="clear"/>
             <w:tcMar>
               <w:top w:type="dxa" w:w="60"/>
@@ -3382,6 +3552,7 @@
         </w:tc>
         <w:tc>
           <w:tcPr>
+            <w:tcW w:type="dxa" w:w="7090"/>
             <w:shd w:fill="F6F4FE" w:color="auto" w:val="clear"/>
             <w:tcMar>
               <w:top w:type="dxa" w:w="60"/>
@@ -3401,8 +3572,12 @@
         </w:tc>
       </w:tr>
       <w:tr>
-        <w:tc>
-          <w:tcPr>
+        <w:trPr>
+          <w:cantSplit/>
+        </w:trPr>
+        <w:tc>
+          <w:tcPr>
+            <w:tcW w:type="dxa" w:w="2548"/>
             <w:tcMar>
               <w:top w:type="dxa" w:w="60"/>
               <w:left w:type="dxa" w:w="100"/>
@@ -3425,6 +3600,7 @@
         </w:tc>
         <w:tc>
           <w:tcPr>
+            <w:tcW w:type="dxa" w:w="7090"/>
             <w:tcMar>
               <w:top w:type="dxa" w:w="60"/>
               <w:left w:type="dxa" w:w="100"/>
@@ -3443,8 +3619,12 @@
         </w:tc>
       </w:tr>
       <w:tr>
-        <w:tc>
-          <w:tcPr>
+        <w:trPr>
+          <w:cantSplit/>
+        </w:trPr>
+        <w:tc>
+          <w:tcPr>
+            <w:tcW w:type="dxa" w:w="2548"/>
             <w:shd w:fill="F6F4FE" w:color="auto" w:val="clear"/>
             <w:tcMar>
               <w:top w:type="dxa" w:w="60"/>
@@ -3468,6 +3648,7 @@
         </w:tc>
         <w:tc>
           <w:tcPr>
+            <w:tcW w:type="dxa" w:w="7090"/>
             <w:shd w:fill="F6F4FE" w:color="auto" w:val="clear"/>
             <w:tcMar>
               <w:top w:type="dxa" w:w="60"/>
@@ -3487,8 +3668,12 @@
         </w:tc>
       </w:tr>
       <w:tr>
-        <w:tc>
-          <w:tcPr>
+        <w:trPr>
+          <w:cantSplit/>
+        </w:trPr>
+        <w:tc>
+          <w:tcPr>
+            <w:tcW w:type="dxa" w:w="2548"/>
             <w:tcMar>
               <w:top w:type="dxa" w:w="60"/>
               <w:left w:type="dxa" w:w="100"/>
@@ -3511,6 +3696,7 @@
         </w:tc>
         <w:tc>
           <w:tcPr>
+            <w:tcW w:type="dxa" w:w="7090"/>
             <w:tcMar>
               <w:top w:type="dxa" w:w="60"/>
               <w:left w:type="dxa" w:w="100"/>
@@ -3529,8 +3715,12 @@
         </w:tc>
       </w:tr>
       <w:tr>
-        <w:tc>
-          <w:tcPr>
+        <w:trPr>
+          <w:cantSplit/>
+        </w:trPr>
+        <w:tc>
+          <w:tcPr>
+            <w:tcW w:type="dxa" w:w="2548"/>
             <w:shd w:fill="F6F4FE" w:color="auto" w:val="clear"/>
             <w:tcMar>
               <w:top w:type="dxa" w:w="60"/>
@@ -3554,6 +3744,7 @@
         </w:tc>
         <w:tc>
           <w:tcPr>
+            <w:tcW w:type="dxa" w:w="7090"/>
             <w:shd w:fill="F6F4FE" w:color="auto" w:val="clear"/>
             <w:tcMar>
               <w:top w:type="dxa" w:w="60"/>

</xml_diff>

<commit_message>
Solicitações de desbloqueio e liberação automática após o prazo
- Tela Solicitações: todos pedem, só o admin aprova ou recusa, Editor/Admin
  liberam; atalho Liberar do admin; contador no menu
- Liberar antes do prazo exige solicitação aprovada; aprovar quem ainda
  não foi bloqueado isenta a falta
- Liberação automática 02:00 refeita: só quem o sistema bloqueou, com
  auditoria; prazo cumprido não bloqueia mais
- Banco: CtlCnnSolicitacao e IdSolicitacao na auditoria
- Bloqueio: CID de Salvador, ligação montar info → há o que bloquear?
- Docs e Word atualizados (regras R70 a R85)
</commit_message>
<xml_diff>
--- a/docs/word/01 - Visão geral (não técnica).docx
+++ b/docs/word/01 - Visão geral (não técnica).docx
@@ -92,7 +92,7 @@
           <w:sz w:val="22"/>
           <w:szCs w:val="22"/>
         </w:rPr>
-        <w:t xml:space="preserve">Atualizado em 17 de outubro de 2026</w:t>
+        <w:t xml:space="preserve">Atualizado em 23 de outubro de 2026</w:t>
       </w:r>
     </w:p>
     <w:p>
@@ -223,7 +223,7 @@
           </w:pPr>
           <w:hyperlink w:history="1" w:anchor="_Toc4">
             <w:r>
-              <w:t xml:space="preserve">O que o sistema faz, em quatro frases</w:t>
+              <w:t xml:space="preserve">O que o sistema faz, em cinco frases</w:t>
             </w:r>
             <w:r>
               <w:tab/>
@@ -361,7 +361,7 @@
           </w:pPr>
           <w:hyperlink w:history="1" w:anchor="_Toc10">
             <w:r>
-              <w:t xml:space="preserve">Quem pode fazer o quê no painel</w:t>
+              <w:t xml:space="preserve">Solicitações de desbloqueio</w:t>
             </w:r>
             <w:r>
               <w:tab/>
@@ -384,7 +384,7 @@
           </w:pPr>
           <w:hyperlink w:history="1" w:anchor="_Toc11">
             <w:r>
-              <w:t xml:space="preserve">Garantias do sistema</w:t>
+              <w:t xml:space="preserve">Quem pode fazer o quê no painel</w:t>
             </w:r>
             <w:r>
               <w:tab/>
@@ -407,7 +407,7 @@
           </w:pPr>
           <w:hyperlink w:history="1" w:anchor="_Toc12">
             <w:r>
-              <w:t xml:space="preserve">Perguntas frequentes</w:t>
+              <w:t xml:space="preserve">Garantias do sistema</w:t>
             </w:r>
             <w:r>
               <w:tab/>
@@ -430,7 +430,7 @@
           </w:pPr>
           <w:hyperlink w:history="1" w:anchor="_Toc13">
             <w:r>
-              <w:t xml:space="preserve">Glossário</w:t>
+              <w:t xml:space="preserve">Perguntas frequentes</w:t>
             </w:r>
             <w:r>
               <w:tab/>
@@ -438,6 +438,29 @@
             <w:r>
               <w:fldChar w:fldCharType="begin" w:dirty="true"/>
               <w:instrText xml:space="preserve">PAGEREF _Toc13 \h</w:instrText>
+              <w:fldChar w:fldCharType="separate"/>
+              <w:fldChar w:fldCharType="end"/>
+            </w:r>
+          </w:hyperlink>
+        </w:p>
+        <w:p>
+          <w:pPr>
+            <w:pStyle w:val="TOC2"/>
+            <w:tabs>
+              <w:tab w:val="right" w:pos="9638" w:leader="dot"/>
+            </w:tabs>
+            <w:ind w:left="220"/>
+          </w:pPr>
+          <w:hyperlink w:history="1" w:anchor="_Toc14">
+            <w:r>
+              <w:t xml:space="preserve">Glossário</w:t>
+            </w:r>
+            <w:r>
+              <w:tab/>
+            </w:r>
+            <w:r>
+              <w:fldChar w:fldCharType="begin" w:dirty="true"/>
+              <w:instrText xml:space="preserve">PAGEREF _Toc14 \h</w:instrText>
               <w:fldChar w:fldCharType="separate"/>
               <w:fldChar w:fldCharType="end"/>
             </w:r>
@@ -529,7 +552,7 @@
           <w:b/>
           <w:bCs/>
         </w:rPr>
-        <w:t xml:space="preserve">quando liberar</w:t>
+        <w:t xml:space="preserve">liberar antes do prazo quem justificou a falta</w:t>
       </w:r>
       <w:r>
         <w:t xml:space="preserve">.</w:t>
@@ -541,7 +564,7 @@
       </w:pPr>
       <w:bookmarkStart w:name="_Toc4" w:id="4"/>
       <w:r>
-        <w:t xml:space="preserve">O que o sistema faz, em quatro frases</w:t>
+        <w:t xml:space="preserve">O que o sistema faz, em cinco frases</w:t>
       </w:r>
       <w:bookmarkEnd w:id="4"/>
     </w:p>
@@ -585,17 +608,24 @@
         <w:spacing w:after="60"/>
       </w:pPr>
       <w:r>
-        <w:t xml:space="preserve">Ele </w:t>
-      </w:r>
-      <w:r>
         <w:rPr>
           <w:b/>
           <w:bCs/>
         </w:rPr>
-        <w:t xml:space="preserve">guarda tudo num banco de dados</w:t>
-      </w:r>
-      <w:r>
-        <w:t xml:space="preserve">: cada falta, cada bloqueio e cada liberação, com data, hora e responsável.</w:t>
+        <w:t xml:space="preserve">Toda madrugada, às 02:00</w:t>
+      </w:r>
+      <w:r>
+        <w:t xml:space="preserve">, ele </w:t>
+      </w:r>
+      <w:r>
+        <w:rPr>
+          <w:b/>
+          <w:bCs/>
+        </w:rPr>
+        <w:t xml:space="preserve">libera</w:t>
+      </w:r>
+      <w:r>
+        <w:t xml:space="preserve"> quem já cumpriu o prazo do bloqueio.</w:t>
       </w:r>
     </w:p>
     <w:p>
@@ -608,17 +638,37 @@
         <w:spacing w:after="60"/>
       </w:pPr>
       <w:r>
-        <w:t xml:space="preserve">Um </w:t>
+        <w:t xml:space="preserve">Quem </w:t>
       </w:r>
       <w:r>
         <w:rPr>
           <w:b/>
           <w:bCs/>
         </w:rPr>
-        <w:t xml:space="preserve">painel na internet</w:t>
-      </w:r>
-      <w:r>
-        <w:t xml:space="preserve"> mostra a situação de cada paciente: quem está bloqueado, até quando e quem já pode ser liberado.</w:t>
+        <w:t xml:space="preserve">justificou a falta</w:t>
+      </w:r>
+      <w:r>
+        <w:t xml:space="preserve"> (um atestado, por exemplo) pode ser liberado antes: a recepção abre uma </w:t>
+      </w:r>
+      <w:r>
+        <w:rPr>
+          <w:b/>
+          <w:bCs/>
+        </w:rPr>
+        <w:t xml:space="preserve">solicitação de desbloqueio</w:t>
+      </w:r>
+      <w:r>
+        <w:t xml:space="preserve"> no painel e o </w:t>
+      </w:r>
+      <w:r>
+        <w:rPr>
+          <w:b/>
+          <w:bCs/>
+        </w:rPr>
+        <w:t xml:space="preserve">administrador aprova</w:t>
+      </w:r>
+      <w:r>
+        <w:t xml:space="preserve">.</w:t>
       </w:r>
     </w:p>
     <w:p>
@@ -631,17 +681,40 @@
         <w:spacing w:after="60"/>
       </w:pPr>
       <w:r>
-        <w:t xml:space="preserve">A </w:t>
+        <w:t xml:space="preserve">Ele </w:t>
       </w:r>
       <w:r>
         <w:rPr>
           <w:b/>
           <w:bCs/>
         </w:rPr>
-        <w:t xml:space="preserve">liberação é sempre feita por uma pessoa</w:t>
-      </w:r>
-      <w:r>
-        <w:t xml:space="preserve">, pelo painel, com um motivo escrito. Nada é liberado sozinho.</w:t>
+        <w:t xml:space="preserve">guarda tudo num banco de dados</w:t>
+      </w:r>
+      <w:r>
+        <w:t xml:space="preserve">: cada falta, cada bloqueio, cada pedido e cada liberação, com data, hora e responsável.</w:t>
+      </w:r>
+    </w:p>
+    <w:p>
+      <w:pPr>
+        <w:pStyle w:val="ListParagraph"/>
+        <w:numPr>
+          <w:ilvl w:val="0"/>
+          <w:numId w:val="2"/>
+        </w:numPr>
+        <w:spacing w:after="60"/>
+      </w:pPr>
+      <w:r>
+        <w:t xml:space="preserve">Um </w:t>
+      </w:r>
+      <w:r>
+        <w:rPr>
+          <w:b/>
+          <w:bCs/>
+        </w:rPr>
+        <w:t xml:space="preserve">painel na internet</w:t>
+      </w:r>
+      <w:r>
+        <w:t xml:space="preserve"> mostra a situação de cada paciente e de cada pedido. Nada fica por e-mail.</w:t>
       </w:r>
     </w:p>
     <w:p>
@@ -667,7 +740,7 @@
       <w:r>
         <w:drawing>
           <wp:inline distT="0" distB="0" distL="0" distR="0">
-            <wp:extent cx="1971675" cy="8572500"/>
+            <wp:extent cx="3438525" cy="8572500"/>
             <wp:effectExtent t="0" r="0" b="0" l="0"/>
             <wp:docPr id="2" name="" descr="" title=""/>
             <wp:cNvGraphicFramePr>
@@ -692,7 +765,7 @@
                   <pic:spPr bwMode="auto">
                     <a:xfrm>
                       <a:off x="0" y="0"/>
-                      <a:ext cx="1971675" cy="8572500"/>
+                      <a:ext cx="3438525" cy="8572500"/>
                     </a:xfrm>
                     <a:prstGeom prst="rect">
                       <a:avLst/>
@@ -757,8 +830,8 @@
         <w:tblLayout w:type="fixed"/>
       </w:tblPr>
       <w:tblGrid>
-        <w:gridCol w:w="3765"/>
-        <w:gridCol w:w="5873"/>
+        <w:gridCol w:w="4951"/>
+        <w:gridCol w:w="4687"/>
       </w:tblGrid>
       <w:tr>
         <w:trPr>
@@ -766,7 +839,7 @@
         </w:trPr>
         <w:tc>
           <w:tcPr>
-            <w:tcW w:type="dxa" w:w="3765"/>
+            <w:tcW w:type="dxa" w:w="4951"/>
             <w:shd w:fill="1C1FC8" w:color="auto" w:val="clear"/>
             <w:tcMar>
               <w:top w:type="dxa" w:w="60"/>
@@ -791,7 +864,7 @@
         </w:tc>
         <w:tc>
           <w:tcPr>
-            <w:tcW w:type="dxa" w:w="5873"/>
+            <w:tcW w:type="dxa" w:w="4687"/>
             <w:shd w:fill="1C1FC8" w:color="auto" w:val="clear"/>
             <w:tcMar>
               <w:top w:type="dxa" w:w="60"/>
@@ -810,7 +883,7 @@
                 <w:bCs/>
                 <w:color w:val="FFFFFF"/>
               </w:rPr>
-              <w:t xml:space="preserve">Pode ser liberado depois de</w:t>
+              <w:t xml:space="preserve">O bloqueio dura</w:t>
             </w:r>
           </w:p>
         </w:tc>
@@ -821,7 +894,7 @@
         </w:trPr>
         <w:tc>
           <w:tcPr>
-            <w:tcW w:type="dxa" w:w="3765"/>
+            <w:tcW w:type="dxa" w:w="4951"/>
             <w:tcMar>
               <w:top w:type="dxa" w:w="60"/>
               <w:left w:type="dxa" w:w="100"/>
@@ -840,7 +913,7 @@
         </w:tc>
         <w:tc>
           <w:tcPr>
-            <w:tcW w:type="dxa" w:w="5873"/>
+            <w:tcW w:type="dxa" w:w="4687"/>
             <w:tcMar>
               <w:top w:type="dxa" w:w="60"/>
               <w:left w:type="dxa" w:w="100"/>
@@ -868,7 +941,7 @@
         </w:trPr>
         <w:tc>
           <w:tcPr>
-            <w:tcW w:type="dxa" w:w="3765"/>
+            <w:tcW w:type="dxa" w:w="4951"/>
             <w:shd w:fill="F6F4FE" w:color="auto" w:val="clear"/>
             <w:tcMar>
               <w:top w:type="dxa" w:w="60"/>
@@ -888,7 +961,7 @@
         </w:tc>
         <w:tc>
           <w:tcPr>
-            <w:tcW w:type="dxa" w:w="5873"/>
+            <w:tcW w:type="dxa" w:w="4687"/>
             <w:shd w:fill="F6F4FE" w:color="auto" w:val="clear"/>
             <w:tcMar>
               <w:top w:type="dxa" w:w="60"/>
@@ -917,7 +990,7 @@
         </w:trPr>
         <w:tc>
           <w:tcPr>
-            <w:tcW w:type="dxa" w:w="3765"/>
+            <w:tcW w:type="dxa" w:w="4951"/>
             <w:tcMar>
               <w:top w:type="dxa" w:w="60"/>
               <w:left w:type="dxa" w:w="100"/>
@@ -936,7 +1009,7 @@
         </w:tc>
         <w:tc>
           <w:tcPr>
-            <w:tcW w:type="dxa" w:w="5873"/>
+            <w:tcW w:type="dxa" w:w="4687"/>
             <w:tcMar>
               <w:top w:type="dxa" w:w="60"/>
               <w:left w:type="dxa" w:w="100"/>
@@ -994,7 +1067,35 @@
         <w:t xml:space="preserve">Exemplo:</w:t>
       </w:r>
       <w:r>
-        <w:t xml:space="preserve"> Maria falta em 05/10 (1ª falta) e fica bloqueada. Ela pode ser liberada a partir de 04/12, 60 dias depois. Se ela faltar de novo em 20/11 (2ª falta), o prazo passa a contar de 20/11, e ela só pode ser liberada a partir de 18/02, 90 dias depois.</w:t>
+        <w:t xml:space="preserve"> Maria falta em 05/10 (1ª falta) e fica bloqueada. O prazo vai até 04/12, 60 dias depois; na madrugada de 05/12, o sistema a libera. Se ela faltar de novo em 20/11 (2ª falta), o prazo passa a contar de 20/11 e vai até 18/02, 90 dias depois.</w:t>
+      </w:r>
+    </w:p>
+    <w:p>
+      <w:pPr>
+        <w:spacing w:after="120"/>
+      </w:pPr>
+      <w:r>
+        <w:t xml:space="preserve">Se uma falta chega ao sistema </w:t>
+      </w:r>
+      <w:r>
+        <w:rPr>
+          <w:b/>
+          <w:bCs/>
+        </w:rPr>
+        <w:t xml:space="preserve">depois</w:t>
+      </w:r>
+      <w:r>
+        <w:t xml:space="preserve"> que o prazo dela já acabou (por exemplo, lançada com muito atraso no CNN), o paciente </w:t>
+      </w:r>
+      <w:r>
+        <w:rPr>
+          <w:b/>
+          <w:bCs/>
+        </w:rPr>
+        <w:t xml:space="preserve">não é bloqueado</w:t>
+      </w:r>
+      <w:r>
+        <w:t xml:space="preserve">: o prazo já foi cumprido.</w:t>
       </w:r>
     </w:p>
     <w:p>
@@ -1015,7 +1116,7 @@
       <w:r>
         <w:drawing>
           <wp:inline distT="0" distB="0" distL="0" distR="0">
-            <wp:extent cx="5905500" cy="4829175"/>
+            <wp:extent cx="5905500" cy="3619500"/>
             <wp:effectExtent t="0" r="0" b="0" l="0"/>
             <wp:docPr id="3" name="" descr="" title=""/>
             <wp:cNvGraphicFramePr>
@@ -1040,7 +1141,7 @@
                   <pic:spPr bwMode="auto">
                     <a:xfrm>
                       <a:off x="0" y="0"/>
-                      <a:ext cx="5905500" cy="4829175"/>
+                      <a:ext cx="5905500" cy="3619500"/>
                     </a:xfrm>
                     <a:prstGeom prst="rect">
                       <a:avLst/>
@@ -1067,9 +1168,9 @@
         <w:tblLayout w:type="fixed"/>
       </w:tblPr>
       <w:tblGrid>
-        <w:gridCol w:w="1714"/>
-        <w:gridCol w:w="5708"/>
-        <w:gridCol w:w="2216"/>
+        <w:gridCol w:w="2080"/>
+        <w:gridCol w:w="4991"/>
+        <w:gridCol w:w="2566"/>
       </w:tblGrid>
       <w:tr>
         <w:trPr>
@@ -1077,7 +1178,7 @@
         </w:trPr>
         <w:tc>
           <w:tcPr>
-            <w:tcW w:type="dxa" w:w="1714"/>
+            <w:tcW w:type="dxa" w:w="2080"/>
             <w:shd w:fill="1C1FC8" w:color="auto" w:val="clear"/>
             <w:tcMar>
               <w:top w:type="dxa" w:w="60"/>
@@ -1102,7 +1203,7 @@
         </w:tc>
         <w:tc>
           <w:tcPr>
-            <w:tcW w:type="dxa" w:w="5708"/>
+            <w:tcW w:type="dxa" w:w="4991"/>
             <w:shd w:fill="1C1FC8" w:color="auto" w:val="clear"/>
             <w:tcMar>
               <w:top w:type="dxa" w:w="60"/>
@@ -1127,7 +1228,7 @@
         </w:tc>
         <w:tc>
           <w:tcPr>
-            <w:tcW w:type="dxa" w:w="2216"/>
+            <w:tcW w:type="dxa" w:w="2566"/>
             <w:shd w:fill="1C1FC8" w:color="auto" w:val="clear"/>
             <w:tcMar>
               <w:top w:type="dxa" w:w="60"/>
@@ -1157,7 +1258,7 @@
         </w:trPr>
         <w:tc>
           <w:tcPr>
-            <w:tcW w:type="dxa" w:w="1714"/>
+            <w:tcW w:type="dxa" w:w="2080"/>
             <w:tcMar>
               <w:top w:type="dxa" w:w="60"/>
               <w:left w:type="dxa" w:w="100"/>
@@ -1180,7 +1281,7 @@
         </w:tc>
         <w:tc>
           <w:tcPr>
-            <w:tcW w:type="dxa" w:w="5708"/>
+            <w:tcW w:type="dxa" w:w="4991"/>
             <w:tcMar>
               <w:top w:type="dxa" w:w="60"/>
               <w:left w:type="dxa" w:w="100"/>
@@ -1203,26 +1304,36 @@
               <w:t xml:space="preserve">FALTOU</w:t>
             </w:r>
             <w:r>
-              <w:t xml:space="preserve"> no CNN, como já faz hoje</w:t>
-            </w:r>
-          </w:p>
-        </w:tc>
-        <w:tc>
-          <w:tcPr>
-            <w:tcW w:type="dxa" w:w="2216"/>
-            <w:tcMar>
-              <w:top w:type="dxa" w:w="60"/>
-              <w:left w:type="dxa" w:w="100"/>
-              <w:bottom w:type="dxa" w:w="60"/>
-              <w:right w:type="dxa" w:w="100"/>
-            </w:tcMar>
-          </w:tcPr>
-          <w:p>
-            <w:pPr>
-              <w:spacing w:after="40" w:before="40"/>
-            </w:pPr>
-            <w:r>
-              <w:t xml:space="preserve">CNN</w:t>
+              <w:t xml:space="preserve"> no CNN, como já faz hoje. Quando o paciente liga e justifica a falta, abre uma </w:t>
+            </w:r>
+            <w:r>
+              <w:rPr>
+                <w:b/>
+                <w:bCs/>
+              </w:rPr>
+              <w:t xml:space="preserve">solicitação de desbloqueio</w:t>
+            </w:r>
+            <w:r>
+              <w:t xml:space="preserve">, com o motivo</w:t>
+            </w:r>
+          </w:p>
+        </w:tc>
+        <w:tc>
+          <w:tcPr>
+            <w:tcW w:type="dxa" w:w="2566"/>
+            <w:tcMar>
+              <w:top w:type="dxa" w:w="60"/>
+              <w:left w:type="dxa" w:w="100"/>
+              <w:bottom w:type="dxa" w:w="60"/>
+              <w:right w:type="dxa" w:w="100"/>
+            </w:tcMar>
+          </w:tcPr>
+          <w:p>
+            <w:pPr>
+              <w:spacing w:after="40" w:before="40"/>
+            </w:pPr>
+            <w:r>
+              <w:t xml:space="preserve">CNN e painel</w:t>
             </w:r>
           </w:p>
         </w:tc>
@@ -1233,7 +1344,7 @@
         </w:trPr>
         <w:tc>
           <w:tcPr>
-            <w:tcW w:type="dxa" w:w="1714"/>
+            <w:tcW w:type="dxa" w:w="2080"/>
             <w:shd w:fill="F6F4FE" w:color="auto" w:val="clear"/>
             <w:tcMar>
               <w:top w:type="dxa" w:w="60"/>
@@ -1251,13 +1362,13 @@
                 <w:b/>
                 <w:bCs/>
               </w:rPr>
-              <w:t xml:space="preserve">Automação (01:00)</w:t>
-            </w:r>
-          </w:p>
-        </w:tc>
-        <w:tc>
-          <w:tcPr>
-            <w:tcW w:type="dxa" w:w="5708"/>
+              <w:t xml:space="preserve">Automação (01:00 e 02:00)</w:t>
+            </w:r>
+          </w:p>
+        </w:tc>
+        <w:tc>
+          <w:tcPr>
+            <w:tcW w:type="dxa" w:w="4991"/>
             <w:shd w:fill="F6F4FE" w:color="auto" w:val="clear"/>
             <w:tcMar>
               <w:top w:type="dxa" w:w="60"/>
@@ -1271,13 +1382,13 @@
               <w:spacing w:after="40" w:before="40"/>
             </w:pPr>
             <w:r>
-              <w:t xml:space="preserve">Encontra as faltas, bloqueia quem ainda está ativo e registra tudo</w:t>
-            </w:r>
-          </w:p>
-        </w:tc>
-        <w:tc>
-          <w:tcPr>
-            <w:tcW w:type="dxa" w:w="2216"/>
+              <w:t xml:space="preserve">Encontra as faltas e bloqueia quem ainda está no prazo; libera quem cumpriu o prazo; registra tudo</w:t>
+            </w:r>
+          </w:p>
+        </w:tc>
+        <w:tc>
+          <w:tcPr>
+            <w:tcW w:type="dxa" w:w="2566"/>
             <w:shd w:fill="F6F4FE" w:color="auto" w:val="clear"/>
             <w:tcMar>
               <w:top w:type="dxa" w:w="60"/>
@@ -1302,62 +1413,69 @@
         </w:trPr>
         <w:tc>
           <w:tcPr>
-            <w:tcW w:type="dxa" w:w="1714"/>
-            <w:tcMar>
-              <w:top w:type="dxa" w:w="60"/>
-              <w:left w:type="dxa" w:w="100"/>
-              <w:bottom w:type="dxa" w:w="60"/>
-              <w:right w:type="dxa" w:w="100"/>
-            </w:tcMar>
-          </w:tcPr>
-          <w:p>
-            <w:pPr>
-              <w:spacing w:after="40" w:before="40"/>
-            </w:pPr>
-            <w:r>
-              <w:rPr>
-                <w:b/>
-                <w:bCs/>
-              </w:rPr>
-              <w:t xml:space="preserve">Equipe do painel</w:t>
-            </w:r>
-          </w:p>
-        </w:tc>
-        <w:tc>
-          <w:tcPr>
-            <w:tcW w:type="dxa" w:w="5708"/>
-            <w:tcMar>
-              <w:top w:type="dxa" w:w="60"/>
-              <w:left w:type="dxa" w:w="100"/>
-              <w:bottom w:type="dxa" w:w="60"/>
-              <w:right w:type="dxa" w:w="100"/>
-            </w:tcMar>
-          </w:tcPr>
-          <w:p>
-            <w:pPr>
-              <w:spacing w:after="40" w:before="40"/>
-            </w:pPr>
-            <w:r>
-              <w:t xml:space="preserve">Acompanha a lista, libera quem cumpriu o prazo e, quando preciso, libera antes (com motivo) ou bloqueia na hora</w:t>
-            </w:r>
-          </w:p>
-        </w:tc>
-        <w:tc>
-          <w:tcPr>
-            <w:tcW w:type="dxa" w:w="2216"/>
-            <w:tcMar>
-              <w:top w:type="dxa" w:w="60"/>
-              <w:left w:type="dxa" w:w="100"/>
-              <w:bottom w:type="dxa" w:w="60"/>
-              <w:right w:type="dxa" w:w="100"/>
-            </w:tcMar>
-          </w:tcPr>
-          <w:p>
-            <w:pPr>
-              <w:spacing w:after="40" w:before="40"/>
-            </w:pPr>
-            <w:r>
-              <w:t xml:space="preserve">Painel</w:t>
+            <w:tcW w:type="dxa" w:w="2080"/>
+            <w:tcMar>
+              <w:top w:type="dxa" w:w="60"/>
+              <w:left w:type="dxa" w:w="100"/>
+              <w:bottom w:type="dxa" w:w="60"/>
+              <w:right w:type="dxa" w:w="100"/>
+            </w:tcMar>
+          </w:tcPr>
+          <w:p>
+            <w:pPr>
+              <w:spacing w:after="40" w:before="40"/>
+            </w:pPr>
+            <w:r>
+              <w:rPr>
+                <w:b/>
+                <w:bCs/>
+              </w:rPr>
+              <w:t xml:space="preserve">Administrador</w:t>
+            </w:r>
+          </w:p>
+        </w:tc>
+        <w:tc>
+          <w:tcPr>
+            <w:tcW w:type="dxa" w:w="4991"/>
+            <w:tcMar>
+              <w:top w:type="dxa" w:w="60"/>
+              <w:left w:type="dxa" w:w="100"/>
+              <w:bottom w:type="dxa" w:w="60"/>
+              <w:right w:type="dxa" w:w="100"/>
+            </w:tcMar>
+          </w:tcPr>
+          <w:p>
+            <w:pPr>
+              <w:spacing w:after="40" w:before="40"/>
+            </w:pPr>
+            <w:r>
+              <w:rPr>
+                <w:b/>
+                <w:bCs/>
+              </w:rPr>
+              <w:t xml:space="preserve">Aprova ou recusa</w:t>
+            </w:r>
+            <w:r>
+              <w:t xml:space="preserve"> as solicitações (pode também aprovar e liberar de uma vez). Cria os usuários do painel e define o que cada um pode fazer</w:t>
+            </w:r>
+          </w:p>
+        </w:tc>
+        <w:tc>
+          <w:tcPr>
+            <w:tcW w:type="dxa" w:w="2566"/>
+            <w:tcMar>
+              <w:top w:type="dxa" w:w="60"/>
+              <w:left w:type="dxa" w:w="100"/>
+              <w:bottom w:type="dxa" w:w="60"/>
+              <w:right w:type="dxa" w:w="100"/>
+            </w:tcMar>
+          </w:tcPr>
+          <w:p>
+            <w:pPr>
+              <w:spacing w:after="40" w:before="40"/>
+            </w:pPr>
+            <w:r>
+              <w:t xml:space="preserve">Painel → Solicitações e Usuários</w:t>
             </w:r>
           </w:p>
         </w:tc>
@@ -1368,7 +1486,7 @@
         </w:trPr>
         <w:tc>
           <w:tcPr>
-            <w:tcW w:type="dxa" w:w="1714"/>
+            <w:tcW w:type="dxa" w:w="2080"/>
             <w:shd w:fill="F6F4FE" w:color="auto" w:val="clear"/>
             <w:tcMar>
               <w:top w:type="dxa" w:w="60"/>
@@ -1386,13 +1504,13 @@
                 <w:b/>
                 <w:bCs/>
               </w:rPr>
-              <w:t xml:space="preserve">Administrador</w:t>
-            </w:r>
-          </w:p>
-        </w:tc>
-        <w:tc>
-          <w:tcPr>
-            <w:tcW w:type="dxa" w:w="5708"/>
+              <w:t xml:space="preserve">Editor</w:t>
+            </w:r>
+          </w:p>
+        </w:tc>
+        <w:tc>
+          <w:tcPr>
+            <w:tcW w:type="dxa" w:w="4991"/>
             <w:shd w:fill="F6F4FE" w:color="auto" w:val="clear"/>
             <w:tcMar>
               <w:top w:type="dxa" w:w="60"/>
@@ -1406,13 +1524,13 @@
               <w:spacing w:after="40" w:before="40"/>
             </w:pPr>
             <w:r>
-              <w:t xml:space="preserve">Cria os usuários do painel, define o que cada um pode fazer e redefine senhas</w:t>
-            </w:r>
-          </w:p>
-        </w:tc>
-        <w:tc>
-          <w:tcPr>
-            <w:tcW w:type="dxa" w:w="2216"/>
+              <w:t xml:space="preserve">Libera no CNN as solicitações aprovadas; pode bloquear na hora e liberar quem já cumpriu o prazo</w:t>
+            </w:r>
+          </w:p>
+        </w:tc>
+        <w:tc>
+          <w:tcPr>
+            <w:tcW w:type="dxa" w:w="2566"/>
             <w:shd w:fill="F6F4FE" w:color="auto" w:val="clear"/>
             <w:tcMar>
               <w:top w:type="dxa" w:w="60"/>
@@ -1426,7 +1544,7 @@
               <w:spacing w:after="40" w:before="40"/>
             </w:pPr>
             <w:r>
-              <w:t xml:space="preserve">Painel → Usuários</w:t>
+              <w:t xml:space="preserve">Painel</w:t>
             </w:r>
           </w:p>
         </w:tc>
@@ -1568,6 +1686,16 @@
                 <w:b/>
                 <w:bCs/>
               </w:rPr>
+              <w:t xml:space="preserve">Solicitar desbloqueio</w:t>
+            </w:r>
+            <w:r>
+              <w:t xml:space="preserve">, </w:t>
+            </w:r>
+            <w:r>
+              <w:rPr>
+                <w:b/>
+                <w:bCs/>
+              </w:rPr>
               <w:t xml:space="preserve">Liberar</w:t>
             </w:r>
             <w:r>
@@ -1579,6 +1707,9 @@
                 <w:bCs/>
               </w:rPr>
               <w:t xml:space="preserve">Bloquear</w:t>
+            </w:r>
+            <w:r>
+              <w:t xml:space="preserve">, conforme o perfil</w:t>
             </w:r>
           </w:p>
         </w:tc>
@@ -1607,7 +1738,7 @@
                 <w:b/>
                 <w:bCs/>
               </w:rPr>
-              <w:t xml:space="preserve">Relatórios de faltas</w:t>
+              <w:t xml:space="preserve">Solicitações</w:t>
             </w:r>
           </w:p>
         </w:tc>
@@ -1627,7 +1758,7 @@
               <w:spacing w:after="40" w:before="40"/>
             </w:pPr>
             <w:r>
-              <w:t xml:space="preserve">Números e gráficos: faltas por mês, por dia da semana, por profissional, por tipo de consulta, por procedimento e por período do dia. Dá para exportar em planilha</w:t>
+              <w:t xml:space="preserve">Os pedidos de desbloqueio: quem pediu, quando, por qual motivo, e o que foi decidido. O menu mostra quantos aguardam aprovação. O administrador aprova ou recusa aqui</w:t>
             </w:r>
           </w:p>
         </w:tc>
@@ -1655,7 +1786,7 @@
                 <w:b/>
                 <w:bCs/>
               </w:rPr>
-              <w:t xml:space="preserve">Histórico de ações</w:t>
+              <w:t xml:space="preserve">Relatórios de faltas</w:t>
             </w:r>
           </w:p>
         </w:tc>
@@ -1674,7 +1805,7 @@
               <w:spacing w:after="40" w:before="40"/>
             </w:pPr>
             <w:r>
-              <w:t xml:space="preserve">Tudo o que foi feito: cada bloqueio e cada liberação, quem fez, quando e por quê</w:t>
+              <w:t xml:space="preserve">Números e gráficos: faltas por mês, por dia da semana, por profissional, por tipo de consulta, por procedimento e por período do dia. Dá para exportar em planilha</w:t>
             </w:r>
           </w:p>
         </w:tc>
@@ -1703,7 +1834,7 @@
                 <w:b/>
                 <w:bCs/>
               </w:rPr>
-              <w:t xml:space="preserve">Configuração</w:t>
+              <w:t xml:space="preserve">Histórico de ações</w:t>
             </w:r>
           </w:p>
         </w:tc>
@@ -1723,7 +1854,7 @@
               <w:spacing w:after="40" w:before="40"/>
             </w:pPr>
             <w:r>
-              <w:t xml:space="preserve">Mostra as regras em uso (prazos, início do ciclo, horário da automação). Só leitura</w:t>
+              <w:t xml:space="preserve">Tudo o que foi feito: cada bloqueio e cada liberação, quem fez, quando e por quê</w:t>
             </w:r>
           </w:p>
         </w:tc>
@@ -1751,6 +1882,54 @@
                 <w:b/>
                 <w:bCs/>
               </w:rPr>
+              <w:t xml:space="preserve">Configuração</w:t>
+            </w:r>
+          </w:p>
+        </w:tc>
+        <w:tc>
+          <w:tcPr>
+            <w:tcW w:type="dxa" w:w="7167"/>
+            <w:tcMar>
+              <w:top w:type="dxa" w:w="60"/>
+              <w:left w:type="dxa" w:w="100"/>
+              <w:bottom w:type="dxa" w:w="60"/>
+              <w:right w:type="dxa" w:w="100"/>
+            </w:tcMar>
+          </w:tcPr>
+          <w:p>
+            <w:pPr>
+              <w:spacing w:after="40" w:before="40"/>
+            </w:pPr>
+            <w:r>
+              <w:t xml:space="preserve">Mostra as regras em uso (prazos, início do ciclo, horários da automação). Só leitura</w:t>
+            </w:r>
+          </w:p>
+        </w:tc>
+      </w:tr>
+      <w:tr>
+        <w:trPr>
+          <w:cantSplit/>
+        </w:trPr>
+        <w:tc>
+          <w:tcPr>
+            <w:tcW w:type="dxa" w:w="2471"/>
+            <w:shd w:fill="F6F4FE" w:color="auto" w:val="clear"/>
+            <w:tcMar>
+              <w:top w:type="dxa" w:w="60"/>
+              <w:left w:type="dxa" w:w="100"/>
+              <w:bottom w:type="dxa" w:w="60"/>
+              <w:right w:type="dxa" w:w="100"/>
+            </w:tcMar>
+          </w:tcPr>
+          <w:p>
+            <w:pPr>
+              <w:spacing w:after="40" w:before="40"/>
+            </w:pPr>
+            <w:r>
+              <w:rPr>
+                <w:b/>
+                <w:bCs/>
+              </w:rPr>
               <w:t xml:space="preserve">Usuários</w:t>
             </w:r>
           </w:p>
@@ -1758,6 +1937,7 @@
         <w:tc>
           <w:tcPr>
             <w:tcW w:type="dxa" w:w="7167"/>
+            <w:shd w:fill="F6F4FE" w:color="auto" w:val="clear"/>
             <w:tcMar>
               <w:top w:type="dxa" w:w="60"/>
               <w:left w:type="dxa" w:w="100"/>
@@ -1813,9 +1993,9 @@
         <w:tblLayout w:type="fixed"/>
       </w:tblPr>
       <w:tblGrid>
-        <w:gridCol w:w="1670"/>
-        <w:gridCol w:w="3666"/>
-        <w:gridCol w:w="4302"/>
+        <w:gridCol w:w="1567"/>
+        <w:gridCol w:w="4036"/>
+        <w:gridCol w:w="4036"/>
       </w:tblGrid>
       <w:tr>
         <w:trPr>
@@ -1823,7 +2003,7 @@
         </w:trPr>
         <w:tc>
           <w:tcPr>
-            <w:tcW w:type="dxa" w:w="1670"/>
+            <w:tcW w:type="dxa" w:w="1567"/>
             <w:shd w:fill="1C1FC8" w:color="auto" w:val="clear"/>
             <w:tcMar>
               <w:top w:type="dxa" w:w="60"/>
@@ -1848,7 +2028,7 @@
         </w:tc>
         <w:tc>
           <w:tcPr>
-            <w:tcW w:type="dxa" w:w="3666"/>
+            <w:tcW w:type="dxa" w:w="4036"/>
             <w:shd w:fill="1C1FC8" w:color="auto" w:val="clear"/>
             <w:tcMar>
               <w:top w:type="dxa" w:w="60"/>
@@ -1873,7 +2053,7 @@
         </w:tc>
         <w:tc>
           <w:tcPr>
-            <w:tcW w:type="dxa" w:w="4302"/>
+            <w:tcW w:type="dxa" w:w="4036"/>
             <w:shd w:fill="1C1FC8" w:color="auto" w:val="clear"/>
             <w:tcMar>
               <w:top w:type="dxa" w:w="60"/>
@@ -1903,7 +2083,7 @@
         </w:trPr>
         <w:tc>
           <w:tcPr>
-            <w:tcW w:type="dxa" w:w="1670"/>
+            <w:tcW w:type="dxa" w:w="1567"/>
             <w:tcMar>
               <w:top w:type="dxa" w:w="60"/>
               <w:left w:type="dxa" w:w="100"/>
@@ -1926,49 +2106,46 @@
         </w:tc>
         <w:tc>
           <w:tcPr>
-            <w:tcW w:type="dxa" w:w="3666"/>
-            <w:tcMar>
-              <w:top w:type="dxa" w:w="60"/>
-              <w:left w:type="dxa" w:w="100"/>
-              <w:bottom w:type="dxa" w:w="60"/>
-              <w:right w:type="dxa" w:w="100"/>
-            </w:tcMar>
-          </w:tcPr>
-          <w:p>
-            <w:pPr>
-              <w:spacing w:after="40" w:before="40"/>
-            </w:pPr>
-            <w:r>
-              <w:t xml:space="preserve">A falta foi registrada, mas o bloqueio ainda não aconteceu</w:t>
-            </w:r>
-          </w:p>
-        </w:tc>
-        <w:tc>
-          <w:tcPr>
-            <w:tcW w:type="dxa" w:w="4302"/>
-            <w:tcMar>
-              <w:top w:type="dxa" w:w="60"/>
-              <w:left w:type="dxa" w:w="100"/>
-              <w:bottom w:type="dxa" w:w="60"/>
-              <w:right w:type="dxa" w:w="100"/>
-            </w:tcMar>
-          </w:tcPr>
-          <w:p>
-            <w:pPr>
-              <w:spacing w:after="40" w:before="40"/>
-            </w:pPr>
-            <w:r>
-              <w:t xml:space="preserve">Nada: a automação das 01:00 bloqueia. Ou clique em </w:t>
-            </w:r>
-            <w:r>
-              <w:rPr>
-                <w:b/>
-                <w:bCs/>
-              </w:rPr>
-              <w:t xml:space="preserve">Bloquear</w:t>
-            </w:r>
-            <w:r>
-              <w:t xml:space="preserve"> para bloquear na hora</w:t>
+            <w:tcW w:type="dxa" w:w="4036"/>
+            <w:tcMar>
+              <w:top w:type="dxa" w:w="60"/>
+              <w:left w:type="dxa" w:w="100"/>
+              <w:bottom w:type="dxa" w:w="60"/>
+              <w:right w:type="dxa" w:w="100"/>
+            </w:tcMar>
+          </w:tcPr>
+          <w:p>
+            <w:pPr>
+              <w:spacing w:after="40" w:before="40"/>
+            </w:pPr>
+            <w:r>
+              <w:t xml:space="preserve">A falta foi registrada e o prazo corre, mas o bloqueio ainda não aconteceu</w:t>
+            </w:r>
+          </w:p>
+        </w:tc>
+        <w:tc>
+          <w:tcPr>
+            <w:tcW w:type="dxa" w:w="4036"/>
+            <w:tcMar>
+              <w:top w:type="dxa" w:w="60"/>
+              <w:left w:type="dxa" w:w="100"/>
+              <w:bottom w:type="dxa" w:w="60"/>
+              <w:right w:type="dxa" w:w="100"/>
+            </w:tcMar>
+          </w:tcPr>
+          <w:p>
+            <w:pPr>
+              <w:spacing w:after="40" w:before="40"/>
+            </w:pPr>
+            <w:r>
+              <w:t xml:space="preserve">Nada: a automação das 01:00 bloqueia. Se o paciente justificou a falta, </w:t>
+            </w:r>
+            <w:r>
+              <w:rPr>
+                <w:b/>
+                <w:bCs/>
+              </w:rPr>
+              <w:t xml:space="preserve">Solicitar desbloqueio</w:t>
             </w:r>
           </w:p>
         </w:tc>
@@ -1979,7 +2156,7 @@
         </w:trPr>
         <w:tc>
           <w:tcPr>
-            <w:tcW w:type="dxa" w:w="1670"/>
+            <w:tcW w:type="dxa" w:w="1567"/>
             <w:shd w:fill="F6F4FE" w:color="auto" w:val="clear"/>
             <w:tcMar>
               <w:top w:type="dxa" w:w="60"/>
@@ -2003,7 +2180,7 @@
         </w:tc>
         <w:tc>
           <w:tcPr>
-            <w:tcW w:type="dxa" w:w="3666"/>
+            <w:tcW w:type="dxa" w:w="4036"/>
             <w:shd w:fill="F6F4FE" w:color="auto" w:val="clear"/>
             <w:tcMar>
               <w:top w:type="dxa" w:w="60"/>
@@ -2023,7 +2200,7 @@
         </w:tc>
         <w:tc>
           <w:tcPr>
-            <w:tcW w:type="dxa" w:w="4302"/>
+            <w:tcW w:type="dxa" w:w="4036"/>
             <w:shd w:fill="F6F4FE" w:color="auto" w:val="clear"/>
             <w:tcMar>
               <w:top w:type="dxa" w:w="60"/>
@@ -2044,10 +2221,7 @@
                 <w:b/>
                 <w:bCs/>
               </w:rPr>
-              <w:t xml:space="preserve">Liberar</w:t>
-            </w:r>
-            <w:r>
-              <w:t xml:space="preserve"> antes, com motivo</w:t>
+              <w:t xml:space="preserve">Solicitar desbloqueio</w:t>
             </w:r>
           </w:p>
         </w:tc>
@@ -2058,7 +2232,7 @@
         </w:trPr>
         <w:tc>
           <w:tcPr>
-            <w:tcW w:type="dxa" w:w="1670"/>
+            <w:tcW w:type="dxa" w:w="1567"/>
             <w:tcMar>
               <w:top w:type="dxa" w:w="60"/>
               <w:left w:type="dxa" w:w="100"/>
@@ -2081,7 +2255,7 @@
         </w:tc>
         <w:tc>
           <w:tcPr>
-            <w:tcW w:type="dxa" w:w="3666"/>
+            <w:tcW w:type="dxa" w:w="4036"/>
             <w:tcMar>
               <w:top w:type="dxa" w:w="60"/>
               <w:left w:type="dxa" w:w="100"/>
@@ -2100,24 +2274,30 @@
         </w:tc>
         <w:tc>
           <w:tcPr>
-            <w:tcW w:type="dxa" w:w="4302"/>
-            <w:tcMar>
-              <w:top w:type="dxa" w:w="60"/>
-              <w:left w:type="dxa" w:w="100"/>
-              <w:bottom w:type="dxa" w:w="60"/>
-              <w:right w:type="dxa" w:w="100"/>
-            </w:tcMar>
-          </w:tcPr>
-          <w:p>
-            <w:pPr>
-              <w:spacing w:after="40" w:before="40"/>
-            </w:pPr>
+            <w:tcW w:type="dxa" w:w="4036"/>
+            <w:tcMar>
+              <w:top w:type="dxa" w:w="60"/>
+              <w:left w:type="dxa" w:w="100"/>
+              <w:bottom w:type="dxa" w:w="60"/>
+              <w:right w:type="dxa" w:w="100"/>
+            </w:tcMar>
+          </w:tcPr>
+          <w:p>
+            <w:pPr>
+              <w:spacing w:after="40" w:before="40"/>
+            </w:pPr>
+            <w:r>
+              <w:t xml:space="preserve">Nada: a automação das 02:00 libera. Editor ou administrador também pode </w:t>
+            </w:r>
             <w:r>
               <w:rPr>
                 <w:b/>
                 <w:bCs/>
               </w:rPr>
               <w:t xml:space="preserve">Liberar</w:t>
+            </w:r>
+            <w:r>
+              <w:t xml:space="preserve"> na hora</w:t>
             </w:r>
           </w:p>
         </w:tc>
@@ -2128,7 +2308,7 @@
         </w:trPr>
         <w:tc>
           <w:tcPr>
-            <w:tcW w:type="dxa" w:w="1670"/>
+            <w:tcW w:type="dxa" w:w="1567"/>
             <w:shd w:fill="F6F4FE" w:color="auto" w:val="clear"/>
             <w:tcMar>
               <w:top w:type="dxa" w:w="60"/>
@@ -2152,7 +2332,7 @@
         </w:tc>
         <w:tc>
           <w:tcPr>
-            <w:tcW w:type="dxa" w:w="3666"/>
+            <w:tcW w:type="dxa" w:w="4036"/>
             <w:shd w:fill="F6F4FE" w:color="auto" w:val="clear"/>
             <w:tcMar>
               <w:top w:type="dxa" w:w="60"/>
@@ -2166,13 +2346,13 @@
               <w:spacing w:after="40" w:before="40"/>
             </w:pPr>
             <w:r>
-              <w:t xml:space="preserve">Foi liberado por alguém antes do fim do prazo</w:t>
-            </w:r>
-          </w:p>
-        </w:tc>
-        <w:tc>
-          <w:tcPr>
-            <w:tcW w:type="dxa" w:w="4302"/>
+              <w:t xml:space="preserve">Foi liberado por uma solicitação aprovada</w:t>
+            </w:r>
+          </w:p>
+        </w:tc>
+        <w:tc>
+          <w:tcPr>
+            <w:tcW w:type="dxa" w:w="4036"/>
             <w:shd w:fill="F6F4FE" w:color="auto" w:val="clear"/>
             <w:tcMar>
               <w:top w:type="dxa" w:w="60"/>
@@ -2197,7 +2377,7 @@
         </w:trPr>
         <w:tc>
           <w:tcPr>
-            <w:tcW w:type="dxa" w:w="1670"/>
+            <w:tcW w:type="dxa" w:w="1567"/>
             <w:tcMar>
               <w:top w:type="dxa" w:w="60"/>
               <w:left w:type="dxa" w:w="100"/>
@@ -2220,26 +2400,26 @@
         </w:tc>
         <w:tc>
           <w:tcPr>
-            <w:tcW w:type="dxa" w:w="3666"/>
-            <w:tcMar>
-              <w:top w:type="dxa" w:w="60"/>
-              <w:left w:type="dxa" w:w="100"/>
-              <w:bottom w:type="dxa" w:w="60"/>
-              <w:right w:type="dxa" w:w="100"/>
-            </w:tcMar>
-          </w:tcPr>
-          <w:p>
-            <w:pPr>
-              <w:spacing w:after="40" w:before="40"/>
-            </w:pPr>
-            <w:r>
-              <w:t xml:space="preserve">Já cumpriu o prazo e foi liberado</w:t>
-            </w:r>
-          </w:p>
-        </w:tc>
-        <w:tc>
-          <w:tcPr>
-            <w:tcW w:type="dxa" w:w="4302"/>
+            <w:tcW w:type="dxa" w:w="4036"/>
+            <w:tcMar>
+              <w:top w:type="dxa" w:w="60"/>
+              <w:left w:type="dxa" w:w="100"/>
+              <w:bottom w:type="dxa" w:w="60"/>
+              <w:right w:type="dxa" w:w="100"/>
+            </w:tcMar>
+          </w:tcPr>
+          <w:p>
+            <w:pPr>
+              <w:spacing w:after="40" w:before="40"/>
+            </w:pPr>
+            <w:r>
+              <w:t xml:space="preserve">Já cumpriu o prazo e foi liberado (ou o prazo acabou sem precisar de bloqueio)</w:t>
+            </w:r>
+          </w:p>
+        </w:tc>
+        <w:tc>
+          <w:tcPr>
+            <w:tcW w:type="dxa" w:w="4036"/>
             <w:tcMar>
               <w:top w:type="dxa" w:w="60"/>
               <w:left w:type="dxa" w:w="100"/>
@@ -2271,7 +2451,7 @@
       <w:r>
         <w:drawing>
           <wp:inline distT="0" distB="0" distL="0" distR="0">
-            <wp:extent cx="4543425" cy="5210175"/>
+            <wp:extent cx="5467350" cy="4781550"/>
             <wp:effectExtent t="0" r="0" b="0" l="0"/>
             <wp:docPr id="4" name="" descr="" title=""/>
             <wp:cNvGraphicFramePr>
@@ -2296,7 +2476,7 @@
                   <pic:spPr bwMode="auto">
                     <a:xfrm>
                       <a:off x="0" y="0"/>
-                      <a:ext cx="4543425" cy="5210175"/>
+                      <a:ext cx="5467350" cy="4781550"/>
                     </a:xfrm>
                     <a:prstGeom prst="rect">
                       <a:avLst/>
@@ -2315,7 +2495,7 @@
       </w:pPr>
       <w:bookmarkStart w:name="_Toc10" w:id="10"/>
       <w:r>
-        <w:t xml:space="preserve">Quem pode fazer o quê no painel</w:t>
+        <w:t xml:space="preserve">Solicitações de desbloqueio</w:t>
       </w:r>
       <w:bookmarkEnd w:id="10"/>
     </w:p>
@@ -2324,18 +2504,153 @@
         <w:spacing w:after="120"/>
       </w:pPr>
       <w:r>
-        <w:t xml:space="preserve">Cada pessoa tem o </w:t>
-      </w:r>
+        <w:t xml:space="preserve">Antes, o pedido para liberar um paciente ia por e-mail para o administrador, e ninguém mais acompanhava. Agora tudo fica no painel:</w:t>
+      </w:r>
+    </w:p>
+    <w:p>
+      <w:pPr>
+        <w:pStyle w:val="ListParagraph"/>
+        <w:numPr>
+          <w:ilvl w:val="0"/>
+          <w:numId w:val="3"/>
+        </w:numPr>
+        <w:spacing w:after="60"/>
+      </w:pPr>
       <w:r>
         <w:rPr>
           <w:b/>
           <w:bCs/>
         </w:rPr>
-        <w:t xml:space="preserve">próprio login e senha</w:t>
-      </w:r>
-      <w:r>
-        <w:t xml:space="preserve">. Nada de usuário compartilhado: o histórico mostra o nome de quem fez cada ação.</w:t>
-      </w:r>
+        <w:t xml:space="preserve">O paciente liga e justifica a falta.</w:t>
+      </w:r>
+      <w:r>
+        <w:t xml:space="preserve"> A recepção abre uma solicitação no painel (tela </w:t>
+      </w:r>
+      <w:r>
+        <w:rPr>
+          <w:b/>
+          <w:bCs/>
+        </w:rPr>
+        <w:t xml:space="preserve">Solicitações</w:t>
+      </w:r>
+      <w:r>
+        <w:t xml:space="preserve"> ou botão </w:t>
+      </w:r>
+      <w:r>
+        <w:rPr>
+          <w:b/>
+          <w:bCs/>
+        </w:rPr>
+        <w:t xml:space="preserve">Solicitar desbloqueio</w:t>
+      </w:r>
+      <w:r>
+        <w:t xml:space="preserve"> na lista) e escreve o motivo.</w:t>
+      </w:r>
+    </w:p>
+    <w:p>
+      <w:pPr>
+        <w:pStyle w:val="ListParagraph"/>
+        <w:numPr>
+          <w:ilvl w:val="0"/>
+          <w:numId w:val="3"/>
+        </w:numPr>
+        <w:spacing w:after="60"/>
+      </w:pPr>
+      <w:r>
+        <w:rPr>
+          <w:b/>
+          <w:bCs/>
+        </w:rPr>
+        <w:t xml:space="preserve">O administrador vê o pedido.</w:t>
+      </w:r>
+      <w:r>
+        <w:t xml:space="preserve"> O menu mostra quantos aguardam aprovação. Ele </w:t>
+      </w:r>
+      <w:r>
+        <w:rPr>
+          <w:b/>
+          <w:bCs/>
+        </w:rPr>
+        <w:t xml:space="preserve">aprova</w:t>
+      </w:r>
+      <w:r>
+        <w:t xml:space="preserve"> ou </w:t>
+      </w:r>
+      <w:r>
+        <w:rPr>
+          <w:b/>
+          <w:bCs/>
+        </w:rPr>
+        <w:t xml:space="preserve">recusa</w:t>
+      </w:r>
+      <w:r>
+        <w:t xml:space="preserve">, e a recusa também tem motivo.</w:t>
+      </w:r>
+    </w:p>
+    <w:p>
+      <w:pPr>
+        <w:pStyle w:val="ListParagraph"/>
+        <w:numPr>
+          <w:ilvl w:val="0"/>
+          <w:numId w:val="3"/>
+        </w:numPr>
+        <w:spacing w:after="60"/>
+      </w:pPr>
+      <w:r>
+        <w:rPr>
+          <w:b/>
+          <w:bCs/>
+        </w:rPr>
+        <w:t xml:space="preserve">Alguém libera no CNN.</w:t>
+      </w:r>
+      <w:r>
+        <w:t xml:space="preserve"> Um editor ou o próprio administrador clica em </w:t>
+      </w:r>
+      <w:r>
+        <w:rPr>
+          <w:b/>
+          <w:bCs/>
+        </w:rPr>
+        <w:t xml:space="preserve">Liberar</w:t>
+      </w:r>
+      <w:r>
+        <w:t xml:space="preserve">. O administrador também pode usar </w:t>
+      </w:r>
+      <w:r>
+        <w:rPr>
+          <w:b/>
+          <w:bCs/>
+        </w:rPr>
+        <w:t xml:space="preserve">Aprovar e liberar</w:t>
+      </w:r>
+      <w:r>
+        <w:t xml:space="preserve">, de uma vez.</w:t>
+      </w:r>
+    </w:p>
+    <w:p>
+      <w:pPr>
+        <w:pStyle w:val="ListParagraph"/>
+        <w:numPr>
+          <w:ilvl w:val="0"/>
+          <w:numId w:val="3"/>
+        </w:numPr>
+        <w:spacing w:after="60"/>
+      </w:pPr>
+      <w:r>
+        <w:rPr>
+          <w:b/>
+          <w:bCs/>
+        </w:rPr>
+        <w:t xml:space="preserve">Todos acompanham.</w:t>
+      </w:r>
+      <w:r>
+        <w:t xml:space="preserve"> A lista mostra quem pediu, quando, o motivo, quem decidiu e quem liberou.</w:t>
+      </w:r>
+    </w:p>
+    <w:p>
+      <w:pPr>
+        <w:spacing w:after="60"/>
+      </w:pPr>
     </w:p>
     <w:tbl>
       <w:tblPr>
@@ -2351,10 +2666,8 @@
         <w:tblLayout w:type="fixed"/>
       </w:tblPr>
       <w:tblGrid>
-        <w:gridCol w:w="983"/>
-        <w:gridCol w:w="2382"/>
-        <w:gridCol w:w="3080"/>
-        <w:gridCol w:w="3193"/>
+        <w:gridCol w:w="2766"/>
+        <w:gridCol w:w="6872"/>
       </w:tblGrid>
       <w:tr>
         <w:trPr>
@@ -2362,7 +2675,7 @@
         </w:trPr>
         <w:tc>
           <w:tcPr>
-            <w:tcW w:type="dxa" w:w="983"/>
+            <w:tcW w:type="dxa" w:w="2766"/>
             <w:shd w:fill="1C1FC8" w:color="auto" w:val="clear"/>
             <w:tcMar>
               <w:top w:type="dxa" w:w="60"/>
@@ -2381,13 +2694,13 @@
                 <w:bCs/>
                 <w:color w:val="FFFFFF"/>
               </w:rPr>
-              <w:t xml:space="preserve">Perfil</w:t>
-            </w:r>
-          </w:p>
-        </w:tc>
-        <w:tc>
-          <w:tcPr>
-            <w:tcW w:type="dxa" w:w="2382"/>
+              <w:t xml:space="preserve">Situação do pedido</w:t>
+            </w:r>
+          </w:p>
+        </w:tc>
+        <w:tc>
+          <w:tcPr>
+            <w:tcW w:type="dxa" w:w="6872"/>
             <w:shd w:fill="1C1FC8" w:color="auto" w:val="clear"/>
             <w:tcMar>
               <w:top w:type="dxa" w:w="60"/>
@@ -2406,57 +2719,7 @@
                 <w:bCs/>
                 <w:color w:val="FFFFFF"/>
               </w:rPr>
-              <w:t xml:space="preserve">Pode ver as telas</w:t>
-            </w:r>
-          </w:p>
-        </w:tc>
-        <w:tc>
-          <w:tcPr>
-            <w:tcW w:type="dxa" w:w="3080"/>
-            <w:shd w:fill="1C1FC8" w:color="auto" w:val="clear"/>
-            <w:tcMar>
-              <w:top w:type="dxa" w:w="60"/>
-              <w:left w:type="dxa" w:w="100"/>
-              <w:bottom w:type="dxa" w:w="60"/>
-              <w:right w:type="dxa" w:w="100"/>
-            </w:tcMar>
-          </w:tcPr>
-          <w:p>
-            <w:pPr>
-              <w:spacing w:after="40" w:before="40"/>
-            </w:pPr>
-            <w:r>
-              <w:rPr>
-                <w:b/>
-                <w:bCs/>
-                <w:color w:val="FFFFFF"/>
-              </w:rPr>
-              <w:t xml:space="preserve">Pode liberar e bloquear</w:t>
-            </w:r>
-          </w:p>
-        </w:tc>
-        <w:tc>
-          <w:tcPr>
-            <w:tcW w:type="dxa" w:w="3193"/>
-            <w:shd w:fill="1C1FC8" w:color="auto" w:val="clear"/>
-            <w:tcMar>
-              <w:top w:type="dxa" w:w="60"/>
-              <w:left w:type="dxa" w:w="100"/>
-              <w:bottom w:type="dxa" w:w="60"/>
-              <w:right w:type="dxa" w:w="100"/>
-            </w:tcMar>
-          </w:tcPr>
-          <w:p>
-            <w:pPr>
-              <w:spacing w:after="40" w:before="40"/>
-            </w:pPr>
-            <w:r>
-              <w:rPr>
-                <w:b/>
-                <w:bCs/>
-                <w:color w:val="FFFFFF"/>
-              </w:rPr>
-              <w:t xml:space="preserve">Pode cuidar dos usuários</w:t>
+              <w:t xml:space="preserve">O que significa</w:t>
             </w:r>
           </w:p>
         </w:tc>
@@ -2467,81 +2730,43 @@
         </w:trPr>
         <w:tc>
           <w:tcPr>
-            <w:tcW w:type="dxa" w:w="983"/>
-            <w:tcMar>
-              <w:top w:type="dxa" w:w="60"/>
-              <w:left w:type="dxa" w:w="100"/>
-              <w:bottom w:type="dxa" w:w="60"/>
-              <w:right w:type="dxa" w:w="100"/>
-            </w:tcMar>
-          </w:tcPr>
-          <w:p>
-            <w:pPr>
-              <w:spacing w:after="40" w:before="40"/>
-            </w:pPr>
-            <w:r>
-              <w:rPr>
-                <w:b/>
-                <w:bCs/>
-              </w:rPr>
-              <w:t xml:space="preserve">Leitor</w:t>
-            </w:r>
-          </w:p>
-        </w:tc>
-        <w:tc>
-          <w:tcPr>
-            <w:tcW w:type="dxa" w:w="2382"/>
-            <w:tcMar>
-              <w:top w:type="dxa" w:w="60"/>
-              <w:left w:type="dxa" w:w="100"/>
-              <w:bottom w:type="dxa" w:w="60"/>
-              <w:right w:type="dxa" w:w="100"/>
-            </w:tcMar>
-          </w:tcPr>
-          <w:p>
-            <w:pPr>
-              <w:spacing w:after="40" w:before="40"/>
-            </w:pPr>
-            <w:r>
-              <w:t xml:space="preserve">Sim</w:t>
-            </w:r>
-          </w:p>
-        </w:tc>
-        <w:tc>
-          <w:tcPr>
-            <w:tcW w:type="dxa" w:w="3080"/>
-            <w:tcMar>
-              <w:top w:type="dxa" w:w="60"/>
-              <w:left w:type="dxa" w:w="100"/>
-              <w:bottom w:type="dxa" w:w="60"/>
-              <w:right w:type="dxa" w:w="100"/>
-            </w:tcMar>
-          </w:tcPr>
-          <w:p>
-            <w:pPr>
-              <w:spacing w:after="40" w:before="40"/>
-            </w:pPr>
-            <w:r>
-              <w:t xml:space="preserve">Não</w:t>
-            </w:r>
-          </w:p>
-        </w:tc>
-        <w:tc>
-          <w:tcPr>
-            <w:tcW w:type="dxa" w:w="3193"/>
-            <w:tcMar>
-              <w:top w:type="dxa" w:w="60"/>
-              <w:left w:type="dxa" w:w="100"/>
-              <w:bottom w:type="dxa" w:w="60"/>
-              <w:right w:type="dxa" w:w="100"/>
-            </w:tcMar>
-          </w:tcPr>
-          <w:p>
-            <w:pPr>
-              <w:spacing w:after="40" w:before="40"/>
-            </w:pPr>
-            <w:r>
-              <w:t xml:space="preserve">Não</w:t>
+            <w:tcW w:type="dxa" w:w="2766"/>
+            <w:tcMar>
+              <w:top w:type="dxa" w:w="60"/>
+              <w:left w:type="dxa" w:w="100"/>
+              <w:bottom w:type="dxa" w:w="60"/>
+              <w:right w:type="dxa" w:w="100"/>
+            </w:tcMar>
+          </w:tcPr>
+          <w:p>
+            <w:pPr>
+              <w:spacing w:after="40" w:before="40"/>
+            </w:pPr>
+            <w:r>
+              <w:rPr>
+                <w:b/>
+                <w:bCs/>
+              </w:rPr>
+              <w:t xml:space="preserve">Aguardando aprovação</w:t>
+            </w:r>
+          </w:p>
+        </w:tc>
+        <w:tc>
+          <w:tcPr>
+            <w:tcW w:type="dxa" w:w="6872"/>
+            <w:tcMar>
+              <w:top w:type="dxa" w:w="60"/>
+              <w:left w:type="dxa" w:w="100"/>
+              <w:bottom w:type="dxa" w:w="60"/>
+              <w:right w:type="dxa" w:w="100"/>
+            </w:tcMar>
+          </w:tcPr>
+          <w:p>
+            <w:pPr>
+              <w:spacing w:after="40" w:before="40"/>
+            </w:pPr>
+            <w:r>
+              <w:t xml:space="preserve">O administrador ainda não decidiu</w:t>
             </w:r>
           </w:p>
         </w:tc>
@@ -2552,7 +2777,7 @@
         </w:trPr>
         <w:tc>
           <w:tcPr>
-            <w:tcW w:type="dxa" w:w="983"/>
+            <w:tcW w:type="dxa" w:w="2766"/>
             <w:shd w:fill="F6F4FE" w:color="auto" w:val="clear"/>
             <w:tcMar>
               <w:top w:type="dxa" w:w="60"/>
@@ -2570,13 +2795,13 @@
                 <w:b/>
                 <w:bCs/>
               </w:rPr>
-              <w:t xml:space="preserve">Editor</w:t>
-            </w:r>
-          </w:p>
-        </w:tc>
-        <w:tc>
-          <w:tcPr>
-            <w:tcW w:type="dxa" w:w="2382"/>
+              <w:t xml:space="preserve">Aprovada · falta liberar</w:t>
+            </w:r>
+          </w:p>
+        </w:tc>
+        <w:tc>
+          <w:tcPr>
+            <w:tcW w:type="dxa" w:w="6872"/>
             <w:shd w:fill="F6F4FE" w:color="auto" w:val="clear"/>
             <w:tcMar>
               <w:top w:type="dxa" w:w="60"/>
@@ -2590,47 +2815,7 @@
               <w:spacing w:after="40" w:before="40"/>
             </w:pPr>
             <w:r>
-              <w:t xml:space="preserve">Sim</w:t>
-            </w:r>
-          </w:p>
-        </w:tc>
-        <w:tc>
-          <w:tcPr>
-            <w:tcW w:type="dxa" w:w="3080"/>
-            <w:shd w:fill="F6F4FE" w:color="auto" w:val="clear"/>
-            <w:tcMar>
-              <w:top w:type="dxa" w:w="60"/>
-              <w:left w:type="dxa" w:w="100"/>
-              <w:bottom w:type="dxa" w:w="60"/>
-              <w:right w:type="dxa" w:w="100"/>
-            </w:tcMar>
-          </w:tcPr>
-          <w:p>
-            <w:pPr>
-              <w:spacing w:after="40" w:before="40"/>
-            </w:pPr>
-            <w:r>
-              <w:t xml:space="preserve">Sim</w:t>
-            </w:r>
-          </w:p>
-        </w:tc>
-        <w:tc>
-          <w:tcPr>
-            <w:tcW w:type="dxa" w:w="3193"/>
-            <w:shd w:fill="F6F4FE" w:color="auto" w:val="clear"/>
-            <w:tcMar>
-              <w:top w:type="dxa" w:w="60"/>
-              <w:left w:type="dxa" w:w="100"/>
-              <w:bottom w:type="dxa" w:w="60"/>
-              <w:right w:type="dxa" w:w="100"/>
-            </w:tcMar>
-          </w:tcPr>
-          <w:p>
-            <w:pPr>
-              <w:spacing w:after="40" w:before="40"/>
-            </w:pPr>
-            <w:r>
-              <w:t xml:space="preserve">Não</w:t>
+              <w:t xml:space="preserve">Aprovada; falta um editor ou administrador liberar no CNN</w:t>
             </w:r>
           </w:p>
         </w:tc>
@@ -2641,81 +2826,188 @@
         </w:trPr>
         <w:tc>
           <w:tcPr>
-            <w:tcW w:type="dxa" w:w="983"/>
-            <w:tcMar>
-              <w:top w:type="dxa" w:w="60"/>
-              <w:left w:type="dxa" w:w="100"/>
-              <w:bottom w:type="dxa" w:w="60"/>
-              <w:right w:type="dxa" w:w="100"/>
-            </w:tcMar>
-          </w:tcPr>
-          <w:p>
-            <w:pPr>
-              <w:spacing w:after="40" w:before="40"/>
-            </w:pPr>
-            <w:r>
-              <w:rPr>
-                <w:b/>
-                <w:bCs/>
-              </w:rPr>
-              <w:t xml:space="preserve">Admin</w:t>
-            </w:r>
-          </w:p>
-        </w:tc>
-        <w:tc>
-          <w:tcPr>
-            <w:tcW w:type="dxa" w:w="2382"/>
-            <w:tcMar>
-              <w:top w:type="dxa" w:w="60"/>
-              <w:left w:type="dxa" w:w="100"/>
-              <w:bottom w:type="dxa" w:w="60"/>
-              <w:right w:type="dxa" w:w="100"/>
-            </w:tcMar>
-          </w:tcPr>
-          <w:p>
-            <w:pPr>
-              <w:spacing w:after="40" w:before="40"/>
-            </w:pPr>
-            <w:r>
-              <w:t xml:space="preserve">Sim</w:t>
-            </w:r>
-          </w:p>
-        </w:tc>
-        <w:tc>
-          <w:tcPr>
-            <w:tcW w:type="dxa" w:w="3080"/>
-            <w:tcMar>
-              <w:top w:type="dxa" w:w="60"/>
-              <w:left w:type="dxa" w:w="100"/>
-              <w:bottom w:type="dxa" w:w="60"/>
-              <w:right w:type="dxa" w:w="100"/>
-            </w:tcMar>
-          </w:tcPr>
-          <w:p>
-            <w:pPr>
-              <w:spacing w:after="40" w:before="40"/>
-            </w:pPr>
-            <w:r>
-              <w:t xml:space="preserve">Sim</w:t>
-            </w:r>
-          </w:p>
-        </w:tc>
-        <w:tc>
-          <w:tcPr>
-            <w:tcW w:type="dxa" w:w="3193"/>
-            <w:tcMar>
-              <w:top w:type="dxa" w:w="60"/>
-              <w:left w:type="dxa" w:w="100"/>
-              <w:bottom w:type="dxa" w:w="60"/>
-              <w:right w:type="dxa" w:w="100"/>
-            </w:tcMar>
-          </w:tcPr>
-          <w:p>
-            <w:pPr>
-              <w:spacing w:after="40" w:before="40"/>
-            </w:pPr>
-            <w:r>
-              <w:t xml:space="preserve">Sim</w:t>
+            <w:tcW w:type="dxa" w:w="2766"/>
+            <w:tcMar>
+              <w:top w:type="dxa" w:w="60"/>
+              <w:left w:type="dxa" w:w="100"/>
+              <w:bottom w:type="dxa" w:w="60"/>
+              <w:right w:type="dxa" w:w="100"/>
+            </w:tcMar>
+          </w:tcPr>
+          <w:p>
+            <w:pPr>
+              <w:spacing w:after="40" w:before="40"/>
+            </w:pPr>
+            <w:r>
+              <w:rPr>
+                <w:b/>
+                <w:bCs/>
+              </w:rPr>
+              <w:t xml:space="preserve">Liberada</w:t>
+            </w:r>
+          </w:p>
+        </w:tc>
+        <w:tc>
+          <w:tcPr>
+            <w:tcW w:type="dxa" w:w="6872"/>
+            <w:tcMar>
+              <w:top w:type="dxa" w:w="60"/>
+              <w:left w:type="dxa" w:w="100"/>
+              <w:bottom w:type="dxa" w:w="60"/>
+              <w:right w:type="dxa" w:w="100"/>
+            </w:tcMar>
+          </w:tcPr>
+          <w:p>
+            <w:pPr>
+              <w:spacing w:after="40" w:before="40"/>
+            </w:pPr>
+            <w:r>
+              <w:t xml:space="preserve">O paciente foi reativado no CNN</w:t>
+            </w:r>
+          </w:p>
+        </w:tc>
+      </w:tr>
+      <w:tr>
+        <w:trPr>
+          <w:cantSplit/>
+        </w:trPr>
+        <w:tc>
+          <w:tcPr>
+            <w:tcW w:type="dxa" w:w="2766"/>
+            <w:shd w:fill="F6F4FE" w:color="auto" w:val="clear"/>
+            <w:tcMar>
+              <w:top w:type="dxa" w:w="60"/>
+              <w:left w:type="dxa" w:w="100"/>
+              <w:bottom w:type="dxa" w:w="60"/>
+              <w:right w:type="dxa" w:w="100"/>
+            </w:tcMar>
+          </w:tcPr>
+          <w:p>
+            <w:pPr>
+              <w:spacing w:after="40" w:before="40"/>
+            </w:pPr>
+            <w:r>
+              <w:rPr>
+                <w:b/>
+                <w:bCs/>
+              </w:rPr>
+              <w:t xml:space="preserve">Recusada</w:t>
+            </w:r>
+          </w:p>
+        </w:tc>
+        <w:tc>
+          <w:tcPr>
+            <w:tcW w:type="dxa" w:w="6872"/>
+            <w:shd w:fill="F6F4FE" w:color="auto" w:val="clear"/>
+            <w:tcMar>
+              <w:top w:type="dxa" w:w="60"/>
+              <w:left w:type="dxa" w:w="100"/>
+              <w:bottom w:type="dxa" w:w="60"/>
+              <w:right w:type="dxa" w:w="100"/>
+            </w:tcMar>
+          </w:tcPr>
+          <w:p>
+            <w:pPr>
+              <w:spacing w:after="40" w:before="40"/>
+            </w:pPr>
+            <w:r>
+              <w:t xml:space="preserve">O administrador recusou, com motivo</w:t>
+            </w:r>
+          </w:p>
+        </w:tc>
+      </w:tr>
+      <w:tr>
+        <w:trPr>
+          <w:cantSplit/>
+        </w:trPr>
+        <w:tc>
+          <w:tcPr>
+            <w:tcW w:type="dxa" w:w="2766"/>
+            <w:tcMar>
+              <w:top w:type="dxa" w:w="60"/>
+              <w:left w:type="dxa" w:w="100"/>
+              <w:bottom w:type="dxa" w:w="60"/>
+              <w:right w:type="dxa" w:w="100"/>
+            </w:tcMar>
+          </w:tcPr>
+          <w:p>
+            <w:pPr>
+              <w:spacing w:after="40" w:before="40"/>
+            </w:pPr>
+            <w:r>
+              <w:rPr>
+                <w:b/>
+                <w:bCs/>
+              </w:rPr>
+              <w:t xml:space="preserve">Cancelada</w:t>
+            </w:r>
+          </w:p>
+        </w:tc>
+        <w:tc>
+          <w:tcPr>
+            <w:tcW w:type="dxa" w:w="6872"/>
+            <w:tcMar>
+              <w:top w:type="dxa" w:w="60"/>
+              <w:left w:type="dxa" w:w="100"/>
+              <w:bottom w:type="dxa" w:w="60"/>
+              <w:right w:type="dxa" w:w="100"/>
+            </w:tcMar>
+          </w:tcPr>
+          <w:p>
+            <w:pPr>
+              <w:spacing w:after="40" w:before="40"/>
+            </w:pPr>
+            <w:r>
+              <w:t xml:space="preserve">Quem pediu desistiu (aberta por engano, por exemplo)</w:t>
+            </w:r>
+          </w:p>
+        </w:tc>
+      </w:tr>
+      <w:tr>
+        <w:trPr>
+          <w:cantSplit/>
+        </w:trPr>
+        <w:tc>
+          <w:tcPr>
+            <w:tcW w:type="dxa" w:w="2766"/>
+            <w:shd w:fill="F6F4FE" w:color="auto" w:val="clear"/>
+            <w:tcMar>
+              <w:top w:type="dxa" w:w="60"/>
+              <w:left w:type="dxa" w:w="100"/>
+              <w:bottom w:type="dxa" w:w="60"/>
+              <w:right w:type="dxa" w:w="100"/>
+            </w:tcMar>
+          </w:tcPr>
+          <w:p>
+            <w:pPr>
+              <w:spacing w:after="40" w:before="40"/>
+            </w:pPr>
+            <w:r>
+              <w:rPr>
+                <w:b/>
+                <w:bCs/>
+              </w:rPr>
+              <w:t xml:space="preserve">Encerrada</w:t>
+            </w:r>
+          </w:p>
+        </w:tc>
+        <w:tc>
+          <w:tcPr>
+            <w:tcW w:type="dxa" w:w="6872"/>
+            <w:shd w:fill="F6F4FE" w:color="auto" w:val="clear"/>
+            <w:tcMar>
+              <w:top w:type="dxa" w:w="60"/>
+              <w:left w:type="dxa" w:w="100"/>
+              <w:bottom w:type="dxa" w:w="60"/>
+              <w:right w:type="dxa" w:w="100"/>
+            </w:tcMar>
+          </w:tcPr>
+          <w:p>
+            <w:pPr>
+              <w:spacing w:after="40" w:before="40"/>
+            </w:pPr>
+            <w:r>
+              <w:t xml:space="preserve">Perdeu o sentido: o prazo acabou e a automação liberou, ou o paciente teve uma falta nova</w:t>
             </w:r>
           </w:p>
         </w:tc>
@@ -2725,13 +3017,21 @@
       <w:pPr>
         <w:spacing w:after="120"/>
       </w:pPr>
+    </w:p>
+    <w:p>
+      <w:pPr>
+        <w:spacing w:after="120"/>
+      </w:pPr>
+      <w:r>
+        <w:t xml:space="preserve">Regras simples:</w:t>
+      </w:r>
     </w:p>
     <w:p>
       <w:pPr>
         <w:pStyle w:val="ListParagraph"/>
         <w:numPr>
           <w:ilvl w:val="0"/>
-          <w:numId w:val="3"/>
+          <w:numId w:val="4"/>
         </w:numPr>
         <w:spacing w:after="60"/>
       </w:pPr>
@@ -2740,20 +3040,10 @@
           <w:b/>
           <w:bCs/>
         </w:rPr>
-        <w:t xml:space="preserve">No primeiro acesso,</w:t>
-      </w:r>
-      <w:r>
-        <w:t xml:space="preserve"> a pessoa entra com uma </w:t>
-      </w:r>
-      <w:r>
-        <w:rPr>
-          <w:b/>
-          <w:bCs/>
-        </w:rPr>
-        <w:t xml:space="preserve">senha temporária</w:t>
-      </w:r>
-      <w:r>
-        <w:t xml:space="preserve">, que o administrador repassa, e precisa criar a própria senha.</w:t>
+        <w:t xml:space="preserve">Só para quem está no prazo.</w:t>
+      </w:r>
+      <w:r>
+        <w:t xml:space="preserve"> Quem já cumpriu o prazo é liberado pela automação, sem pedido.</w:t>
       </w:r>
     </w:p>
     <w:p>
@@ -2761,7 +3051,7 @@
         <w:pStyle w:val="ListParagraph"/>
         <w:numPr>
           <w:ilvl w:val="0"/>
-          <w:numId w:val="3"/>
+          <w:numId w:val="4"/>
         </w:numPr>
         <w:spacing w:after="60"/>
       </w:pPr>
@@ -2770,49 +3060,10 @@
           <w:b/>
           <w:bCs/>
         </w:rPr>
-        <w:t xml:space="preserve">A senha precisa ter</w:t>
-      </w:r>
-      <w:r>
-        <w:t xml:space="preserve"> pelo menos 6 caracteres, um número e um caractere especial (por exemplo, </w:t>
-      </w:r>
-      <w:r>
-        <w:rPr>
-          <w:rFonts w:ascii="Consolas" w:cs="Consolas" w:eastAsia="Consolas" w:hAnsi="Consolas"/>
-          <w:color w:val="6A1BBF"/>
-          <w:sz w:val="18"/>
-          <w:szCs w:val="18"/>
-          <w:shd w:fill="F1ECFB" w:color="auto" w:val="clear"/>
-        </w:rPr>
-        <w:t xml:space="preserve">!</w:t>
-      </w:r>
-      <w:r>
-        <w:t xml:space="preserve">, </w:t>
-      </w:r>
-      <w:r>
-        <w:rPr>
-          <w:rFonts w:ascii="Consolas" w:cs="Consolas" w:eastAsia="Consolas" w:hAnsi="Consolas"/>
-          <w:color w:val="6A1BBF"/>
-          <w:sz w:val="18"/>
-          <w:szCs w:val="18"/>
-          <w:shd w:fill="F1ECFB" w:color="auto" w:val="clear"/>
-        </w:rPr>
-        <w:t xml:space="preserve">@</w:t>
-      </w:r>
-      <w:r>
-        <w:t xml:space="preserve">, </w:t>
-      </w:r>
-      <w:r>
-        <w:rPr>
-          <w:rFonts w:ascii="Consolas" w:cs="Consolas" w:eastAsia="Consolas" w:hAnsi="Consolas"/>
-          <w:color w:val="6A1BBF"/>
-          <w:sz w:val="18"/>
-          <w:szCs w:val="18"/>
-          <w:shd w:fill="F1ECFB" w:color="auto" w:val="clear"/>
-        </w:rPr>
-        <w:t xml:space="preserve">#</w:t>
-      </w:r>
-      <w:r>
-        <w:t xml:space="preserve">).</w:t>
+        <w:t xml:space="preserve">Um pedido aberto por paciente.</w:t>
+      </w:r>
+      <w:r>
+        <w:t xml:space="preserve"> Se já existe um, o painel avisa.</w:t>
       </w:r>
     </w:p>
     <w:p>
@@ -2820,7 +3071,7 @@
         <w:pStyle w:val="ListParagraph"/>
         <w:numPr>
           <w:ilvl w:val="0"/>
-          <w:numId w:val="3"/>
+          <w:numId w:val="4"/>
         </w:numPr>
         <w:spacing w:after="60"/>
       </w:pPr>
@@ -2829,10 +3080,10 @@
           <w:b/>
           <w:bCs/>
         </w:rPr>
-        <w:t xml:space="preserve">Depois de 5 senhas erradas seguidas,</w:t>
-      </w:r>
-      <w:r>
-        <w:t xml:space="preserve"> o login fica travado por 15 minutos.</w:t>
+        <w:t xml:space="preserve">Uma falta nova invalida o pedido.</w:t>
+      </w:r>
+      <w:r>
+        <w:t xml:space="preserve"> O pedido vale para a falta de quando foi aberto; com uma falta nova, é preciso pedir de novo.</w:t>
       </w:r>
     </w:p>
     <w:p>
@@ -2846,264 +3097,27 @@
       </w:pPr>
       <w:bookmarkStart w:name="_Toc11" w:id="11"/>
       <w:r>
-        <w:t xml:space="preserve">Garantias do sistema</w:t>
+        <w:t xml:space="preserve">Quem pode fazer o quê no painel</w:t>
       </w:r>
       <w:bookmarkEnd w:id="11"/>
     </w:p>
     <w:p>
       <w:pPr>
-        <w:pStyle w:val="ListParagraph"/>
-        <w:numPr>
-          <w:ilvl w:val="0"/>
-          <w:numId w:val="3"/>
-        </w:numPr>
-        <w:spacing w:after="60"/>
-      </w:pPr>
+        <w:spacing w:after="120"/>
+      </w:pPr>
+      <w:r>
+        <w:t xml:space="preserve">Cada pessoa tem o </w:t>
+      </w:r>
       <w:r>
         <w:rPr>
           <w:b/>
           <w:bCs/>
         </w:rPr>
-        <w:t xml:space="preserve">Rastreabilidade:</w:t>
-      </w:r>
-      <w:r>
-        <w:t xml:space="preserve"> todo bloqueio e toda liberação ficam registrados para sempre, com quem fez, quando, por quê e o que o CNN respondeu.</w:t>
-      </w:r>
-    </w:p>
-    <w:p>
-      <w:pPr>
-        <w:pStyle w:val="ListParagraph"/>
-        <w:numPr>
-          <w:ilvl w:val="0"/>
-          <w:numId w:val="3"/>
-        </w:numPr>
-        <w:spacing w:after="60"/>
-      </w:pPr>
-      <w:r>
-        <w:rPr>
-          <w:b/>
-          <w:bCs/>
-        </w:rPr>
-        <w:t xml:space="preserve">Ninguém é liberado sozinho:</w:t>
-      </w:r>
-      <w:r>
-        <w:t xml:space="preserve"> a liberação automática foi desligada. Sempre há uma pessoa e um motivo.</w:t>
-      </w:r>
-    </w:p>
-    <w:p>
-      <w:pPr>
-        <w:pStyle w:val="ListParagraph"/>
-        <w:numPr>
-          <w:ilvl w:val="0"/>
-          <w:numId w:val="3"/>
-        </w:numPr>
-        <w:spacing w:after="60"/>
-      </w:pPr>
-      <w:r>
-        <w:rPr>
-          <w:b/>
-          <w:bCs/>
-        </w:rPr>
-        <w:t xml:space="preserve">Uma liberação feita no painel é respeitada:</w:t>
-      </w:r>
-      <w:r>
-        <w:t xml:space="preserve"> a automação das 01:00 não bloqueia de novo pela mesma falta. Só uma falta nova bloqueia outra vez.</w:t>
-      </w:r>
-    </w:p>
-    <w:p>
-      <w:pPr>
-        <w:pStyle w:val="ListParagraph"/>
-        <w:numPr>
-          <w:ilvl w:val="0"/>
-          <w:numId w:val="3"/>
-        </w:numPr>
-        <w:spacing w:after="60"/>
-      </w:pPr>
-      <w:r>
-        <w:rPr>
-          <w:b/>
-          <w:bCs/>
-        </w:rPr>
-        <w:t xml:space="preserve">Proteção de dados (LGPD):</w:t>
-      </w:r>
-      <w:r>
-        <w:t xml:space="preserve"> o painel mostra só o necessário. O CPF aparece mascarado, e telefone e e-mail não aparecem. Os dados ficam guardados só na aba do navegador e somem ao fechá-la.</w:t>
-      </w:r>
-    </w:p>
-    <w:p>
-      <w:pPr>
-        <w:pStyle w:val="ListParagraph"/>
-        <w:numPr>
-          <w:ilvl w:val="0"/>
-          <w:numId w:val="3"/>
-        </w:numPr>
-        <w:spacing w:after="60"/>
-      </w:pPr>
-      <w:r>
-        <w:rPr>
-          <w:b/>
-          <w:bCs/>
-        </w:rPr>
-        <w:t xml:space="preserve">Rapidez:</w:t>
-      </w:r>
-      <w:r>
-        <w:t xml:space="preserve"> ao entrar, o painel prepara todas as telas de uma vez. Depois disso, a navegação entre as telas é instantânea.</w:t>
-      </w:r>
-    </w:p>
-    <w:p>
-      <w:pPr>
-        <w:spacing w:after="60"/>
-      </w:pPr>
-    </w:p>
-    <w:p>
-      <w:pPr>
-        <w:pStyle w:val="Heading2"/>
-      </w:pPr>
-      <w:bookmarkStart w:name="_Toc12" w:id="12"/>
-      <w:r>
-        <w:t xml:space="preserve">Perguntas frequentes</w:t>
-      </w:r>
-      <w:bookmarkEnd w:id="12"/>
-    </w:p>
-    <w:p>
-      <w:pPr>
-        <w:spacing w:after="120"/>
-      </w:pPr>
-      <w:r>
-        <w:rPr>
-          <w:b/>
-          <w:bCs/>
-        </w:rPr>
-        <w:t xml:space="preserve">Um paciente foi liberado pelo painel e voltou a ser bloqueado. Por quê?</w:t>
-      </w:r>
-      <w:r>
-        <w:t xml:space="preserve">
-Ele faltou de novo. Uma falta nova inicia um novo bloqueio, com prazo maior. O detalhe do paciente mostra a falta nova.</w:t>
-      </w:r>
-    </w:p>
-    <w:p>
-      <w:pPr>
-        <w:spacing w:after="120"/>
-      </w:pPr>
-      <w:r>
-        <w:rPr>
-          <w:b/>
-          <w:bCs/>
-        </w:rPr>
-        <w:t xml:space="preserve">Alguém liberou o paciente direto no CNN, e não pelo painel. O que acontece?</w:t>
-      </w:r>
-      <w:r>
-        <w:t xml:space="preserve">
-Na madrugada seguinte, a automação bloqueia de novo, porque não houve liberação registrada no painel. Por isso as liberações devem ser feitas </w:t>
-      </w:r>
-      <w:r>
-        <w:rPr>
-          <w:b/>
-          <w:bCs/>
-        </w:rPr>
-        <w:t xml:space="preserve">sempre pelo painel</w:t>
-      </w:r>
-      <w:r>
-        <w:t xml:space="preserve">. Se isso já aconteceu, o detalhe do paciente mostra a diferença e oferece o botão </w:t>
-      </w:r>
-      <w:r>
-        <w:rPr>
-          <w:b/>
-          <w:bCs/>
-        </w:rPr>
-        <w:t xml:space="preserve">Registrar liberação feita no CNN</w:t>
-      </w:r>
-      <w:r>
-        <w:t xml:space="preserve">.</w:t>
-      </w:r>
-    </w:p>
-    <w:p>
-      <w:pPr>
-        <w:spacing w:after="120"/>
-      </w:pPr>
-      <w:r>
-        <w:rPr>
-          <w:b/>
-          <w:bCs/>
-        </w:rPr>
-        <w:t xml:space="preserve">O paciente tem atestado. Posso liberar antes do prazo?</w:t>
-      </w:r>
-      <w:r>
-        <w:t xml:space="preserve">
-Sim. Clique em </w:t>
-      </w:r>
-      <w:r>
-        <w:rPr>
-          <w:b/>
-          <w:bCs/>
-        </w:rPr>
-        <w:t xml:space="preserve">Liberar</w:t>
-      </w:r>
-      <w:r>
-        <w:t xml:space="preserve"> e escreva o motivo (por exemplo, "falta justificada com atestado"). A liberação fica marcada como "antes do prazo" no histórico.</w:t>
-      </w:r>
-    </w:p>
-    <w:p>
-      <w:pPr>
-        <w:spacing w:after="120"/>
-      </w:pPr>
-      <w:r>
-        <w:rPr>
-          <w:b/>
-          <w:bCs/>
-        </w:rPr>
-        <w:t xml:space="preserve">A falta foi lançada por engano. Como desfazer?</w:t>
-      </w:r>
-      <w:r>
-        <w:t xml:space="preserve">
-Se o paciente ainda não foi bloqueado, abra o detalhe e use </w:t>
-      </w:r>
-      <w:r>
-        <w:rPr>
-          <w:b/>
-          <w:bCs/>
-        </w:rPr>
-        <w:t xml:space="preserve">Isentar esta falta</w:t>
-      </w:r>
-      <w:r>
-        <w:t xml:space="preserve">. A automação deixa de considerar essa falta. Se ele já foi bloqueado, use </w:t>
-      </w:r>
-      <w:r>
-        <w:rPr>
-          <w:b/>
-          <w:bCs/>
-        </w:rPr>
-        <w:t xml:space="preserve">Liberar</w:t>
-      </w:r>
-      <w:r>
-        <w:t xml:space="preserve"> com o motivo "falta lançada por engano".</w:t>
-      </w:r>
-    </w:p>
-    <w:p>
-      <w:pPr>
-        <w:spacing w:after="120"/>
-      </w:pPr>
-      <w:r>
-        <w:rPr>
-          <w:b/>
-          <w:bCs/>
-        </w:rPr>
-        <w:t xml:space="preserve">O que muda em 1º de outubro?</w:t>
-      </w:r>
-      <w:r>
-        <w:t xml:space="preserve">
-Começa um novo ciclo: a contagem de faltas zera. Quem ainda estiver bloqueado por falta do ciclo anterior continua na lista, marcado como "ciclo anterior", até ser liberado.</w:t>
-      </w:r>
-    </w:p>
-    <w:p>
-      <w:pPr>
-        <w:pStyle w:val="Heading2"/>
-      </w:pPr>
-      <w:bookmarkStart w:name="_Toc13" w:id="13"/>
-      <w:r>
-        <w:t xml:space="preserve">Glossário</w:t>
-      </w:r>
-      <w:bookmarkEnd w:id="13"/>
+        <w:t xml:space="preserve">próprio login e senha</w:t>
+      </w:r>
+      <w:r>
+        <w:t xml:space="preserve">. Nada de usuário compartilhado: o histórico mostra o nome de quem fez cada ação.</w:t>
+      </w:r>
     </w:p>
     <w:tbl>
       <w:tblPr>
@@ -3119,8 +3133,12 @@
         <w:tblLayout w:type="fixed"/>
       </w:tblPr>
       <w:tblGrid>
-        <w:gridCol w:w="2548"/>
-        <w:gridCol w:w="7090"/>
+        <w:gridCol w:w="613"/>
+        <w:gridCol w:w="1105"/>
+        <w:gridCol w:w="1486"/>
+        <w:gridCol w:w="3464"/>
+        <w:gridCol w:w="1336"/>
+        <w:gridCol w:w="1634"/>
       </w:tblGrid>
       <w:tr>
         <w:trPr>
@@ -3128,7 +3146,7 @@
         </w:trPr>
         <w:tc>
           <w:tcPr>
-            <w:tcW w:type="dxa" w:w="2548"/>
+            <w:tcW w:type="dxa" w:w="613"/>
             <w:shd w:fill="1C1FC8" w:color="auto" w:val="clear"/>
             <w:tcMar>
               <w:top w:type="dxa" w:w="60"/>
@@ -3147,13 +3165,13 @@
                 <w:bCs/>
                 <w:color w:val="FFFFFF"/>
               </w:rPr>
-              <w:t xml:space="preserve">Termo</w:t>
-            </w:r>
-          </w:p>
-        </w:tc>
-        <w:tc>
-          <w:tcPr>
-            <w:tcW w:type="dxa" w:w="7090"/>
+              <w:t xml:space="preserve">Perfil</w:t>
+            </w:r>
+          </w:p>
+        </w:tc>
+        <w:tc>
+          <w:tcPr>
+            <w:tcW w:type="dxa" w:w="1105"/>
             <w:shd w:fill="1C1FC8" w:color="auto" w:val="clear"/>
             <w:tcMar>
               <w:top w:type="dxa" w:w="60"/>
@@ -3172,7 +3190,107 @@
                 <w:bCs/>
                 <w:color w:val="FFFFFF"/>
               </w:rPr>
-              <w:t xml:space="preserve">Significado</w:t>
+              <w:t xml:space="preserve">Ver as telas</w:t>
+            </w:r>
+          </w:p>
+        </w:tc>
+        <w:tc>
+          <w:tcPr>
+            <w:tcW w:type="dxa" w:w="1486"/>
+            <w:shd w:fill="1C1FC8" w:color="auto" w:val="clear"/>
+            <w:tcMar>
+              <w:top w:type="dxa" w:w="60"/>
+              <w:left w:type="dxa" w:w="100"/>
+              <w:bottom w:type="dxa" w:w="60"/>
+              <w:right w:type="dxa" w:w="100"/>
+            </w:tcMar>
+          </w:tcPr>
+          <w:p>
+            <w:pPr>
+              <w:spacing w:after="40" w:before="40"/>
+            </w:pPr>
+            <w:r>
+              <w:rPr>
+                <w:b/>
+                <w:bCs/>
+                <w:color w:val="FFFFFF"/>
+              </w:rPr>
+              <w:t xml:space="preserve">Pedir desbloqueio</w:t>
+            </w:r>
+          </w:p>
+        </w:tc>
+        <w:tc>
+          <w:tcPr>
+            <w:tcW w:type="dxa" w:w="3464"/>
+            <w:shd w:fill="1C1FC8" w:color="auto" w:val="clear"/>
+            <w:tcMar>
+              <w:top w:type="dxa" w:w="60"/>
+              <w:left w:type="dxa" w:w="100"/>
+              <w:bottom w:type="dxa" w:w="60"/>
+              <w:right w:type="dxa" w:w="100"/>
+            </w:tcMar>
+          </w:tcPr>
+          <w:p>
+            <w:pPr>
+              <w:spacing w:after="40" w:before="40"/>
+            </w:pPr>
+            <w:r>
+              <w:rPr>
+                <w:b/>
+                <w:bCs/>
+                <w:color w:val="FFFFFF"/>
+              </w:rPr>
+              <w:t xml:space="preserve">Liberar e bloquear</w:t>
+            </w:r>
+          </w:p>
+        </w:tc>
+        <w:tc>
+          <w:tcPr>
+            <w:tcW w:type="dxa" w:w="1336"/>
+            <w:shd w:fill="1C1FC8" w:color="auto" w:val="clear"/>
+            <w:tcMar>
+              <w:top w:type="dxa" w:w="60"/>
+              <w:left w:type="dxa" w:w="100"/>
+              <w:bottom w:type="dxa" w:w="60"/>
+              <w:right w:type="dxa" w:w="100"/>
+            </w:tcMar>
+          </w:tcPr>
+          <w:p>
+            <w:pPr>
+              <w:spacing w:after="40" w:before="40"/>
+            </w:pPr>
+            <w:r>
+              <w:rPr>
+                <w:b/>
+                <w:bCs/>
+                <w:color w:val="FFFFFF"/>
+              </w:rPr>
+              <w:t xml:space="preserve">Aprovar pedidos</w:t>
+            </w:r>
+          </w:p>
+        </w:tc>
+        <w:tc>
+          <w:tcPr>
+            <w:tcW w:type="dxa" w:w="1634"/>
+            <w:shd w:fill="1C1FC8" w:color="auto" w:val="clear"/>
+            <w:tcMar>
+              <w:top w:type="dxa" w:w="60"/>
+              <w:left w:type="dxa" w:w="100"/>
+              <w:bottom w:type="dxa" w:w="60"/>
+              <w:right w:type="dxa" w:w="100"/>
+            </w:tcMar>
+          </w:tcPr>
+          <w:p>
+            <w:pPr>
+              <w:spacing w:after="40" w:before="40"/>
+            </w:pPr>
+            <w:r>
+              <w:rPr>
+                <w:b/>
+                <w:bCs/>
+                <w:color w:val="FFFFFF"/>
+              </w:rPr>
+              <w:t xml:space="preserve">Cuidar dos usuários</w:t>
             </w:r>
           </w:p>
         </w:tc>
@@ -3183,43 +3301,119 @@
         </w:trPr>
         <w:tc>
           <w:tcPr>
-            <w:tcW w:type="dxa" w:w="2548"/>
-            <w:tcMar>
-              <w:top w:type="dxa" w:w="60"/>
-              <w:left w:type="dxa" w:w="100"/>
-              <w:bottom w:type="dxa" w:w="60"/>
-              <w:right w:type="dxa" w:w="100"/>
-            </w:tcMar>
-          </w:tcPr>
-          <w:p>
-            <w:pPr>
-              <w:spacing w:after="40" w:before="40"/>
-            </w:pPr>
-            <w:r>
-              <w:rPr>
-                <w:b/>
-                <w:bCs/>
-              </w:rPr>
-              <w:t xml:space="preserve">CNN</w:t>
-            </w:r>
-          </w:p>
-        </w:tc>
-        <w:tc>
-          <w:tcPr>
-            <w:tcW w:type="dxa" w:w="7090"/>
-            <w:tcMar>
-              <w:top w:type="dxa" w:w="60"/>
-              <w:left w:type="dxa" w:w="100"/>
-              <w:bottom w:type="dxa" w:w="60"/>
-              <w:right w:type="dxa" w:w="100"/>
-            </w:tcMar>
-          </w:tcPr>
-          <w:p>
-            <w:pPr>
-              <w:spacing w:after="40" w:before="40"/>
-            </w:pPr>
-            <w:r>
-              <w:t xml:space="preserve">Clínica nas Nuvens, o sistema de agenda e cadastro da clínica</w:t>
+            <w:tcW w:type="dxa" w:w="613"/>
+            <w:tcMar>
+              <w:top w:type="dxa" w:w="60"/>
+              <w:left w:type="dxa" w:w="100"/>
+              <w:bottom w:type="dxa" w:w="60"/>
+              <w:right w:type="dxa" w:w="100"/>
+            </w:tcMar>
+          </w:tcPr>
+          <w:p>
+            <w:pPr>
+              <w:spacing w:after="40" w:before="40"/>
+            </w:pPr>
+            <w:r>
+              <w:rPr>
+                <w:b/>
+                <w:bCs/>
+              </w:rPr>
+              <w:t xml:space="preserve">Leitor</w:t>
+            </w:r>
+          </w:p>
+        </w:tc>
+        <w:tc>
+          <w:tcPr>
+            <w:tcW w:type="dxa" w:w="1105"/>
+            <w:tcMar>
+              <w:top w:type="dxa" w:w="60"/>
+              <w:left w:type="dxa" w:w="100"/>
+              <w:bottom w:type="dxa" w:w="60"/>
+              <w:right w:type="dxa" w:w="100"/>
+            </w:tcMar>
+          </w:tcPr>
+          <w:p>
+            <w:pPr>
+              <w:spacing w:after="40" w:before="40"/>
+            </w:pPr>
+            <w:r>
+              <w:t xml:space="preserve">Sim</w:t>
+            </w:r>
+          </w:p>
+        </w:tc>
+        <w:tc>
+          <w:tcPr>
+            <w:tcW w:type="dxa" w:w="1486"/>
+            <w:tcMar>
+              <w:top w:type="dxa" w:w="60"/>
+              <w:left w:type="dxa" w:w="100"/>
+              <w:bottom w:type="dxa" w:w="60"/>
+              <w:right w:type="dxa" w:w="100"/>
+            </w:tcMar>
+          </w:tcPr>
+          <w:p>
+            <w:pPr>
+              <w:spacing w:after="40" w:before="40"/>
+            </w:pPr>
+            <w:r>
+              <w:t xml:space="preserve">Sim</w:t>
+            </w:r>
+          </w:p>
+        </w:tc>
+        <w:tc>
+          <w:tcPr>
+            <w:tcW w:type="dxa" w:w="3464"/>
+            <w:tcMar>
+              <w:top w:type="dxa" w:w="60"/>
+              <w:left w:type="dxa" w:w="100"/>
+              <w:bottom w:type="dxa" w:w="60"/>
+              <w:right w:type="dxa" w:w="100"/>
+            </w:tcMar>
+          </w:tcPr>
+          <w:p>
+            <w:pPr>
+              <w:spacing w:after="40" w:before="40"/>
+            </w:pPr>
+            <w:r>
+              <w:t xml:space="preserve">Não</w:t>
+            </w:r>
+          </w:p>
+        </w:tc>
+        <w:tc>
+          <w:tcPr>
+            <w:tcW w:type="dxa" w:w="1336"/>
+            <w:tcMar>
+              <w:top w:type="dxa" w:w="60"/>
+              <w:left w:type="dxa" w:w="100"/>
+              <w:bottom w:type="dxa" w:w="60"/>
+              <w:right w:type="dxa" w:w="100"/>
+            </w:tcMar>
+          </w:tcPr>
+          <w:p>
+            <w:pPr>
+              <w:spacing w:after="40" w:before="40"/>
+            </w:pPr>
+            <w:r>
+              <w:t xml:space="preserve">Não</w:t>
+            </w:r>
+          </w:p>
+        </w:tc>
+        <w:tc>
+          <w:tcPr>
+            <w:tcW w:type="dxa" w:w="1634"/>
+            <w:tcMar>
+              <w:top w:type="dxa" w:w="60"/>
+              <w:left w:type="dxa" w:w="100"/>
+              <w:bottom w:type="dxa" w:w="60"/>
+              <w:right w:type="dxa" w:w="100"/>
+            </w:tcMar>
+          </w:tcPr>
+          <w:p>
+            <w:pPr>
+              <w:spacing w:after="40" w:before="40"/>
+            </w:pPr>
+            <w:r>
+              <w:t xml:space="preserve">Não</w:t>
             </w:r>
           </w:p>
         </w:tc>
@@ -3230,7 +3424,7 @@
         </w:trPr>
         <w:tc>
           <w:tcPr>
-            <w:tcW w:type="dxa" w:w="2548"/>
+            <w:tcW w:type="dxa" w:w="613"/>
             <w:shd w:fill="F6F4FE" w:color="auto" w:val="clear"/>
             <w:tcMar>
               <w:top w:type="dxa" w:w="60"/>
@@ -3248,13 +3442,13 @@
                 <w:b/>
                 <w:bCs/>
               </w:rPr>
-              <w:t xml:space="preserve">Falta</w:t>
-            </w:r>
-          </w:p>
-        </w:tc>
-        <w:tc>
-          <w:tcPr>
-            <w:tcW w:type="dxa" w:w="7090"/>
+              <w:t xml:space="preserve">Editor</w:t>
+            </w:r>
+          </w:p>
+        </w:tc>
+        <w:tc>
+          <w:tcPr>
+            <w:tcW w:type="dxa" w:w="1105"/>
             <w:shd w:fill="F6F4FE" w:color="auto" w:val="clear"/>
             <w:tcMar>
               <w:top w:type="dxa" w:w="60"/>
@@ -3268,17 +3462,87 @@
               <w:spacing w:after="40" w:before="40"/>
             </w:pPr>
             <w:r>
-              <w:t xml:space="preserve">Atendimento marcado como </w:t>
-            </w:r>
-            <w:r>
-              <w:rPr>
-                <w:b/>
-                <w:bCs/>
-              </w:rPr>
-              <w:t xml:space="preserve">FALTOU</w:t>
-            </w:r>
-            <w:r>
-              <w:t xml:space="preserve"> no CNN</w:t>
+              <w:t xml:space="preserve">Sim</w:t>
+            </w:r>
+          </w:p>
+        </w:tc>
+        <w:tc>
+          <w:tcPr>
+            <w:tcW w:type="dxa" w:w="1486"/>
+            <w:shd w:fill="F6F4FE" w:color="auto" w:val="clear"/>
+            <w:tcMar>
+              <w:top w:type="dxa" w:w="60"/>
+              <w:left w:type="dxa" w:w="100"/>
+              <w:bottom w:type="dxa" w:w="60"/>
+              <w:right w:type="dxa" w:w="100"/>
+            </w:tcMar>
+          </w:tcPr>
+          <w:p>
+            <w:pPr>
+              <w:spacing w:after="40" w:before="40"/>
+            </w:pPr>
+            <w:r>
+              <w:t xml:space="preserve">Sim</w:t>
+            </w:r>
+          </w:p>
+        </w:tc>
+        <w:tc>
+          <w:tcPr>
+            <w:tcW w:type="dxa" w:w="3464"/>
+            <w:shd w:fill="F6F4FE" w:color="auto" w:val="clear"/>
+            <w:tcMar>
+              <w:top w:type="dxa" w:w="60"/>
+              <w:left w:type="dxa" w:w="100"/>
+              <w:bottom w:type="dxa" w:w="60"/>
+              <w:right w:type="dxa" w:w="100"/>
+            </w:tcMar>
+          </w:tcPr>
+          <w:p>
+            <w:pPr>
+              <w:spacing w:after="40" w:before="40"/>
+            </w:pPr>
+            <w:r>
+              <w:t xml:space="preserve">Sim (pedidos aprovados e quem cumpriu o prazo)</w:t>
+            </w:r>
+          </w:p>
+        </w:tc>
+        <w:tc>
+          <w:tcPr>
+            <w:tcW w:type="dxa" w:w="1336"/>
+            <w:shd w:fill="F6F4FE" w:color="auto" w:val="clear"/>
+            <w:tcMar>
+              <w:top w:type="dxa" w:w="60"/>
+              <w:left w:type="dxa" w:w="100"/>
+              <w:bottom w:type="dxa" w:w="60"/>
+              <w:right w:type="dxa" w:w="100"/>
+            </w:tcMar>
+          </w:tcPr>
+          <w:p>
+            <w:pPr>
+              <w:spacing w:after="40" w:before="40"/>
+            </w:pPr>
+            <w:r>
+              <w:t xml:space="preserve">Não</w:t>
+            </w:r>
+          </w:p>
+        </w:tc>
+        <w:tc>
+          <w:tcPr>
+            <w:tcW w:type="dxa" w:w="1634"/>
+            <w:shd w:fill="F6F4FE" w:color="auto" w:val="clear"/>
+            <w:tcMar>
+              <w:top w:type="dxa" w:w="60"/>
+              <w:left w:type="dxa" w:w="100"/>
+              <w:bottom w:type="dxa" w:w="60"/>
+              <w:right w:type="dxa" w:w="100"/>
+            </w:tcMar>
+          </w:tcPr>
+          <w:p>
+            <w:pPr>
+              <w:spacing w:after="40" w:before="40"/>
+            </w:pPr>
+            <w:r>
+              <w:t xml:space="preserve">Não</w:t>
             </w:r>
           </w:p>
         </w:tc>
@@ -3289,43 +3553,612 @@
         </w:trPr>
         <w:tc>
           <w:tcPr>
-            <w:tcW w:type="dxa" w:w="2548"/>
-            <w:tcMar>
-              <w:top w:type="dxa" w:w="60"/>
-              <w:left w:type="dxa" w:w="100"/>
-              <w:bottom w:type="dxa" w:w="60"/>
-              <w:right w:type="dxa" w:w="100"/>
-            </w:tcMar>
-          </w:tcPr>
-          <w:p>
-            <w:pPr>
-              <w:spacing w:after="40" w:before="40"/>
-            </w:pPr>
-            <w:r>
-              <w:rPr>
-                <w:b/>
-                <w:bCs/>
-              </w:rPr>
-              <w:t xml:space="preserve">Ciclo</w:t>
-            </w:r>
-          </w:p>
-        </w:tc>
-        <w:tc>
-          <w:tcPr>
-            <w:tcW w:type="dxa" w:w="7090"/>
-            <w:tcMar>
-              <w:top w:type="dxa" w:w="60"/>
-              <w:left w:type="dxa" w:w="100"/>
-              <w:bottom w:type="dxa" w:w="60"/>
-              <w:right w:type="dxa" w:w="100"/>
-            </w:tcMar>
-          </w:tcPr>
-          <w:p>
-            <w:pPr>
-              <w:spacing w:after="40" w:before="40"/>
-            </w:pPr>
-            <w:r>
-              <w:t xml:space="preserve">Período de contagem das faltas. Começa todo 1º de outubro</w:t>
+            <w:tcW w:type="dxa" w:w="613"/>
+            <w:tcMar>
+              <w:top w:type="dxa" w:w="60"/>
+              <w:left w:type="dxa" w:w="100"/>
+              <w:bottom w:type="dxa" w:w="60"/>
+              <w:right w:type="dxa" w:w="100"/>
+            </w:tcMar>
+          </w:tcPr>
+          <w:p>
+            <w:pPr>
+              <w:spacing w:after="40" w:before="40"/>
+            </w:pPr>
+            <w:r>
+              <w:rPr>
+                <w:b/>
+                <w:bCs/>
+              </w:rPr>
+              <w:t xml:space="preserve">Admin</w:t>
+            </w:r>
+          </w:p>
+        </w:tc>
+        <w:tc>
+          <w:tcPr>
+            <w:tcW w:type="dxa" w:w="1105"/>
+            <w:tcMar>
+              <w:top w:type="dxa" w:w="60"/>
+              <w:left w:type="dxa" w:w="100"/>
+              <w:bottom w:type="dxa" w:w="60"/>
+              <w:right w:type="dxa" w:w="100"/>
+            </w:tcMar>
+          </w:tcPr>
+          <w:p>
+            <w:pPr>
+              <w:spacing w:after="40" w:before="40"/>
+            </w:pPr>
+            <w:r>
+              <w:t xml:space="preserve">Sim</w:t>
+            </w:r>
+          </w:p>
+        </w:tc>
+        <w:tc>
+          <w:tcPr>
+            <w:tcW w:type="dxa" w:w="1486"/>
+            <w:tcMar>
+              <w:top w:type="dxa" w:w="60"/>
+              <w:left w:type="dxa" w:w="100"/>
+              <w:bottom w:type="dxa" w:w="60"/>
+              <w:right w:type="dxa" w:w="100"/>
+            </w:tcMar>
+          </w:tcPr>
+          <w:p>
+            <w:pPr>
+              <w:spacing w:after="40" w:before="40"/>
+            </w:pPr>
+            <w:r>
+              <w:t xml:space="preserve">Sim</w:t>
+            </w:r>
+          </w:p>
+        </w:tc>
+        <w:tc>
+          <w:tcPr>
+            <w:tcW w:type="dxa" w:w="3464"/>
+            <w:tcMar>
+              <w:top w:type="dxa" w:w="60"/>
+              <w:left w:type="dxa" w:w="100"/>
+              <w:bottom w:type="dxa" w:w="60"/>
+              <w:right w:type="dxa" w:w="100"/>
+            </w:tcMar>
+          </w:tcPr>
+          <w:p>
+            <w:pPr>
+              <w:spacing w:after="40" w:before="40"/>
+            </w:pPr>
+            <w:r>
+              <w:t xml:space="preserve">Sim</w:t>
+            </w:r>
+          </w:p>
+        </w:tc>
+        <w:tc>
+          <w:tcPr>
+            <w:tcW w:type="dxa" w:w="1336"/>
+            <w:tcMar>
+              <w:top w:type="dxa" w:w="60"/>
+              <w:left w:type="dxa" w:w="100"/>
+              <w:bottom w:type="dxa" w:w="60"/>
+              <w:right w:type="dxa" w:w="100"/>
+            </w:tcMar>
+          </w:tcPr>
+          <w:p>
+            <w:pPr>
+              <w:spacing w:after="40" w:before="40"/>
+            </w:pPr>
+            <w:r>
+              <w:t xml:space="preserve">Sim</w:t>
+            </w:r>
+          </w:p>
+        </w:tc>
+        <w:tc>
+          <w:tcPr>
+            <w:tcW w:type="dxa" w:w="1634"/>
+            <w:tcMar>
+              <w:top w:type="dxa" w:w="60"/>
+              <w:left w:type="dxa" w:w="100"/>
+              <w:bottom w:type="dxa" w:w="60"/>
+              <w:right w:type="dxa" w:w="100"/>
+            </w:tcMar>
+          </w:tcPr>
+          <w:p>
+            <w:pPr>
+              <w:spacing w:after="40" w:before="40"/>
+            </w:pPr>
+            <w:r>
+              <w:t xml:space="preserve">Sim</w:t>
+            </w:r>
+          </w:p>
+        </w:tc>
+      </w:tr>
+    </w:tbl>
+    <w:p>
+      <w:pPr>
+        <w:spacing w:after="120"/>
+      </w:pPr>
+    </w:p>
+    <w:p>
+      <w:pPr>
+        <w:pStyle w:val="ListParagraph"/>
+        <w:numPr>
+          <w:ilvl w:val="0"/>
+          <w:numId w:val="4"/>
+        </w:numPr>
+        <w:spacing w:after="60"/>
+      </w:pPr>
+      <w:r>
+        <w:rPr>
+          <w:b/>
+          <w:bCs/>
+        </w:rPr>
+        <w:t xml:space="preserve">No primeiro acesso,</w:t>
+      </w:r>
+      <w:r>
+        <w:t xml:space="preserve"> a pessoa entra com uma </w:t>
+      </w:r>
+      <w:r>
+        <w:rPr>
+          <w:b/>
+          <w:bCs/>
+        </w:rPr>
+        <w:t xml:space="preserve">senha temporária</w:t>
+      </w:r>
+      <w:r>
+        <w:t xml:space="preserve">, que o administrador repassa, e precisa criar a própria senha.</w:t>
+      </w:r>
+    </w:p>
+    <w:p>
+      <w:pPr>
+        <w:pStyle w:val="ListParagraph"/>
+        <w:numPr>
+          <w:ilvl w:val="0"/>
+          <w:numId w:val="4"/>
+        </w:numPr>
+        <w:spacing w:after="60"/>
+      </w:pPr>
+      <w:r>
+        <w:rPr>
+          <w:b/>
+          <w:bCs/>
+        </w:rPr>
+        <w:t xml:space="preserve">A senha precisa ter</w:t>
+      </w:r>
+      <w:r>
+        <w:t xml:space="preserve"> pelo menos 6 caracteres, um número e um caractere especial (por exemplo, </w:t>
+      </w:r>
+      <w:r>
+        <w:rPr>
+          <w:rFonts w:ascii="Consolas" w:cs="Consolas" w:eastAsia="Consolas" w:hAnsi="Consolas"/>
+          <w:color w:val="6A1BBF"/>
+          <w:sz w:val="18"/>
+          <w:szCs w:val="18"/>
+          <w:shd w:fill="F1ECFB" w:color="auto" w:val="clear"/>
+        </w:rPr>
+        <w:t xml:space="preserve">!</w:t>
+      </w:r>
+      <w:r>
+        <w:t xml:space="preserve">, </w:t>
+      </w:r>
+      <w:r>
+        <w:rPr>
+          <w:rFonts w:ascii="Consolas" w:cs="Consolas" w:eastAsia="Consolas" w:hAnsi="Consolas"/>
+          <w:color w:val="6A1BBF"/>
+          <w:sz w:val="18"/>
+          <w:szCs w:val="18"/>
+          <w:shd w:fill="F1ECFB" w:color="auto" w:val="clear"/>
+        </w:rPr>
+        <w:t xml:space="preserve">@</w:t>
+      </w:r>
+      <w:r>
+        <w:t xml:space="preserve">, </w:t>
+      </w:r>
+      <w:r>
+        <w:rPr>
+          <w:rFonts w:ascii="Consolas" w:cs="Consolas" w:eastAsia="Consolas" w:hAnsi="Consolas"/>
+          <w:color w:val="6A1BBF"/>
+          <w:sz w:val="18"/>
+          <w:szCs w:val="18"/>
+          <w:shd w:fill="F1ECFB" w:color="auto" w:val="clear"/>
+        </w:rPr>
+        <w:t xml:space="preserve">#</w:t>
+      </w:r>
+      <w:r>
+        <w:t xml:space="preserve">).</w:t>
+      </w:r>
+    </w:p>
+    <w:p>
+      <w:pPr>
+        <w:pStyle w:val="ListParagraph"/>
+        <w:numPr>
+          <w:ilvl w:val="0"/>
+          <w:numId w:val="4"/>
+        </w:numPr>
+        <w:spacing w:after="60"/>
+      </w:pPr>
+      <w:r>
+        <w:rPr>
+          <w:b/>
+          <w:bCs/>
+        </w:rPr>
+        <w:t xml:space="preserve">Depois de 5 senhas erradas seguidas,</w:t>
+      </w:r>
+      <w:r>
+        <w:t xml:space="preserve"> o login fica travado por 15 minutos.</w:t>
+      </w:r>
+    </w:p>
+    <w:p>
+      <w:pPr>
+        <w:spacing w:after="60"/>
+      </w:pPr>
+    </w:p>
+    <w:p>
+      <w:pPr>
+        <w:pStyle w:val="Heading2"/>
+      </w:pPr>
+      <w:bookmarkStart w:name="_Toc12" w:id="12"/>
+      <w:r>
+        <w:t xml:space="preserve">Garantias do sistema</w:t>
+      </w:r>
+      <w:bookmarkEnd w:id="12"/>
+    </w:p>
+    <w:p>
+      <w:pPr>
+        <w:pStyle w:val="ListParagraph"/>
+        <w:numPr>
+          <w:ilvl w:val="0"/>
+          <w:numId w:val="4"/>
+        </w:numPr>
+        <w:spacing w:after="60"/>
+      </w:pPr>
+      <w:r>
+        <w:rPr>
+          <w:b/>
+          <w:bCs/>
+        </w:rPr>
+        <w:t xml:space="preserve">Rastreabilidade:</w:t>
+      </w:r>
+      <w:r>
+        <w:t xml:space="preserve"> todo bloqueio, todo pedido e toda liberação ficam registrados, com quem fez, quando, por quê e o que o CNN respondeu.</w:t>
+      </w:r>
+    </w:p>
+    <w:p>
+      <w:pPr>
+        <w:pStyle w:val="ListParagraph"/>
+        <w:numPr>
+          <w:ilvl w:val="0"/>
+          <w:numId w:val="4"/>
+        </w:numPr>
+        <w:spacing w:after="60"/>
+      </w:pPr>
+      <w:r>
+        <w:rPr>
+          <w:b/>
+          <w:bCs/>
+        </w:rPr>
+        <w:t xml:space="preserve">Ninguém é liberado antes do prazo sem aprovação:</w:t>
+      </w:r>
+      <w:r>
+        <w:t xml:space="preserve"> liberar antes do fim do prazo exige um pedido aprovado pelo administrador. Depois do prazo, a automação libera sozinha.</w:t>
+      </w:r>
+    </w:p>
+    <w:p>
+      <w:pPr>
+        <w:pStyle w:val="ListParagraph"/>
+        <w:numPr>
+          <w:ilvl w:val="0"/>
+          <w:numId w:val="4"/>
+        </w:numPr>
+        <w:spacing w:after="60"/>
+      </w:pPr>
+      <w:r>
+        <w:rPr>
+          <w:b/>
+          <w:bCs/>
+        </w:rPr>
+        <w:t xml:space="preserve">Uma liberação feita no painel é respeitada:</w:t>
+      </w:r>
+      <w:r>
+        <w:t xml:space="preserve"> a automação das 01:00 não bloqueia de novo pela mesma falta. Só uma falta nova bloqueia outra vez.</w:t>
+      </w:r>
+    </w:p>
+    <w:p>
+      <w:pPr>
+        <w:pStyle w:val="ListParagraph"/>
+        <w:numPr>
+          <w:ilvl w:val="0"/>
+          <w:numId w:val="4"/>
+        </w:numPr>
+        <w:spacing w:after="60"/>
+      </w:pPr>
+      <w:r>
+        <w:rPr>
+          <w:b/>
+          <w:bCs/>
+        </w:rPr>
+        <w:t xml:space="preserve">A automação só reativa quem ela mesma bloqueou:</w:t>
+      </w:r>
+      <w:r>
+        <w:t xml:space="preserve"> um paciente inativo no CNN por outro motivo nunca é reativado.</w:t>
+      </w:r>
+    </w:p>
+    <w:p>
+      <w:pPr>
+        <w:pStyle w:val="ListParagraph"/>
+        <w:numPr>
+          <w:ilvl w:val="0"/>
+          <w:numId w:val="4"/>
+        </w:numPr>
+        <w:spacing w:after="60"/>
+      </w:pPr>
+      <w:r>
+        <w:rPr>
+          <w:b/>
+          <w:bCs/>
+        </w:rPr>
+        <w:t xml:space="preserve">Proteção de dados (LGPD):</w:t>
+      </w:r>
+      <w:r>
+        <w:t xml:space="preserve"> o painel mostra só o necessário. O CPF aparece mascarado, e telefone e e-mail não aparecem. Os dados ficam guardados só na aba do navegador e somem ao fechá-la.</w:t>
+      </w:r>
+    </w:p>
+    <w:p>
+      <w:pPr>
+        <w:pStyle w:val="ListParagraph"/>
+        <w:numPr>
+          <w:ilvl w:val="0"/>
+          <w:numId w:val="4"/>
+        </w:numPr>
+        <w:spacing w:after="60"/>
+      </w:pPr>
+      <w:r>
+        <w:rPr>
+          <w:b/>
+          <w:bCs/>
+        </w:rPr>
+        <w:t xml:space="preserve">Rapidez:</w:t>
+      </w:r>
+      <w:r>
+        <w:t xml:space="preserve"> ao entrar, o painel prepara todas as telas de uma vez. Depois disso, a navegação entre as telas é instantânea.</w:t>
+      </w:r>
+    </w:p>
+    <w:p>
+      <w:pPr>
+        <w:spacing w:after="60"/>
+      </w:pPr>
+    </w:p>
+    <w:p>
+      <w:pPr>
+        <w:pStyle w:val="Heading2"/>
+      </w:pPr>
+      <w:bookmarkStart w:name="_Toc13" w:id="13"/>
+      <w:r>
+        <w:t xml:space="preserve">Perguntas frequentes</w:t>
+      </w:r>
+      <w:bookmarkEnd w:id="13"/>
+    </w:p>
+    <w:p>
+      <w:pPr>
+        <w:spacing w:after="120"/>
+      </w:pPr>
+      <w:r>
+        <w:rPr>
+          <w:b/>
+          <w:bCs/>
+        </w:rPr>
+        <w:t xml:space="preserve">Um paciente foi liberado e voltou a ser bloqueado. Por quê?</w:t>
+      </w:r>
+      <w:r>
+        <w:t xml:space="preserve">
+Ele faltou de novo. Uma falta nova inicia um novo bloqueio, com prazo maior. O detalhe do paciente mostra a falta nova.</w:t>
+      </w:r>
+    </w:p>
+    <w:p>
+      <w:pPr>
+        <w:spacing w:after="120"/>
+      </w:pPr>
+      <w:r>
+        <w:rPr>
+          <w:b/>
+          <w:bCs/>
+        </w:rPr>
+        <w:t xml:space="preserve">Alguém liberou o paciente direto no CNN, e não pelo painel. O que acontece?</w:t>
+      </w:r>
+      <w:r>
+        <w:t xml:space="preserve">
+Se o prazo ainda corre, na madrugada seguinte a automação bloqueia de novo, porque não houve liberação aprovada. Por isso a liberação antes do prazo deve ser feita </w:t>
+      </w:r>
+      <w:r>
+        <w:rPr>
+          <w:b/>
+          <w:bCs/>
+        </w:rPr>
+        <w:t xml:space="preserve">sempre pelo painel</w:t>
+      </w:r>
+      <w:r>
+        <w:t xml:space="preserve">, com uma solicitação. Se o prazo já acabou, o painel oferece o botão </w:t>
+      </w:r>
+      <w:r>
+        <w:rPr>
+          <w:b/>
+          <w:bCs/>
+        </w:rPr>
+        <w:t xml:space="preserve">Registrar liberação feita no CNN</w:t>
+      </w:r>
+      <w:r>
+        <w:t xml:space="preserve">, e a automação das 02:00 também registra.</w:t>
+      </w:r>
+    </w:p>
+    <w:p>
+      <w:pPr>
+        <w:spacing w:after="120"/>
+      </w:pPr>
+      <w:r>
+        <w:rPr>
+          <w:b/>
+          <w:bCs/>
+        </w:rPr>
+        <w:t xml:space="preserve">O paciente tem atestado. Posso liberar antes do prazo?</w:t>
+      </w:r>
+      <w:r>
+        <w:t xml:space="preserve">
+Sim, pela solicitação. Clique em </w:t>
+      </w:r>
+      <w:r>
+        <w:rPr>
+          <w:b/>
+          <w:bCs/>
+        </w:rPr>
+        <w:t xml:space="preserve">Solicitar desbloqueio</w:t>
+      </w:r>
+      <w:r>
+        <w:t xml:space="preserve">, escreva o motivo (por exemplo, "falta justificada com atestado") e aguarde a aprovação do administrador. A liberação fica marcada como "antes do prazo" no histórico.</w:t>
+      </w:r>
+    </w:p>
+    <w:p>
+      <w:pPr>
+        <w:spacing w:after="120"/>
+      </w:pPr>
+      <w:r>
+        <w:rPr>
+          <w:b/>
+          <w:bCs/>
+        </w:rPr>
+        <w:t xml:space="preserve">A falta foi lançada por engano. Como desfazer?</w:t>
+      </w:r>
+      <w:r>
+        <w:t xml:space="preserve">
+Abra uma solicitação de desbloqueio com o motivo "falta lançada por engano". Se o paciente ainda não foi bloqueado, a aprovação </w:t>
+      </w:r>
+      <w:r>
+        <w:rPr>
+          <w:b/>
+          <w:bCs/>
+        </w:rPr>
+        <w:t xml:space="preserve">isenta a falta</w:t>
+      </w:r>
+      <w:r>
+        <w:t xml:space="preserve"> e a automação deixa de considerá-la. Se ele já foi bloqueado, a aprovação libera.</w:t>
+      </w:r>
+    </w:p>
+    <w:p>
+      <w:pPr>
+        <w:spacing w:after="120"/>
+      </w:pPr>
+      <w:r>
+        <w:rPr>
+          <w:b/>
+          <w:bCs/>
+        </w:rPr>
+        <w:t xml:space="preserve">Abri uma solicitação errada. E agora?</w:t>
+      </w:r>
+      <w:r>
+        <w:t xml:space="preserve">
+Na tela Solicitações, clique em </w:t>
+      </w:r>
+      <w:r>
+        <w:rPr>
+          <w:b/>
+          <w:bCs/>
+        </w:rPr>
+        <w:t xml:space="preserve">Cancelar</w:t>
+      </w:r>
+      <w:r>
+        <w:t xml:space="preserve"> na sua solicitação. Ela fica no histórico como cancelada.</w:t>
+      </w:r>
+    </w:p>
+    <w:p>
+      <w:pPr>
+        <w:spacing w:after="120"/>
+      </w:pPr>
+      <w:r>
+        <w:rPr>
+          <w:b/>
+          <w:bCs/>
+        </w:rPr>
+        <w:t xml:space="preserve">O que muda em 1º de outubro?</w:t>
+      </w:r>
+      <w:r>
+        <w:t xml:space="preserve">
+Começa um novo ciclo: a contagem de faltas zera. Quem ainda estiver bloqueado por falta do ciclo anterior continua na lista, marcado como "ciclo anterior", até o prazo terminar.</w:t>
+      </w:r>
+    </w:p>
+    <w:p>
+      <w:pPr>
+        <w:pStyle w:val="Heading2"/>
+      </w:pPr>
+      <w:bookmarkStart w:name="_Toc14" w:id="14"/>
+      <w:r>
+        <w:t xml:space="preserve">Glossário</w:t>
+      </w:r>
+      <w:bookmarkEnd w:id="14"/>
+    </w:p>
+    <w:tbl>
+      <w:tblPr>
+        <w:tblW w:type="dxa" w:w="9638"/>
+        <w:tblBorders>
+          <w:top w:val="single" w:color="D9D6EA" w:sz="4"/>
+          <w:left w:val="single" w:color="D9D6EA" w:sz="4"/>
+          <w:bottom w:val="single" w:color="D9D6EA" w:sz="4"/>
+          <w:right w:val="single" w:color="D9D6EA" w:sz="4"/>
+          <w:insideH w:val="single" w:color="D9D6EA" w:sz="4"/>
+          <w:insideV w:val="single" w:color="D9D6EA" w:sz="4"/>
+        </w:tblBorders>
+        <w:tblLayout w:type="fixed"/>
+      </w:tblPr>
+      <w:tblGrid>
+        <w:gridCol w:w="2902"/>
+        <w:gridCol w:w="6736"/>
+      </w:tblGrid>
+      <w:tr>
+        <w:trPr>
+          <w:tblHeader/>
+        </w:trPr>
+        <w:tc>
+          <w:tcPr>
+            <w:tcW w:type="dxa" w:w="2902"/>
+            <w:shd w:fill="1C1FC8" w:color="auto" w:val="clear"/>
+            <w:tcMar>
+              <w:top w:type="dxa" w:w="60"/>
+              <w:left w:type="dxa" w:w="100"/>
+              <w:bottom w:type="dxa" w:w="60"/>
+              <w:right w:type="dxa" w:w="100"/>
+            </w:tcMar>
+          </w:tcPr>
+          <w:p>
+            <w:pPr>
+              <w:spacing w:after="40" w:before="40"/>
+            </w:pPr>
+            <w:r>
+              <w:rPr>
+                <w:b/>
+                <w:bCs/>
+                <w:color w:val="FFFFFF"/>
+              </w:rPr>
+              <w:t xml:space="preserve">Termo</w:t>
+            </w:r>
+          </w:p>
+        </w:tc>
+        <w:tc>
+          <w:tcPr>
+            <w:tcW w:type="dxa" w:w="6736"/>
+            <w:shd w:fill="1C1FC8" w:color="auto" w:val="clear"/>
+            <w:tcMar>
+              <w:top w:type="dxa" w:w="60"/>
+              <w:left w:type="dxa" w:w="100"/>
+              <w:bottom w:type="dxa" w:w="60"/>
+              <w:right w:type="dxa" w:w="100"/>
+            </w:tcMar>
+          </w:tcPr>
+          <w:p>
+            <w:pPr>
+              <w:spacing w:after="40" w:before="40"/>
+            </w:pPr>
+            <w:r>
+              <w:rPr>
+                <w:b/>
+                <w:bCs/>
+                <w:color w:val="FFFFFF"/>
+              </w:rPr>
+              <w:t xml:space="preserve">Significado</w:t>
             </w:r>
           </w:p>
         </w:tc>
@@ -3336,45 +4169,43 @@
         </w:trPr>
         <w:tc>
           <w:tcPr>
-            <w:tcW w:type="dxa" w:w="2548"/>
-            <w:shd w:fill="F6F4FE" w:color="auto" w:val="clear"/>
-            <w:tcMar>
-              <w:top w:type="dxa" w:w="60"/>
-              <w:left w:type="dxa" w:w="100"/>
-              <w:bottom w:type="dxa" w:w="60"/>
-              <w:right w:type="dxa" w:w="100"/>
-            </w:tcMar>
-          </w:tcPr>
-          <w:p>
-            <w:pPr>
-              <w:spacing w:after="40" w:before="40"/>
-            </w:pPr>
-            <w:r>
-              <w:rPr>
-                <w:b/>
-                <w:bCs/>
-              </w:rPr>
-              <w:t xml:space="preserve">Falta vigente</w:t>
-            </w:r>
-          </w:p>
-        </w:tc>
-        <w:tc>
-          <w:tcPr>
-            <w:tcW w:type="dxa" w:w="7090"/>
-            <w:shd w:fill="F6F4FE" w:color="auto" w:val="clear"/>
-            <w:tcMar>
-              <w:top w:type="dxa" w:w="60"/>
-              <w:left w:type="dxa" w:w="100"/>
-              <w:bottom w:type="dxa" w:w="60"/>
-              <w:right w:type="dxa" w:w="100"/>
-            </w:tcMar>
-          </w:tcPr>
-          <w:p>
-            <w:pPr>
-              <w:spacing w:after="40" w:before="40"/>
-            </w:pPr>
-            <w:r>
-              <w:t xml:space="preserve">A falta mais recente do paciente no ciclo. É dela que conta o prazo</w:t>
+            <w:tcW w:type="dxa" w:w="2902"/>
+            <w:tcMar>
+              <w:top w:type="dxa" w:w="60"/>
+              <w:left w:type="dxa" w:w="100"/>
+              <w:bottom w:type="dxa" w:w="60"/>
+              <w:right w:type="dxa" w:w="100"/>
+            </w:tcMar>
+          </w:tcPr>
+          <w:p>
+            <w:pPr>
+              <w:spacing w:after="40" w:before="40"/>
+            </w:pPr>
+            <w:r>
+              <w:rPr>
+                <w:b/>
+                <w:bCs/>
+              </w:rPr>
+              <w:t xml:space="preserve">CNN</w:t>
+            </w:r>
+          </w:p>
+        </w:tc>
+        <w:tc>
+          <w:tcPr>
+            <w:tcW w:type="dxa" w:w="6736"/>
+            <w:tcMar>
+              <w:top w:type="dxa" w:w="60"/>
+              <w:left w:type="dxa" w:w="100"/>
+              <w:bottom w:type="dxa" w:w="60"/>
+              <w:right w:type="dxa" w:w="100"/>
+            </w:tcMar>
+          </w:tcPr>
+          <w:p>
+            <w:pPr>
+              <w:spacing w:after="40" w:before="40"/>
+            </w:pPr>
+            <w:r>
+              <w:t xml:space="preserve">Clínica nas Nuvens, o sistema de agenda e cadastro da clínica</w:t>
             </w:r>
           </w:p>
         </w:tc>
@@ -3385,43 +4216,55 @@
         </w:trPr>
         <w:tc>
           <w:tcPr>
-            <w:tcW w:type="dxa" w:w="2548"/>
-            <w:tcMar>
-              <w:top w:type="dxa" w:w="60"/>
-              <w:left w:type="dxa" w:w="100"/>
-              <w:bottom w:type="dxa" w:w="60"/>
-              <w:right w:type="dxa" w:w="100"/>
-            </w:tcMar>
-          </w:tcPr>
-          <w:p>
-            <w:pPr>
-              <w:spacing w:after="40" w:before="40"/>
-            </w:pPr>
-            <w:r>
-              <w:rPr>
-                <w:b/>
-                <w:bCs/>
-              </w:rPr>
-              <w:t xml:space="preserve">Prazo</w:t>
-            </w:r>
-          </w:p>
-        </w:tc>
-        <w:tc>
-          <w:tcPr>
-            <w:tcW w:type="dxa" w:w="7090"/>
-            <w:tcMar>
-              <w:top w:type="dxa" w:w="60"/>
-              <w:left w:type="dxa" w:w="100"/>
-              <w:bottom w:type="dxa" w:w="60"/>
-              <w:right w:type="dxa" w:w="100"/>
-            </w:tcMar>
-          </w:tcPr>
-          <w:p>
-            <w:pPr>
-              <w:spacing w:after="40" w:before="40"/>
-            </w:pPr>
-            <w:r>
-              <w:t xml:space="preserve">Tempo mínimo de bloqueio: 60, 90 ou 180 dias, conforme o número da falta</w:t>
+            <w:tcW w:type="dxa" w:w="2902"/>
+            <w:shd w:fill="F6F4FE" w:color="auto" w:val="clear"/>
+            <w:tcMar>
+              <w:top w:type="dxa" w:w="60"/>
+              <w:left w:type="dxa" w:w="100"/>
+              <w:bottom w:type="dxa" w:w="60"/>
+              <w:right w:type="dxa" w:w="100"/>
+            </w:tcMar>
+          </w:tcPr>
+          <w:p>
+            <w:pPr>
+              <w:spacing w:after="40" w:before="40"/>
+            </w:pPr>
+            <w:r>
+              <w:rPr>
+                <w:b/>
+                <w:bCs/>
+              </w:rPr>
+              <w:t xml:space="preserve">Falta</w:t>
+            </w:r>
+          </w:p>
+        </w:tc>
+        <w:tc>
+          <w:tcPr>
+            <w:tcW w:type="dxa" w:w="6736"/>
+            <w:shd w:fill="F6F4FE" w:color="auto" w:val="clear"/>
+            <w:tcMar>
+              <w:top w:type="dxa" w:w="60"/>
+              <w:left w:type="dxa" w:w="100"/>
+              <w:bottom w:type="dxa" w:w="60"/>
+              <w:right w:type="dxa" w:w="100"/>
+            </w:tcMar>
+          </w:tcPr>
+          <w:p>
+            <w:pPr>
+              <w:spacing w:after="40" w:before="40"/>
+            </w:pPr>
+            <w:r>
+              <w:t xml:space="preserve">Atendimento marcado como </w:t>
+            </w:r>
+            <w:r>
+              <w:rPr>
+                <w:b/>
+                <w:bCs/>
+              </w:rPr>
+              <w:t xml:space="preserve">FALTOU</w:t>
+            </w:r>
+            <w:r>
+              <w:t xml:space="preserve"> no CNN</w:t>
             </w:r>
           </w:p>
         </w:tc>
@@ -3432,45 +4275,43 @@
         </w:trPr>
         <w:tc>
           <w:tcPr>
-            <w:tcW w:type="dxa" w:w="2548"/>
-            <w:shd w:fill="F6F4FE" w:color="auto" w:val="clear"/>
-            <w:tcMar>
-              <w:top w:type="dxa" w:w="60"/>
-              <w:left w:type="dxa" w:w="100"/>
-              <w:bottom w:type="dxa" w:w="60"/>
-              <w:right w:type="dxa" w:w="100"/>
-            </w:tcMar>
-          </w:tcPr>
-          <w:p>
-            <w:pPr>
-              <w:spacing w:after="40" w:before="40"/>
-            </w:pPr>
-            <w:r>
-              <w:rPr>
-                <w:b/>
-                <w:bCs/>
-              </w:rPr>
-              <w:t xml:space="preserve">Bloquear</w:t>
-            </w:r>
-          </w:p>
-        </w:tc>
-        <w:tc>
-          <w:tcPr>
-            <w:tcW w:type="dxa" w:w="7090"/>
-            <w:shd w:fill="F6F4FE" w:color="auto" w:val="clear"/>
-            <w:tcMar>
-              <w:top w:type="dxa" w:w="60"/>
-              <w:left w:type="dxa" w:w="100"/>
-              <w:bottom w:type="dxa" w:w="60"/>
-              <w:right w:type="dxa" w:w="100"/>
-            </w:tcMar>
-          </w:tcPr>
-          <w:p>
-            <w:pPr>
-              <w:spacing w:after="40" w:before="40"/>
-            </w:pPr>
-            <w:r>
-              <w:t xml:space="preserve">Desativar o paciente no CNN, para que ele não consiga agendar</w:t>
+            <w:tcW w:type="dxa" w:w="2902"/>
+            <w:tcMar>
+              <w:top w:type="dxa" w:w="60"/>
+              <w:left w:type="dxa" w:w="100"/>
+              <w:bottom w:type="dxa" w:w="60"/>
+              <w:right w:type="dxa" w:w="100"/>
+            </w:tcMar>
+          </w:tcPr>
+          <w:p>
+            <w:pPr>
+              <w:spacing w:after="40" w:before="40"/>
+            </w:pPr>
+            <w:r>
+              <w:rPr>
+                <w:b/>
+                <w:bCs/>
+              </w:rPr>
+              <w:t xml:space="preserve">Ciclo</w:t>
+            </w:r>
+          </w:p>
+        </w:tc>
+        <w:tc>
+          <w:tcPr>
+            <w:tcW w:type="dxa" w:w="6736"/>
+            <w:tcMar>
+              <w:top w:type="dxa" w:w="60"/>
+              <w:left w:type="dxa" w:w="100"/>
+              <w:bottom w:type="dxa" w:w="60"/>
+              <w:right w:type="dxa" w:w="100"/>
+            </w:tcMar>
+          </w:tcPr>
+          <w:p>
+            <w:pPr>
+              <w:spacing w:after="40" w:before="40"/>
+            </w:pPr>
+            <w:r>
+              <w:t xml:space="preserve">Período de contagem das faltas. Começa todo 1º de outubro</w:t>
             </w:r>
           </w:p>
         </w:tc>
@@ -3481,43 +4322,45 @@
         </w:trPr>
         <w:tc>
           <w:tcPr>
-            <w:tcW w:type="dxa" w:w="2548"/>
-            <w:tcMar>
-              <w:top w:type="dxa" w:w="60"/>
-              <w:left w:type="dxa" w:w="100"/>
-              <w:bottom w:type="dxa" w:w="60"/>
-              <w:right w:type="dxa" w:w="100"/>
-            </w:tcMar>
-          </w:tcPr>
-          <w:p>
-            <w:pPr>
-              <w:spacing w:after="40" w:before="40"/>
-            </w:pPr>
-            <w:r>
-              <w:rPr>
-                <w:b/>
-                <w:bCs/>
-              </w:rPr>
-              <w:t xml:space="preserve">Liberar</w:t>
-            </w:r>
-          </w:p>
-        </w:tc>
-        <w:tc>
-          <w:tcPr>
-            <w:tcW w:type="dxa" w:w="7090"/>
-            <w:tcMar>
-              <w:top w:type="dxa" w:w="60"/>
-              <w:left w:type="dxa" w:w="100"/>
-              <w:bottom w:type="dxa" w:w="60"/>
-              <w:right w:type="dxa" w:w="100"/>
-            </w:tcMar>
-          </w:tcPr>
-          <w:p>
-            <w:pPr>
-              <w:spacing w:after="40" w:before="40"/>
-            </w:pPr>
-            <w:r>
-              <w:t xml:space="preserve">Reativar o paciente no CNN</w:t>
+            <w:tcW w:type="dxa" w:w="2902"/>
+            <w:shd w:fill="F6F4FE" w:color="auto" w:val="clear"/>
+            <w:tcMar>
+              <w:top w:type="dxa" w:w="60"/>
+              <w:left w:type="dxa" w:w="100"/>
+              <w:bottom w:type="dxa" w:w="60"/>
+              <w:right w:type="dxa" w:w="100"/>
+            </w:tcMar>
+          </w:tcPr>
+          <w:p>
+            <w:pPr>
+              <w:spacing w:after="40" w:before="40"/>
+            </w:pPr>
+            <w:r>
+              <w:rPr>
+                <w:b/>
+                <w:bCs/>
+              </w:rPr>
+              <w:t xml:space="preserve">Falta vigente</w:t>
+            </w:r>
+          </w:p>
+        </w:tc>
+        <w:tc>
+          <w:tcPr>
+            <w:tcW w:type="dxa" w:w="6736"/>
+            <w:shd w:fill="F6F4FE" w:color="auto" w:val="clear"/>
+            <w:tcMar>
+              <w:top w:type="dxa" w:w="60"/>
+              <w:left w:type="dxa" w:w="100"/>
+              <w:bottom w:type="dxa" w:w="60"/>
+              <w:right w:type="dxa" w:w="100"/>
+            </w:tcMar>
+          </w:tcPr>
+          <w:p>
+            <w:pPr>
+              <w:spacing w:after="40" w:before="40"/>
+            </w:pPr>
+            <w:r>
+              <w:t xml:space="preserve">A falta mais recente do paciente no ciclo. É dela que conta o prazo</w:t>
             </w:r>
           </w:p>
         </w:tc>
@@ -3528,45 +4371,43 @@
         </w:trPr>
         <w:tc>
           <w:tcPr>
-            <w:tcW w:type="dxa" w:w="2548"/>
-            <w:shd w:fill="F6F4FE" w:color="auto" w:val="clear"/>
-            <w:tcMar>
-              <w:top w:type="dxa" w:w="60"/>
-              <w:left w:type="dxa" w:w="100"/>
-              <w:bottom w:type="dxa" w:w="60"/>
-              <w:right w:type="dxa" w:w="100"/>
-            </w:tcMar>
-          </w:tcPr>
-          <w:p>
-            <w:pPr>
-              <w:spacing w:after="40" w:before="40"/>
-            </w:pPr>
-            <w:r>
-              <w:rPr>
-                <w:b/>
-                <w:bCs/>
-              </w:rPr>
-              <w:t xml:space="preserve">Liberação antecipada</w:t>
-            </w:r>
-          </w:p>
-        </w:tc>
-        <w:tc>
-          <w:tcPr>
-            <w:tcW w:type="dxa" w:w="7090"/>
-            <w:shd w:fill="F6F4FE" w:color="auto" w:val="clear"/>
-            <w:tcMar>
-              <w:top w:type="dxa" w:w="60"/>
-              <w:left w:type="dxa" w:w="100"/>
-              <w:bottom w:type="dxa" w:w="60"/>
-              <w:right w:type="dxa" w:w="100"/>
-            </w:tcMar>
-          </w:tcPr>
-          <w:p>
-            <w:pPr>
-              <w:spacing w:after="40" w:before="40"/>
-            </w:pPr>
-            <w:r>
-              <w:t xml:space="preserve">Liberar antes do fim do prazo, com motivo</w:t>
+            <w:tcW w:type="dxa" w:w="2902"/>
+            <w:tcMar>
+              <w:top w:type="dxa" w:w="60"/>
+              <w:left w:type="dxa" w:w="100"/>
+              <w:bottom w:type="dxa" w:w="60"/>
+              <w:right w:type="dxa" w:w="100"/>
+            </w:tcMar>
+          </w:tcPr>
+          <w:p>
+            <w:pPr>
+              <w:spacing w:after="40" w:before="40"/>
+            </w:pPr>
+            <w:r>
+              <w:rPr>
+                <w:b/>
+                <w:bCs/>
+              </w:rPr>
+              <w:t xml:space="preserve">Prazo</w:t>
+            </w:r>
+          </w:p>
+        </w:tc>
+        <w:tc>
+          <w:tcPr>
+            <w:tcW w:type="dxa" w:w="6736"/>
+            <w:tcMar>
+              <w:top w:type="dxa" w:w="60"/>
+              <w:left w:type="dxa" w:w="100"/>
+              <w:bottom w:type="dxa" w:w="60"/>
+              <w:right w:type="dxa" w:w="100"/>
+            </w:tcMar>
+          </w:tcPr>
+          <w:p>
+            <w:pPr>
+              <w:spacing w:after="40" w:before="40"/>
+            </w:pPr>
+            <w:r>
+              <w:t xml:space="preserve">Tempo do bloqueio: 60, 90 ou 180 dias, conforme o número da falta</w:t>
             </w:r>
           </w:p>
         </w:tc>
@@ -3577,43 +4418,45 @@
         </w:trPr>
         <w:tc>
           <w:tcPr>
-            <w:tcW w:type="dxa" w:w="2548"/>
-            <w:tcMar>
-              <w:top w:type="dxa" w:w="60"/>
-              <w:left w:type="dxa" w:w="100"/>
-              <w:bottom w:type="dxa" w:w="60"/>
-              <w:right w:type="dxa" w:w="100"/>
-            </w:tcMar>
-          </w:tcPr>
-          <w:p>
-            <w:pPr>
-              <w:spacing w:after="40" w:before="40"/>
-            </w:pPr>
-            <w:r>
-              <w:rPr>
-                <w:b/>
-                <w:bCs/>
-              </w:rPr>
-              <w:t xml:space="preserve">Isentar a falta</w:t>
-            </w:r>
-          </w:p>
-        </w:tc>
-        <w:tc>
-          <w:tcPr>
-            <w:tcW w:type="dxa" w:w="7090"/>
-            <w:tcMar>
-              <w:top w:type="dxa" w:w="60"/>
-              <w:left w:type="dxa" w:w="100"/>
-              <w:bottom w:type="dxa" w:w="60"/>
-              <w:right w:type="dxa" w:w="100"/>
-            </w:tcMar>
-          </w:tcPr>
-          <w:p>
-            <w:pPr>
-              <w:spacing w:after="40" w:before="40"/>
-            </w:pPr>
-            <w:r>
-              <w:t xml:space="preserve">Dizer ao sistema que aquela falta não deve gerar bloqueio</w:t>
+            <w:tcW w:type="dxa" w:w="2902"/>
+            <w:shd w:fill="F6F4FE" w:color="auto" w:val="clear"/>
+            <w:tcMar>
+              <w:top w:type="dxa" w:w="60"/>
+              <w:left w:type="dxa" w:w="100"/>
+              <w:bottom w:type="dxa" w:w="60"/>
+              <w:right w:type="dxa" w:w="100"/>
+            </w:tcMar>
+          </w:tcPr>
+          <w:p>
+            <w:pPr>
+              <w:spacing w:after="40" w:before="40"/>
+            </w:pPr>
+            <w:r>
+              <w:rPr>
+                <w:b/>
+                <w:bCs/>
+              </w:rPr>
+              <w:t xml:space="preserve">Bloquear</w:t>
+            </w:r>
+          </w:p>
+        </w:tc>
+        <w:tc>
+          <w:tcPr>
+            <w:tcW w:type="dxa" w:w="6736"/>
+            <w:shd w:fill="F6F4FE" w:color="auto" w:val="clear"/>
+            <w:tcMar>
+              <w:top w:type="dxa" w:w="60"/>
+              <w:left w:type="dxa" w:w="100"/>
+              <w:bottom w:type="dxa" w:w="60"/>
+              <w:right w:type="dxa" w:w="100"/>
+            </w:tcMar>
+          </w:tcPr>
+          <w:p>
+            <w:pPr>
+              <w:spacing w:after="40" w:before="40"/>
+            </w:pPr>
+            <w:r>
+              <w:t xml:space="preserve">Desativar o paciente no CNN, para que ele não consiga agendar</w:t>
             </w:r>
           </w:p>
         </w:tc>
@@ -3624,45 +4467,43 @@
         </w:trPr>
         <w:tc>
           <w:tcPr>
-            <w:tcW w:type="dxa" w:w="2548"/>
-            <w:shd w:fill="F6F4FE" w:color="auto" w:val="clear"/>
-            <w:tcMar>
-              <w:top w:type="dxa" w:w="60"/>
-              <w:left w:type="dxa" w:w="100"/>
-              <w:bottom w:type="dxa" w:w="60"/>
-              <w:right w:type="dxa" w:w="100"/>
-            </w:tcMar>
-          </w:tcPr>
-          <w:p>
-            <w:pPr>
-              <w:spacing w:after="40" w:before="40"/>
-            </w:pPr>
-            <w:r>
-              <w:rPr>
-                <w:b/>
-                <w:bCs/>
-              </w:rPr>
-              <w:t xml:space="preserve">Painel</w:t>
-            </w:r>
-          </w:p>
-        </w:tc>
-        <w:tc>
-          <w:tcPr>
-            <w:tcW w:type="dxa" w:w="7090"/>
-            <w:shd w:fill="F6F4FE" w:color="auto" w:val="clear"/>
-            <w:tcMar>
-              <w:top w:type="dxa" w:w="60"/>
-              <w:left w:type="dxa" w:w="100"/>
-              <w:bottom w:type="dxa" w:w="60"/>
-              <w:right w:type="dxa" w:w="100"/>
-            </w:tcMar>
-          </w:tcPr>
-          <w:p>
-            <w:pPr>
-              <w:spacing w:after="40" w:before="40"/>
-            </w:pPr>
-            <w:r>
-              <w:t xml:space="preserve">O site onde a equipe acompanha e libera os pacientes</w:t>
+            <w:tcW w:type="dxa" w:w="2902"/>
+            <w:tcMar>
+              <w:top w:type="dxa" w:w="60"/>
+              <w:left w:type="dxa" w:w="100"/>
+              <w:bottom w:type="dxa" w:w="60"/>
+              <w:right w:type="dxa" w:w="100"/>
+            </w:tcMar>
+          </w:tcPr>
+          <w:p>
+            <w:pPr>
+              <w:spacing w:after="40" w:before="40"/>
+            </w:pPr>
+            <w:r>
+              <w:rPr>
+                <w:b/>
+                <w:bCs/>
+              </w:rPr>
+              <w:t xml:space="preserve">Liberar</w:t>
+            </w:r>
+          </w:p>
+        </w:tc>
+        <w:tc>
+          <w:tcPr>
+            <w:tcW w:type="dxa" w:w="6736"/>
+            <w:tcMar>
+              <w:top w:type="dxa" w:w="60"/>
+              <w:left w:type="dxa" w:w="100"/>
+              <w:bottom w:type="dxa" w:w="60"/>
+              <w:right w:type="dxa" w:w="100"/>
+            </w:tcMar>
+          </w:tcPr>
+          <w:p>
+            <w:pPr>
+              <w:spacing w:after="40" w:before="40"/>
+            </w:pPr>
+            <w:r>
+              <w:t xml:space="preserve">Reativar o paciente no CNN</w:t>
             </w:r>
           </w:p>
         </w:tc>
@@ -3673,43 +4514,45 @@
         </w:trPr>
         <w:tc>
           <w:tcPr>
-            <w:tcW w:type="dxa" w:w="2548"/>
-            <w:tcMar>
-              <w:top w:type="dxa" w:w="60"/>
-              <w:left w:type="dxa" w:w="100"/>
-              <w:bottom w:type="dxa" w:w="60"/>
-              <w:right w:type="dxa" w:w="100"/>
-            </w:tcMar>
-          </w:tcPr>
-          <w:p>
-            <w:pPr>
-              <w:spacing w:after="40" w:before="40"/>
-            </w:pPr>
-            <w:r>
-              <w:rPr>
-                <w:b/>
-                <w:bCs/>
-              </w:rPr>
-              <w:t xml:space="preserve">Automação / n8n</w:t>
-            </w:r>
-          </w:p>
-        </w:tc>
-        <w:tc>
-          <w:tcPr>
-            <w:tcW w:type="dxa" w:w="7090"/>
-            <w:tcMar>
-              <w:top w:type="dxa" w:w="60"/>
-              <w:left w:type="dxa" w:w="100"/>
-              <w:bottom w:type="dxa" w:w="60"/>
-              <w:right w:type="dxa" w:w="100"/>
-            </w:tcMar>
-          </w:tcPr>
-          <w:p>
-            <w:pPr>
-              <w:spacing w:after="40" w:before="40"/>
-            </w:pPr>
-            <w:r>
-              <w:t xml:space="preserve">A ferramenta que roda as tarefas automáticas (a busca das 01:00 e as ações do painel)</w:t>
+            <w:tcW w:type="dxa" w:w="2902"/>
+            <w:shd w:fill="F6F4FE" w:color="auto" w:val="clear"/>
+            <w:tcMar>
+              <w:top w:type="dxa" w:w="60"/>
+              <w:left w:type="dxa" w:w="100"/>
+              <w:bottom w:type="dxa" w:w="60"/>
+              <w:right w:type="dxa" w:w="100"/>
+            </w:tcMar>
+          </w:tcPr>
+          <w:p>
+            <w:pPr>
+              <w:spacing w:after="40" w:before="40"/>
+            </w:pPr>
+            <w:r>
+              <w:rPr>
+                <w:b/>
+                <w:bCs/>
+              </w:rPr>
+              <w:t xml:space="preserve">Solicitação de desbloqueio</w:t>
+            </w:r>
+          </w:p>
+        </w:tc>
+        <w:tc>
+          <w:tcPr>
+            <w:tcW w:type="dxa" w:w="6736"/>
+            <w:shd w:fill="F6F4FE" w:color="auto" w:val="clear"/>
+            <w:tcMar>
+              <w:top w:type="dxa" w:w="60"/>
+              <w:left w:type="dxa" w:w="100"/>
+              <w:bottom w:type="dxa" w:w="60"/>
+              <w:right w:type="dxa" w:w="100"/>
+            </w:tcMar>
+          </w:tcPr>
+          <w:p>
+            <w:pPr>
+              <w:spacing w:after="40" w:before="40"/>
+            </w:pPr>
+            <w:r>
+              <w:t xml:space="preserve">Pedido para liberar um paciente antes do fim do prazo, com o motivo. O administrador aprova ou recusa</w:t>
             </w:r>
           </w:p>
         </w:tc>
@@ -3720,7 +4563,54 @@
         </w:trPr>
         <w:tc>
           <w:tcPr>
-            <w:tcW w:type="dxa" w:w="2548"/>
+            <w:tcW w:type="dxa" w:w="2902"/>
+            <w:tcMar>
+              <w:top w:type="dxa" w:w="60"/>
+              <w:left w:type="dxa" w:w="100"/>
+              <w:bottom w:type="dxa" w:w="60"/>
+              <w:right w:type="dxa" w:w="100"/>
+            </w:tcMar>
+          </w:tcPr>
+          <w:p>
+            <w:pPr>
+              <w:spacing w:after="40" w:before="40"/>
+            </w:pPr>
+            <w:r>
+              <w:rPr>
+                <w:b/>
+                <w:bCs/>
+              </w:rPr>
+              <w:t xml:space="preserve">Liberação antecipada</w:t>
+            </w:r>
+          </w:p>
+        </w:tc>
+        <w:tc>
+          <w:tcPr>
+            <w:tcW w:type="dxa" w:w="6736"/>
+            <w:tcMar>
+              <w:top w:type="dxa" w:w="60"/>
+              <w:left w:type="dxa" w:w="100"/>
+              <w:bottom w:type="dxa" w:w="60"/>
+              <w:right w:type="dxa" w:w="100"/>
+            </w:tcMar>
+          </w:tcPr>
+          <w:p>
+            <w:pPr>
+              <w:spacing w:after="40" w:before="40"/>
+            </w:pPr>
+            <w:r>
+              <w:t xml:space="preserve">Liberar antes do fim do prazo, por uma solicitação aprovada</w:t>
+            </w:r>
+          </w:p>
+        </w:tc>
+      </w:tr>
+      <w:tr>
+        <w:trPr>
+          <w:cantSplit/>
+        </w:trPr>
+        <w:tc>
+          <w:tcPr>
+            <w:tcW w:type="dxa" w:w="2902"/>
             <w:shd w:fill="F6F4FE" w:color="auto" w:val="clear"/>
             <w:tcMar>
               <w:top w:type="dxa" w:w="60"/>
@@ -3738,14 +4628,157 @@
                 <w:b/>
                 <w:bCs/>
               </w:rPr>
+              <w:t xml:space="preserve">Isentar a falta</w:t>
+            </w:r>
+          </w:p>
+        </w:tc>
+        <w:tc>
+          <w:tcPr>
+            <w:tcW w:type="dxa" w:w="6736"/>
+            <w:shd w:fill="F6F4FE" w:color="auto" w:val="clear"/>
+            <w:tcMar>
+              <w:top w:type="dxa" w:w="60"/>
+              <w:left w:type="dxa" w:w="100"/>
+              <w:bottom w:type="dxa" w:w="60"/>
+              <w:right w:type="dxa" w:w="100"/>
+            </w:tcMar>
+          </w:tcPr>
+          <w:p>
+            <w:pPr>
+              <w:spacing w:after="40" w:before="40"/>
+            </w:pPr>
+            <w:r>
+              <w:t xml:space="preserve">Fazer a falta não gerar bloqueio (por uma solicitação aprovada antes do bloqueio)</w:t>
+            </w:r>
+          </w:p>
+        </w:tc>
+      </w:tr>
+      <w:tr>
+        <w:trPr>
+          <w:cantSplit/>
+        </w:trPr>
+        <w:tc>
+          <w:tcPr>
+            <w:tcW w:type="dxa" w:w="2902"/>
+            <w:tcMar>
+              <w:top w:type="dxa" w:w="60"/>
+              <w:left w:type="dxa" w:w="100"/>
+              <w:bottom w:type="dxa" w:w="60"/>
+              <w:right w:type="dxa" w:w="100"/>
+            </w:tcMar>
+          </w:tcPr>
+          <w:p>
+            <w:pPr>
+              <w:spacing w:after="40" w:before="40"/>
+            </w:pPr>
+            <w:r>
+              <w:rPr>
+                <w:b/>
+                <w:bCs/>
+              </w:rPr>
+              <w:t xml:space="preserve">Painel</w:t>
+            </w:r>
+          </w:p>
+        </w:tc>
+        <w:tc>
+          <w:tcPr>
+            <w:tcW w:type="dxa" w:w="6736"/>
+            <w:tcMar>
+              <w:top w:type="dxa" w:w="60"/>
+              <w:left w:type="dxa" w:w="100"/>
+              <w:bottom w:type="dxa" w:w="60"/>
+              <w:right w:type="dxa" w:w="100"/>
+            </w:tcMar>
+          </w:tcPr>
+          <w:p>
+            <w:pPr>
+              <w:spacing w:after="40" w:before="40"/>
+            </w:pPr>
+            <w:r>
+              <w:t xml:space="preserve">O site onde a equipe acompanha os pacientes e os pedidos</w:t>
+            </w:r>
+          </w:p>
+        </w:tc>
+      </w:tr>
+      <w:tr>
+        <w:trPr>
+          <w:cantSplit/>
+        </w:trPr>
+        <w:tc>
+          <w:tcPr>
+            <w:tcW w:type="dxa" w:w="2902"/>
+            <w:shd w:fill="F6F4FE" w:color="auto" w:val="clear"/>
+            <w:tcMar>
+              <w:top w:type="dxa" w:w="60"/>
+              <w:left w:type="dxa" w:w="100"/>
+              <w:bottom w:type="dxa" w:w="60"/>
+              <w:right w:type="dxa" w:w="100"/>
+            </w:tcMar>
+          </w:tcPr>
+          <w:p>
+            <w:pPr>
+              <w:spacing w:after="40" w:before="40"/>
+            </w:pPr>
+            <w:r>
+              <w:rPr>
+                <w:b/>
+                <w:bCs/>
+              </w:rPr>
+              <w:t xml:space="preserve">Automação / n8n</w:t>
+            </w:r>
+          </w:p>
+        </w:tc>
+        <w:tc>
+          <w:tcPr>
+            <w:tcW w:type="dxa" w:w="6736"/>
+            <w:shd w:fill="F6F4FE" w:color="auto" w:val="clear"/>
+            <w:tcMar>
+              <w:top w:type="dxa" w:w="60"/>
+              <w:left w:type="dxa" w:w="100"/>
+              <w:bottom w:type="dxa" w:w="60"/>
+              <w:right w:type="dxa" w:w="100"/>
+            </w:tcMar>
+          </w:tcPr>
+          <w:p>
+            <w:pPr>
+              <w:spacing w:after="40" w:before="40"/>
+            </w:pPr>
+            <w:r>
+              <w:t xml:space="preserve">A ferramenta que roda as tarefas automáticas (o bloqueio das 01:00, a liberação das 02:00 e as ações do painel)</w:t>
+            </w:r>
+          </w:p>
+        </w:tc>
+      </w:tr>
+      <w:tr>
+        <w:trPr>
+          <w:cantSplit/>
+        </w:trPr>
+        <w:tc>
+          <w:tcPr>
+            <w:tcW w:type="dxa" w:w="2902"/>
+            <w:tcMar>
+              <w:top w:type="dxa" w:w="60"/>
+              <w:left w:type="dxa" w:w="100"/>
+              <w:bottom w:type="dxa" w:w="60"/>
+              <w:right w:type="dxa" w:w="100"/>
+            </w:tcMar>
+          </w:tcPr>
+          <w:p>
+            <w:pPr>
+              <w:spacing w:after="40" w:before="40"/>
+            </w:pPr>
+            <w:r>
+              <w:rPr>
+                <w:b/>
+                <w:bCs/>
+              </w:rPr>
               <w:t xml:space="preserve">Auditoria / Histórico</w:t>
             </w:r>
           </w:p>
         </w:tc>
         <w:tc>
           <w:tcPr>
-            <w:tcW w:type="dxa" w:w="7090"/>
-            <w:shd w:fill="F6F4FE" w:color="auto" w:val="clear"/>
+            <w:tcW w:type="dxa" w:w="6736"/>
             <w:tcMar>
               <w:top w:type="dxa" w:w="60"/>
               <w:left w:type="dxa" w:w="100"/>
@@ -4082,6 +5115,12 @@
     </w:lvlOverride>
   </w:num>
   <w:num w:numId="3">
+    <w:abstractNumId w:val="3"/>
+    <w:lvlOverride w:ilvl="0">
+      <w:startOverride w:val="1"/>
+    </w:lvlOverride>
+  </w:num>
+  <w:num w:numId="4">
     <w:abstractNumId w:val="2"/>
     <w:lvlOverride w:ilvl="0">
       <w:startOverride w:val="1"/>

</xml_diff>

<commit_message>
Dashboard com Chart.js, carregamento nos botões e botão Entrar
- Tela /dashboard: hoje, faltas, bloqueios e liberações e solicitações,
  com linha, área, rosca, radar, empilhadas, barras e mapa de calor
- Ação dashboard na Leitura e GET /api/dashboard
- Chart.js 4.4.9 servido pelo próprio site (js/vendor, versão fixa)
- Carregamento no botão em todas as ações que esperam o n8n
- Botão Entrar com brilho, seta e pontinhos; texto não some no hover
- Docs e Word atualizados

Co-Authored-By: Claude Opus 5.5 <noreply@anthropic.com>
</commit_message>
<xml_diff>
--- a/docs/word/01 - Visão geral (não técnica).docx
+++ b/docs/word/01 - Visão geral (não técnica).docx
@@ -1786,7 +1786,7 @@
                 <w:b/>
                 <w:bCs/>
               </w:rPr>
-              <w:t xml:space="preserve">Relatórios de faltas</w:t>
+              <w:t xml:space="preserve">Dashboard</w:t>
             </w:r>
           </w:p>
         </w:tc>
@@ -1805,7 +1805,7 @@
               <w:spacing w:after="40" w:before="40"/>
             </w:pPr>
             <w:r>
-              <w:t xml:space="preserve">Números e gráficos: faltas por mês, por dia da semana, por profissional, por tipo de consulta, por procedimento e por período do dia. Dá para exportar em planilha</w:t>
+              <w:t xml:space="preserve">Os números do sistema em gráficos: a situação de hoje, faltas (por dia, horário, profissional, local...), bloqueios e liberações, e as solicitações (quantas foram aprovadas, quanto tempo o administrador levou para responder)</w:t>
             </w:r>
           </w:p>
         </w:tc>
@@ -1834,7 +1834,7 @@
                 <w:b/>
                 <w:bCs/>
               </w:rPr>
-              <w:t xml:space="preserve">Histórico de ações</w:t>
+              <w:t xml:space="preserve">Relatórios de faltas</w:t>
             </w:r>
           </w:p>
         </w:tc>
@@ -1854,7 +1854,7 @@
               <w:spacing w:after="40" w:before="40"/>
             </w:pPr>
             <w:r>
-              <w:t xml:space="preserve">Tudo o que foi feito: cada bloqueio e cada liberação, quem fez, quando e por quê</w:t>
+              <w:t xml:space="preserve">Números e gráficos: faltas por mês, por dia da semana, por profissional, por tipo de consulta, por procedimento e por período do dia. Dá para exportar em planilha</w:t>
             </w:r>
           </w:p>
         </w:tc>
@@ -1882,7 +1882,7 @@
                 <w:b/>
                 <w:bCs/>
               </w:rPr>
-              <w:t xml:space="preserve">Configuração</w:t>
+              <w:t xml:space="preserve">Histórico de ações</w:t>
             </w:r>
           </w:p>
         </w:tc>
@@ -1901,7 +1901,7 @@
               <w:spacing w:after="40" w:before="40"/>
             </w:pPr>
             <w:r>
-              <w:t xml:space="preserve">Mostra as regras em uso (prazos, início do ciclo, horários da automação). Só leitura</w:t>
+              <w:t xml:space="preserve">Tudo o que foi feito: cada bloqueio e cada liberação, quem fez, quando e por quê</w:t>
             </w:r>
           </w:p>
         </w:tc>
@@ -1930,7 +1930,7 @@
                 <w:b/>
                 <w:bCs/>
               </w:rPr>
-              <w:t xml:space="preserve">Usuários</w:t>
+              <w:t xml:space="preserve">Configuração</w:t>
             </w:r>
           </w:p>
         </w:tc>
@@ -1938,6 +1938,53 @@
           <w:tcPr>
             <w:tcW w:type="dxa" w:w="7167"/>
             <w:shd w:fill="F6F4FE" w:color="auto" w:val="clear"/>
+            <w:tcMar>
+              <w:top w:type="dxa" w:w="60"/>
+              <w:left w:type="dxa" w:w="100"/>
+              <w:bottom w:type="dxa" w:w="60"/>
+              <w:right w:type="dxa" w:w="100"/>
+            </w:tcMar>
+          </w:tcPr>
+          <w:p>
+            <w:pPr>
+              <w:spacing w:after="40" w:before="40"/>
+            </w:pPr>
+            <w:r>
+              <w:t xml:space="preserve">Mostra as regras em uso (prazos, início do ciclo, horários da automação). Só leitura</w:t>
+            </w:r>
+          </w:p>
+        </w:tc>
+      </w:tr>
+      <w:tr>
+        <w:trPr>
+          <w:cantSplit/>
+        </w:trPr>
+        <w:tc>
+          <w:tcPr>
+            <w:tcW w:type="dxa" w:w="2471"/>
+            <w:tcMar>
+              <w:top w:type="dxa" w:w="60"/>
+              <w:left w:type="dxa" w:w="100"/>
+              <w:bottom w:type="dxa" w:w="60"/>
+              <w:right w:type="dxa" w:w="100"/>
+            </w:tcMar>
+          </w:tcPr>
+          <w:p>
+            <w:pPr>
+              <w:spacing w:after="40" w:before="40"/>
+            </w:pPr>
+            <w:r>
+              <w:rPr>
+                <w:b/>
+                <w:bCs/>
+              </w:rPr>
+              <w:t xml:space="preserve">Usuários</w:t>
+            </w:r>
+          </w:p>
+        </w:tc>
+        <w:tc>
+          <w:tcPr>
+            <w:tcW w:type="dxa" w:w="7167"/>
             <w:tcMar>
               <w:top w:type="dxa" w:w="60"/>
               <w:left w:type="dxa" w:w="100"/>

</xml_diff>

<commit_message>
Multiunidade (Salvador e Pouso Alegre) e correção dos fluxos colados
- Unidade escolhida ao entrar, X-Unidade conferido na API e @unidade em todo SQL
- CID do CNN em variável de ambiente do n8n (CNN_CID_<codigo>), fora dos fluxos
- Bloqueio das 01:00 em subfluxo por unidade; liberação das 02:00 com todas as unidades
- Usuários com unidades (tela Usuários), sql/criar_tabelas_unidades.sql
- Corrige laços sem volta (bloqueio e liberação) e datas fixas na agenda
- npm run check acusa laço sem volta, nó sem saída, data fixa, query em Expression e CID no nó

Co-Authored-By: Claude Opus 5.5 <noreply@anthropic.com>
</commit_message>
<xml_diff>
--- a/docs/word/01 - Visão geral (não técnica).docx
+++ b/docs/word/01 - Visão geral (não técnica).docx
@@ -92,7 +92,7 @@
           <w:sz w:val="22"/>
           <w:szCs w:val="22"/>
         </w:rPr>
-        <w:t xml:space="preserve">Atualizado em 23 de outubro de 2026</w:t>
+        <w:t xml:space="preserve">Atualizado em 28 de outubro de 2026</w:t>
       </w:r>
     </w:p>
     <w:p>
@@ -384,7 +384,7 @@
           </w:pPr>
           <w:hyperlink w:history="1" w:anchor="_Toc11">
             <w:r>
-              <w:t xml:space="preserve">Quem pode fazer o quê no painel</w:t>
+              <w:t xml:space="preserve">Unidades</w:t>
             </w:r>
             <w:r>
               <w:tab/>
@@ -407,7 +407,7 @@
           </w:pPr>
           <w:hyperlink w:history="1" w:anchor="_Toc12">
             <w:r>
-              <w:t xml:space="preserve">Garantias do sistema</w:t>
+              <w:t xml:space="preserve">Quem pode fazer o quê no painel</w:t>
             </w:r>
             <w:r>
               <w:tab/>
@@ -430,7 +430,7 @@
           </w:pPr>
           <w:hyperlink w:history="1" w:anchor="_Toc13">
             <w:r>
-              <w:t xml:space="preserve">Perguntas frequentes</w:t>
+              <w:t xml:space="preserve">Garantias do sistema</w:t>
             </w:r>
             <w:r>
               <w:tab/>
@@ -453,7 +453,7 @@
           </w:pPr>
           <w:hyperlink w:history="1" w:anchor="_Toc14">
             <w:r>
-              <w:t xml:space="preserve">Glossário</w:t>
+              <w:t xml:space="preserve">Perguntas frequentes</w:t>
             </w:r>
             <w:r>
               <w:tab/>
@@ -461,6 +461,29 @@
             <w:r>
               <w:fldChar w:fldCharType="begin" w:dirty="true"/>
               <w:instrText xml:space="preserve">PAGEREF _Toc14 \h</w:instrText>
+              <w:fldChar w:fldCharType="separate"/>
+              <w:fldChar w:fldCharType="end"/>
+            </w:r>
+          </w:hyperlink>
+        </w:p>
+        <w:p>
+          <w:pPr>
+            <w:pStyle w:val="TOC2"/>
+            <w:tabs>
+              <w:tab w:val="right" w:pos="9638" w:leader="dot"/>
+            </w:tabs>
+            <w:ind w:left="220"/>
+          </w:pPr>
+          <w:hyperlink w:history="1" w:anchor="_Toc15">
+            <w:r>
+              <w:t xml:space="preserve">Glossário</w:t>
+            </w:r>
+            <w:r>
+              <w:tab/>
+            </w:r>
+            <w:r>
+              <w:fldChar w:fldCharType="begin" w:dirty="true"/>
+              <w:instrText xml:space="preserve">PAGEREF _Toc15 \h</w:instrText>
               <w:fldChar w:fldCharType="separate"/>
               <w:fldChar w:fldCharType="end"/>
             </w:r>
@@ -3144,9 +3167,169 @@
       </w:pPr>
       <w:bookmarkStart w:name="_Toc11" w:id="11"/>
       <w:r>
+        <w:t xml:space="preserve">Unidades</w:t>
+      </w:r>
+      <w:bookmarkEnd w:id="11"/>
+    </w:p>
+    <w:p>
+      <w:pPr>
+        <w:spacing w:after="120"/>
+      </w:pPr>
+      <w:r>
+        <w:t xml:space="preserve">O sistema atende duas clínicas: </w:t>
+      </w:r>
+      <w:r>
+        <w:rPr>
+          <w:b/>
+          <w:bCs/>
+        </w:rPr>
+        <w:t xml:space="preserve">Clínica Escola Zarns Salvador</w:t>
+      </w:r>
+      <w:r>
+        <w:t xml:space="preserve"> e </w:t>
+      </w:r>
+      <w:r>
+        <w:rPr>
+          <w:b/>
+          <w:bCs/>
+        </w:rPr>
+        <w:t xml:space="preserve">Clínica Escola Zarns Pouso Alegre</w:t>
+      </w:r>
+      <w:r>
+        <w:t xml:space="preserve">. Cada uma tem os seus pacientes, faltas, bloqueios e pedidos, e </w:t>
+      </w:r>
+      <w:r>
+        <w:rPr>
+          <w:b/>
+          <w:bCs/>
+        </w:rPr>
+        <w:t xml:space="preserve">uma não vê a outra</w:t>
+      </w:r>
+      <w:r>
+        <w:t xml:space="preserve">. As regras (prazos e horários) são as mesmas nas duas.</w:t>
+      </w:r>
+    </w:p>
+    <w:p>
+      <w:pPr>
+        <w:pStyle w:val="ListParagraph"/>
+        <w:numPr>
+          <w:ilvl w:val="0"/>
+          <w:numId w:val="4"/>
+        </w:numPr>
+        <w:spacing w:after="60"/>
+      </w:pPr>
+      <w:r>
+        <w:rPr>
+          <w:b/>
+          <w:bCs/>
+        </w:rPr>
+        <w:t xml:space="preserve">Ao entrar,</w:t>
+      </w:r>
+      <w:r>
+        <w:t xml:space="preserve"> quem trabalha nas duas escolhe em qual vai trabalhar agora. Quem trabalha numa só entra direto.</w:t>
+      </w:r>
+    </w:p>
+    <w:p>
+      <w:pPr>
+        <w:pStyle w:val="ListParagraph"/>
+        <w:numPr>
+          <w:ilvl w:val="0"/>
+          <w:numId w:val="4"/>
+        </w:numPr>
+        <w:spacing w:after="60"/>
+      </w:pPr>
+      <w:r>
+        <w:rPr>
+          <w:b/>
+          <w:bCs/>
+        </w:rPr>
+        <w:t xml:space="preserve">A unidade atual</w:t>
+      </w:r>
+      <w:r>
+        <w:t xml:space="preserve"> fica no topo da tela e no menu. Dá para </w:t>
+      </w:r>
+      <w:r>
+        <w:rPr>
+          <w:b/>
+          <w:bCs/>
+        </w:rPr>
+        <w:t xml:space="preserve">trocar</w:t>
+      </w:r>
+      <w:r>
+        <w:t xml:space="preserve"> a qualquer momento, sem sair.</w:t>
+      </w:r>
+    </w:p>
+    <w:p>
+      <w:pPr>
+        <w:pStyle w:val="ListParagraph"/>
+        <w:numPr>
+          <w:ilvl w:val="0"/>
+          <w:numId w:val="4"/>
+        </w:numPr>
+        <w:spacing w:after="60"/>
+      </w:pPr>
+      <w:r>
+        <w:rPr>
+          <w:b/>
+          <w:bCs/>
+        </w:rPr>
+        <w:t xml:space="preserve">O administrador</w:t>
+      </w:r>
+      <w:r>
+        <w:t xml:space="preserve"> acessa as duas e troca entre elas. Os outros acessam as unidades que o administrador marcou no cadastro.</w:t>
+      </w:r>
+    </w:p>
+    <w:p>
+      <w:pPr>
+        <w:pStyle w:val="ListParagraph"/>
+        <w:numPr>
+          <w:ilvl w:val="0"/>
+          <w:numId w:val="4"/>
+        </w:numPr>
+        <w:spacing w:after="60"/>
+      </w:pPr>
+      <w:r>
+        <w:rPr>
+          <w:b/>
+          <w:bCs/>
+        </w:rPr>
+        <w:t xml:space="preserve">Toda madrugada,</w:t>
+      </w:r>
+      <w:r>
+        <w:t xml:space="preserve"> o bloqueio e a liberação rodam para as duas unidades, uma de cada vez. Se der problema numa, a outra segue normalmente.</w:t>
+      </w:r>
+    </w:p>
+    <w:p>
+      <w:pPr>
+        <w:spacing w:after="60"/>
+      </w:pPr>
+    </w:p>
+    <w:p>
+      <w:pPr>
+        <w:spacing w:after="120"/>
+      </w:pPr>
+      <w:r>
+        <w:t xml:space="preserve">Detalhes em </w:t>
+      </w:r>
+      <w:r>
+        <w:rPr>
+          <w:color w:val="1C1FC8"/>
+        </w:rPr>
+        <w:t xml:space="preserve">unidades.md</w:t>
+      </w:r>
+      <w:r>
+        <w:t xml:space="preserve">.</w:t>
+      </w:r>
+    </w:p>
+    <w:p>
+      <w:pPr>
+        <w:pStyle w:val="Heading2"/>
+      </w:pPr>
+      <w:bookmarkStart w:name="_Toc12" w:id="12"/>
+      <w:r>
         <w:t xml:space="preserve">Quem pode fazer o quê no painel</w:t>
       </w:r>
-      <w:bookmarkEnd w:id="11"/>
+      <w:bookmarkEnd w:id="12"/>
     </w:p>
     <w:p>
       <w:pPr>
@@ -3841,11 +4024,11 @@
       <w:pPr>
         <w:pStyle w:val="Heading2"/>
       </w:pPr>
-      <w:bookmarkStart w:name="_Toc12" w:id="12"/>
+      <w:bookmarkStart w:name="_Toc13" w:id="13"/>
       <w:r>
         <w:t xml:space="preserve">Garantias do sistema</w:t>
       </w:r>
-      <w:bookmarkEnd w:id="12"/>
+      <w:bookmarkEnd w:id="13"/>
     </w:p>
     <w:p>
       <w:pPr>
@@ -3881,10 +4064,10 @@
           <w:b/>
           <w:bCs/>
         </w:rPr>
-        <w:t xml:space="preserve">Ninguém é liberado antes do prazo sem aprovação:</w:t>
-      </w:r>
-      <w:r>
-        <w:t xml:space="preserve"> liberar antes do fim do prazo exige um pedido aprovado pelo administrador. Depois do prazo, a automação libera sozinha.</w:t>
+        <w:t xml:space="preserve">Cada unidade vê só o que é dela:</w:t>
+      </w:r>
+      <w:r>
+        <w:t xml:space="preserve"> a unidade é conferida no servidor em todo pedido. Quem é de uma unidade não vê nem altera paciente da outra.</w:t>
       </w:r>
     </w:p>
     <w:p>
@@ -3901,10 +4084,10 @@
           <w:b/>
           <w:bCs/>
         </w:rPr>
-        <w:t xml:space="preserve">Uma liberação feita no painel é respeitada:</w:t>
-      </w:r>
-      <w:r>
-        <w:t xml:space="preserve"> a automação das 01:00 não bloqueia de novo pela mesma falta. Só uma falta nova bloqueia outra vez.</w:t>
+        <w:t xml:space="preserve">Ninguém é liberado antes do prazo sem aprovação:</w:t>
+      </w:r>
+      <w:r>
+        <w:t xml:space="preserve"> liberar antes do fim do prazo exige um pedido aprovado pelo administrador. Depois do prazo, a automação libera sozinha.</w:t>
       </w:r>
     </w:p>
     <w:p>
@@ -3921,10 +4104,10 @@
           <w:b/>
           <w:bCs/>
         </w:rPr>
-        <w:t xml:space="preserve">A automação só reativa quem ela mesma bloqueou:</w:t>
-      </w:r>
-      <w:r>
-        <w:t xml:space="preserve"> um paciente inativo no CNN por outro motivo nunca é reativado.</w:t>
+        <w:t xml:space="preserve">Uma liberação feita no painel é respeitada:</w:t>
+      </w:r>
+      <w:r>
+        <w:t xml:space="preserve"> a automação das 01:00 não bloqueia de novo pela mesma falta. Só uma falta nova bloqueia outra vez.</w:t>
       </w:r>
     </w:p>
     <w:p>
@@ -3941,10 +4124,10 @@
           <w:b/>
           <w:bCs/>
         </w:rPr>
-        <w:t xml:space="preserve">Proteção de dados (LGPD):</w:t>
-      </w:r>
-      <w:r>
-        <w:t xml:space="preserve"> o painel mostra só o necessário. O CPF aparece mascarado, e telefone e e-mail não aparecem. Os dados ficam guardados só na aba do navegador e somem ao fechá-la.</w:t>
+        <w:t xml:space="preserve">A automação só reativa quem ela mesma bloqueou:</w:t>
+      </w:r>
+      <w:r>
+        <w:t xml:space="preserve"> um paciente inativo no CNN por outro motivo nunca é reativado.</w:t>
       </w:r>
     </w:p>
     <w:p>
@@ -3961,6 +4144,26 @@
           <w:b/>
           <w:bCs/>
         </w:rPr>
+        <w:t xml:space="preserve">Proteção de dados (LGPD):</w:t>
+      </w:r>
+      <w:r>
+        <w:t xml:space="preserve"> o painel mostra só o necessário. O CPF aparece mascarado, e telefone e e-mail não aparecem. Os dados ficam guardados só na aba do navegador e somem ao fechá-la.</w:t>
+      </w:r>
+    </w:p>
+    <w:p>
+      <w:pPr>
+        <w:pStyle w:val="ListParagraph"/>
+        <w:numPr>
+          <w:ilvl w:val="0"/>
+          <w:numId w:val="4"/>
+        </w:numPr>
+        <w:spacing w:after="60"/>
+      </w:pPr>
+      <w:r>
+        <w:rPr>
+          <w:b/>
+          <w:bCs/>
+        </w:rPr>
         <w:t xml:space="preserve">Rapidez:</w:t>
       </w:r>
       <w:r>
@@ -3976,11 +4179,11 @@
       <w:pPr>
         <w:pStyle w:val="Heading2"/>
       </w:pPr>
-      <w:bookmarkStart w:name="_Toc13" w:id="13"/>
+      <w:bookmarkStart w:name="_Toc14" w:id="14"/>
       <w:r>
         <w:t xml:space="preserve">Perguntas frequentes</w:t>
       </w:r>
-      <w:bookmarkEnd w:id="13"/>
+      <w:bookmarkEnd w:id="14"/>
     </w:p>
     <w:p>
       <w:pPr>
@@ -4132,11 +4335,11 @@
       <w:pPr>
         <w:pStyle w:val="Heading2"/>
       </w:pPr>
-      <w:bookmarkStart w:name="_Toc14" w:id="14"/>
+      <w:bookmarkStart w:name="_Toc15" w:id="15"/>
       <w:r>
         <w:t xml:space="preserve">Glossário</w:t>
       </w:r>
-      <w:bookmarkEnd w:id="14"/>
+      <w:bookmarkEnd w:id="15"/>
     </w:p>
     <w:tbl>
       <w:tblPr>

</xml_diff>